<commit_message>
Report: add KiCad schematic, layout, ERC and DRC screenshots; restore 3D printing image boxes
Co-Authored-By: Claude Opus 5.5 <noreply@anthropic.com>
Claude-Session: https://claude.ai/code/session_015VBADvj4gQyLxERYHXi5YL
</commit_message>
<xml_diff>
--- a/hexapod-progress-report/Hexapod_Progress_Report.docx
+++ b/hexapod-progress-report/Hexapod_Progress_Report.docx
@@ -2220,7 +2220,7 @@
           <w:sz w:val="22"/>
         </w:rPr>
         <w:tab/>
-        <w:t>21</w:t>
+        <w:t>22</w:t>
       </w:r>
     </w:p>
     <w:p>
@@ -2242,7 +2242,7 @@
           <w:sz w:val="22"/>
         </w:rPr>
         <w:tab/>
-        <w:t>21</w:t>
+        <w:t>22</w:t>
       </w:r>
     </w:p>
     <w:p>
@@ -2264,7 +2264,7 @@
           <w:sz w:val="22"/>
         </w:rPr>
         <w:tab/>
-        <w:t>21</w:t>
+        <w:t>22</w:t>
       </w:r>
     </w:p>
     <w:p>
@@ -2286,7 +2286,7 @@
           <w:sz w:val="22"/>
         </w:rPr>
         <w:tab/>
-        <w:t>22</w:t>
+        <w:t>23</w:t>
       </w:r>
     </w:p>
     <w:p>
@@ -2308,7 +2308,7 @@
           <w:sz w:val="22"/>
         </w:rPr>
         <w:tab/>
-        <w:t>22</w:t>
+        <w:t>23</w:t>
       </w:r>
     </w:p>
     <w:p>
@@ -2330,7 +2330,7 @@
           <w:sz w:val="22"/>
         </w:rPr>
         <w:tab/>
-        <w:t>23</w:t>
+        <w:t>24</w:t>
       </w:r>
     </w:p>
     <w:p>
@@ -2352,7 +2352,7 @@
           <w:sz w:val="22"/>
         </w:rPr>
         <w:tab/>
-        <w:t>23</w:t>
+        <w:t>24</w:t>
       </w:r>
     </w:p>
     <w:p>
@@ -2374,7 +2374,7 @@
           <w:sz w:val="22"/>
         </w:rPr>
         <w:tab/>
-        <w:t>24</w:t>
+        <w:t>25</w:t>
       </w:r>
     </w:p>
     <w:p>
@@ -2396,7 +2396,73 @@
           <w:sz w:val="22"/>
         </w:rPr>
         <w:tab/>
-        <w:t>26</w:t>
+        <w:t>27</w:t>
+      </w:r>
+    </w:p>
+    <w:p>
+      <w:pPr>
+        <w:tabs>
+          <w:tab w:pos="9288" w:val="right" w:leader="dot"/>
+        </w:tabs>
+        <w:spacing w:after="20" w:line="276" w:lineRule="auto"/>
+        <w:ind w:left="864"/>
+      </w:pPr>
+      <w:r>
+        <w:rPr>
+          <w:sz w:val="22"/>
+        </w:rPr>
+        <w:t>6.6.1  Electrical Rules Check (ERC)</w:t>
+      </w:r>
+      <w:r>
+        <w:rPr>
+          <w:sz w:val="22"/>
+        </w:rPr>
+        <w:tab/>
+        <w:t>28</w:t>
+      </w:r>
+    </w:p>
+    <w:p>
+      <w:pPr>
+        <w:tabs>
+          <w:tab w:pos="9288" w:val="right" w:leader="dot"/>
+        </w:tabs>
+        <w:spacing w:after="20" w:line="276" w:lineRule="auto"/>
+        <w:ind w:left="864"/>
+      </w:pPr>
+      <w:r>
+        <w:rPr>
+          <w:sz w:val="22"/>
+        </w:rPr>
+        <w:t>6.6.2  Design Rules Check (DRC)</w:t>
+      </w:r>
+      <w:r>
+        <w:rPr>
+          <w:sz w:val="22"/>
+        </w:rPr>
+        <w:tab/>
+        <w:t>29</w:t>
+      </w:r>
+    </w:p>
+    <w:p>
+      <w:pPr>
+        <w:tabs>
+          <w:tab w:pos="9288" w:val="right" w:leader="dot"/>
+        </w:tabs>
+        <w:spacing w:after="20" w:line="276" w:lineRule="auto"/>
+        <w:ind w:left="864"/>
+      </w:pPr>
+      <w:r>
+        <w:rPr>
+          <w:sz w:val="22"/>
+        </w:rPr>
+        <w:t>6.6.3  Other Checks</w:t>
+      </w:r>
+      <w:r>
+        <w:rPr>
+          <w:sz w:val="22"/>
+        </w:rPr>
+        <w:tab/>
+        <w:t>29</w:t>
       </w:r>
     </w:p>
     <w:p>
@@ -2418,7 +2484,7 @@
           <w:sz w:val="22"/>
         </w:rPr>
         <w:tab/>
-        <w:t>27</w:t>
+        <w:t>30</w:t>
       </w:r>
     </w:p>
     <w:p>
@@ -2440,7 +2506,7 @@
           <w:sz w:val="22"/>
         </w:rPr>
         <w:tab/>
-        <w:t>27</w:t>
+        <w:t>30</w:t>
       </w:r>
     </w:p>
     <w:p>
@@ -2462,7 +2528,7 @@
           <w:sz w:val="22"/>
         </w:rPr>
         <w:tab/>
-        <w:t>28</w:t>
+        <w:t>31</w:t>
       </w:r>
     </w:p>
     <w:p>
@@ -2486,7 +2552,7 @@
           <w:sz w:val="24"/>
         </w:rPr>
         <w:tab/>
-        <w:t>29</w:t>
+        <w:t>32</w:t>
       </w:r>
     </w:p>
     <w:p>
@@ -2508,7 +2574,7 @@
           <w:sz w:val="22"/>
         </w:rPr>
         <w:tab/>
-        <w:t>29</w:t>
+        <w:t>32</w:t>
       </w:r>
     </w:p>
     <w:p>
@@ -2530,7 +2596,7 @@
           <w:sz w:val="22"/>
         </w:rPr>
         <w:tab/>
-        <w:t>29</w:t>
+        <w:t>32</w:t>
       </w:r>
     </w:p>
     <w:p>
@@ -2552,7 +2618,7 @@
           <w:sz w:val="22"/>
         </w:rPr>
         <w:tab/>
-        <w:t>32</w:t>
+        <w:t>35</w:t>
       </w:r>
     </w:p>
     <w:p>
@@ -2574,7 +2640,7 @@
           <w:sz w:val="22"/>
         </w:rPr>
         <w:tab/>
-        <w:t>33</w:t>
+        <w:t>36</w:t>
       </w:r>
     </w:p>
     <w:p>
@@ -2598,7 +2664,7 @@
           <w:sz w:val="24"/>
         </w:rPr>
         <w:tab/>
-        <w:t>34</w:t>
+        <w:t>37</w:t>
       </w:r>
     </w:p>
     <w:p>
@@ -2620,7 +2686,7 @@
           <w:sz w:val="22"/>
         </w:rPr>
         <w:tab/>
-        <w:t>34</w:t>
+        <w:t>37</w:t>
       </w:r>
     </w:p>
     <w:p>
@@ -2642,7 +2708,7 @@
           <w:sz w:val="22"/>
         </w:rPr>
         <w:tab/>
-        <w:t>34</w:t>
+        <w:t>37</w:t>
       </w:r>
     </w:p>
     <w:p>
@@ -2664,7 +2730,7 @@
           <w:sz w:val="22"/>
         </w:rPr>
         <w:tab/>
-        <w:t>34</w:t>
+        <w:t>38</w:t>
       </w:r>
     </w:p>
     <w:p>
@@ -2686,7 +2752,7 @@
           <w:sz w:val="22"/>
         </w:rPr>
         <w:tab/>
-        <w:t>35</w:t>
+        <w:t>38</w:t>
       </w:r>
     </w:p>
     <w:p>
@@ -2708,7 +2774,7 @@
           <w:sz w:val="22"/>
         </w:rPr>
         <w:tab/>
-        <w:t>36</w:t>
+        <w:t>39</w:t>
       </w:r>
     </w:p>
     <w:p>
@@ -2732,7 +2798,7 @@
           <w:sz w:val="24"/>
         </w:rPr>
         <w:tab/>
-        <w:t>37</w:t>
+        <w:t>40</w:t>
       </w:r>
     </w:p>
     <w:p>
@@ -2754,7 +2820,7 @@
           <w:sz w:val="22"/>
         </w:rPr>
         <w:tab/>
-        <w:t>37</w:t>
+        <w:t>40</w:t>
       </w:r>
     </w:p>
     <w:p>
@@ -2776,7 +2842,7 @@
           <w:sz w:val="22"/>
         </w:rPr>
         <w:tab/>
-        <w:t>37</w:t>
+        <w:t>40</w:t>
       </w:r>
     </w:p>
     <w:p>
@@ -2798,7 +2864,7 @@
           <w:sz w:val="22"/>
         </w:rPr>
         <w:tab/>
-        <w:t>38</w:t>
+        <w:t>41</w:t>
       </w:r>
     </w:p>
     <w:p>
@@ -2820,7 +2886,7 @@
           <w:sz w:val="22"/>
         </w:rPr>
         <w:tab/>
-        <w:t>38</w:t>
+        <w:t>41</w:t>
       </w:r>
     </w:p>
     <w:p>
@@ -2844,7 +2910,7 @@
           <w:sz w:val="24"/>
         </w:rPr>
         <w:tab/>
-        <w:t>39</w:t>
+        <w:t>42</w:t>
       </w:r>
     </w:p>
     <w:p>
@@ -2866,7 +2932,7 @@
           <w:sz w:val="22"/>
         </w:rPr>
         <w:tab/>
-        <w:t>39</w:t>
+        <w:t>42</w:t>
       </w:r>
     </w:p>
     <w:p>
@@ -2890,7 +2956,7 @@
           <w:sz w:val="24"/>
         </w:rPr>
         <w:tab/>
-        <w:t>41</w:t>
+        <w:t>44</w:t>
       </w:r>
     </w:p>
     <w:p>
@@ -2912,7 +2978,7 @@
           <w:sz w:val="22"/>
         </w:rPr>
         <w:tab/>
-        <w:t>41</w:t>
+        <w:t>44</w:t>
       </w:r>
     </w:p>
     <w:p>
@@ -2934,7 +3000,7 @@
           <w:sz w:val="22"/>
         </w:rPr>
         <w:tab/>
-        <w:t>41</w:t>
+        <w:t>44</w:t>
       </w:r>
     </w:p>
     <w:p>
@@ -2956,7 +3022,7 @@
           <w:sz w:val="22"/>
         </w:rPr>
         <w:tab/>
-        <w:t>42</w:t>
+        <w:t>45</w:t>
       </w:r>
     </w:p>
     <w:p>
@@ -2980,7 +3046,7 @@
           <w:sz w:val="24"/>
         </w:rPr>
         <w:tab/>
-        <w:t>43</w:t>
+        <w:t>46</w:t>
       </w:r>
     </w:p>
     <w:p>
@@ -3002,7 +3068,7 @@
           <w:sz w:val="22"/>
         </w:rPr>
         <w:tab/>
-        <w:t>43</w:t>
+        <w:t>46</w:t>
       </w:r>
     </w:p>
     <w:p>
@@ -3024,7 +3090,7 @@
           <w:sz w:val="22"/>
         </w:rPr>
         <w:tab/>
-        <w:t>43</w:t>
+        <w:t>46</w:t>
       </w:r>
     </w:p>
     <w:p>
@@ -3046,7 +3112,7 @@
           <w:sz w:val="22"/>
         </w:rPr>
         <w:tab/>
-        <w:t>44</w:t>
+        <w:t>47</w:t>
       </w:r>
     </w:p>
     <w:p>
@@ -3070,7 +3136,7 @@
           <w:sz w:val="24"/>
         </w:rPr>
         <w:tab/>
-        <w:t>45</w:t>
+        <w:t>48</w:t>
       </w:r>
     </w:p>
     <w:p>
@@ -3094,7 +3160,7 @@
           <w:sz w:val="24"/>
         </w:rPr>
         <w:tab/>
-        <w:t>46</w:t>
+        <w:t>49</w:t>
       </w:r>
     </w:p>
     <w:p>
@@ -3118,7 +3184,7 @@
           <w:sz w:val="24"/>
         </w:rPr>
         <w:tab/>
-        <w:t>47</w:t>
+        <w:t>50</w:t>
       </w:r>
     </w:p>
     <w:p>
@@ -3142,7 +3208,7 @@
           <w:sz w:val="24"/>
         </w:rPr>
         <w:tab/>
-        <w:t>48</w:t>
+        <w:t>51</w:t>
       </w:r>
     </w:p>
     <w:p>
@@ -3166,7 +3232,7 @@
           <w:sz w:val="24"/>
         </w:rPr>
         <w:tab/>
-        <w:t>49</w:t>
+        <w:t>52</w:t>
       </w:r>
     </w:p>
     <w:p>
@@ -3324,14 +3390,14 @@
         <w:rPr>
           <w:sz w:val="22"/>
         </w:rPr>
-        <w:t>Figure 6.1   KiCad schematic of the hexapod shield PCB</w:t>
+        <w:t>Figure 6.1   KiCad schematic, sheet 1 — Arduino headers, PCA9685 modules (U2, U3), capacitors and support circuits</w:t>
       </w:r>
       <w:r>
         <w:rPr>
           <w:sz w:val="22"/>
         </w:rPr>
         <w:tab/>
-        <w:t>20</w:t>
+        <w:t>21</w:t>
       </w:r>
     </w:p>
     <w:p>
@@ -3346,14 +3412,14 @@
         <w:rPr>
           <w:sz w:val="22"/>
         </w:rPr>
-        <w:t>Figure 6.2   Functional grouping of the shield (conceptual — the actual placement is shown in the KiCad layout figures)</w:t>
+        <w:t>Figure 6.2   KiCad schematic, sheet 2 — servo sockets, sensor headers, camera connector and power terminals</w:t>
       </w:r>
       <w:r>
         <w:rPr>
           <w:sz w:val="22"/>
         </w:rPr>
         <w:tab/>
-        <w:t>24</w:t>
+        <w:t>21</w:t>
       </w:r>
     </w:p>
     <w:p>
@@ -3368,7 +3434,7 @@
         <w:rPr>
           <w:sz w:val="22"/>
         </w:rPr>
-        <w:t>Figure 6.3   PCB 2D layout in KiCad</w:t>
+        <w:t>Figure 6.3   Functional grouping of the shield (conceptual — the actual placement is shown in the KiCad layout figures)</w:t>
       </w:r>
       <w:r>
         <w:rPr>
@@ -3390,7 +3456,7 @@
         <w:rPr>
           <w:sz w:val="22"/>
         </w:rPr>
-        <w:t>Figure 6.4   3D view of the PCB in KiCad</w:t>
+        <w:t>Figure 6.4   Completed PCB layout in KiCad (red: front copper, blue: back copper ground pour)</w:t>
       </w:r>
       <w:r>
         <w:rPr>
@@ -3412,14 +3478,14 @@
         <w:rPr>
           <w:sz w:val="22"/>
         </w:rPr>
-        <w:t>Figure 6.5   Design rule check result in KiCad</w:t>
+        <w:t>Figure 6.5   3D view of the PCB in KiCad</w:t>
       </w:r>
       <w:r>
         <w:rPr>
           <w:sz w:val="22"/>
         </w:rPr>
         <w:tab/>
-        <w:t>26</w:t>
+        <w:t>27</w:t>
       </w:r>
     </w:p>
     <w:p>
@@ -3434,14 +3500,14 @@
         <w:rPr>
           <w:sz w:val="22"/>
         </w:rPr>
-        <w:t>Figure 6.6   Gerber files exported from KiCad</w:t>
+        <w:t>Figure 6.6   ERC result — 0 violations, 0 errors and 0 warnings</w:t>
       </w:r>
       <w:r>
         <w:rPr>
           <w:sz w:val="22"/>
         </w:rPr>
         <w:tab/>
-        <w:t>27</w:t>
+        <w:t>28</w:t>
       </w:r>
     </w:p>
     <w:p>
@@ -3456,14 +3522,14 @@
         <w:rPr>
           <w:sz w:val="22"/>
         </w:rPr>
-        <w:t>Figure 7.1   Some of the procured components (photograph taken by the team)</w:t>
+        <w:t>Figure 6.7   DRC result — 0 unconnected items; the listed violations are silkscreen clearance</w:t>
       </w:r>
       <w:r>
         <w:rPr>
           <w:sz w:val="22"/>
         </w:rPr>
         <w:tab/>
-        <w:t>31</w:t>
+        <w:t>29</w:t>
       </w:r>
     </w:p>
     <w:p>
@@ -3478,14 +3544,14 @@
         <w:rPr>
           <w:sz w:val="22"/>
         </w:rPr>
-        <w:t>Figure 7.2   (a) Arduino Uno R3 — main controller; (b) ESP32-WROOM-32 development board — programmer for the ESP32-CAM</w:t>
+        <w:t>Figure 6.8   Gerber files exported from KiCad</w:t>
       </w:r>
       <w:r>
         <w:rPr>
           <w:sz w:val="22"/>
         </w:rPr>
         <w:tab/>
-        <w:t>32</w:t>
+        <w:t>30</w:t>
       </w:r>
     </w:p>
     <w:p>
@@ -3500,14 +3566,14 @@
         <w:rPr>
           <w:sz w:val="22"/>
         </w:rPr>
-        <w:t>Figure 7.3   (c) TowerPro MG996R metal-gear servo — leg actuator; (d) PCA9685 16-channel PWM driver</w:t>
+        <w:t>Figure 7.1   Some of the procured components (photograph taken by the team)</w:t>
       </w:r>
       <w:r>
         <w:rPr>
           <w:sz w:val="22"/>
         </w:rPr>
         <w:tab/>
-        <w:t>32</w:t>
+        <w:t>34</w:t>
       </w:r>
     </w:p>
     <w:p>
@@ -3522,7 +3588,7 @@
         <w:rPr>
           <w:sz w:val="22"/>
         </w:rPr>
-        <w:t>Figure 8.1   Planned 3D printing workflow — each step is checked before the next</w:t>
+        <w:t>Figure 7.2   (a) Arduino Uno R3 — main controller; (b) ESP32-WROOM-32 development board — programmer for the ESP32-CAM</w:t>
       </w:r>
       <w:r>
         <w:rPr>
@@ -3530,17 +3596,6 @@
         </w:rPr>
         <w:tab/>
         <w:t>35</w:t>
-      </w:r>
-    </w:p>
-    <w:p>
-      <w:pPr>
-        <w:pStyle w:val="Heading1"/>
-        <w:pageBreakBefore/>
-        <w:spacing w:after="360"/>
-        <w:jc w:val="center"/>
-      </w:pPr>
-      <w:r>
-        <w:t>LIST OF TABLES</w:t>
       </w:r>
     </w:p>
     <w:p>
@@ -3555,14 +3610,14 @@
         <w:rPr>
           <w:sz w:val="22"/>
         </w:rPr>
-        <w:t>Table 2.1   Summary of the reviewed literature and its relevance to our project</w:t>
+        <w:t>Figure 7.3   (c) TowerPro MG996R metal-gear servo — leg actuator; (d) PCA9685 16-channel PWM driver</w:t>
       </w:r>
       <w:r>
         <w:rPr>
           <w:sz w:val="22"/>
         </w:rPr>
         <w:tab/>
-        <w:t>5</w:t>
+        <w:t>35</w:t>
       </w:r>
     </w:p>
     <w:p>
@@ -3577,14 +3632,14 @@
         <w:rPr>
           <w:sz w:val="22"/>
         </w:rPr>
-        <w:t>Table 3.1   Comparison between the base paper and our project</w:t>
+        <w:t>Figure 8.1   3D model of the hexapod</w:t>
       </w:r>
       <w:r>
         <w:rPr>
           <w:sz w:val="22"/>
         </w:rPr>
         <w:tab/>
-        <w:t>9</w:t>
+        <w:t>38</w:t>
       </w:r>
     </w:p>
     <w:p>
@@ -3599,14 +3654,14 @@
         <w:rPr>
           <w:sz w:val="22"/>
         </w:rPr>
-        <w:t>Table 4.1   Main subsystems of the planned robot</w:t>
+        <w:t>Figure 8.2   Planned 3D printing workflow — each step is checked before the next</w:t>
       </w:r>
       <w:r>
         <w:rPr>
           <w:sz w:val="22"/>
         </w:rPr>
         <w:tab/>
-        <w:t>11</w:t>
+        <w:t>38</w:t>
       </w:r>
     </w:p>
     <w:p>
@@ -3621,14 +3676,25 @@
         <w:rPr>
           <w:sz w:val="22"/>
         </w:rPr>
-        <w:t>Table 4.2   Major components and their role in the robot</w:t>
+        <w:t>Figure 8.3   First 3D-printed test parts</w:t>
       </w:r>
       <w:r>
         <w:rPr>
           <w:sz w:val="22"/>
         </w:rPr>
         <w:tab/>
-        <w:t>13</w:t>
+        <w:t>39</w:t>
+      </w:r>
+    </w:p>
+    <w:p>
+      <w:pPr>
+        <w:pStyle w:val="Heading1"/>
+        <w:pageBreakBefore/>
+        <w:spacing w:after="360"/>
+        <w:jc w:val="center"/>
+      </w:pPr>
+      <w:r>
+        <w:t>LIST OF TABLES</w:t>
       </w:r>
     </w:p>
     <w:p>
@@ -3643,14 +3709,14 @@
         <w:rPr>
           <w:sz w:val="22"/>
         </w:rPr>
-        <w:t>Table 4.3   Estimated weight budget of the planned robot (design estimate, not measured)</w:t>
+        <w:t>Table 2.1   Summary of the reviewed literature and its relevance to our project</w:t>
       </w:r>
       <w:r>
         <w:rPr>
           <w:sz w:val="22"/>
         </w:rPr>
         <w:tab/>
-        <w:t>16</w:t>
+        <w:t>5</w:t>
       </w:r>
     </w:p>
     <w:p>
@@ -3665,14 +3731,14 @@
         <w:rPr>
           <w:sz w:val="22"/>
         </w:rPr>
-        <w:t>Table 5.1   Phase-wise methodology</w:t>
+        <w:t>Table 3.1   Comparison between the base paper and our project</w:t>
       </w:r>
       <w:r>
         <w:rPr>
           <w:sz w:val="22"/>
         </w:rPr>
         <w:tab/>
-        <w:t>17</w:t>
+        <w:t>9</w:t>
       </w:r>
     </w:p>
     <w:p>
@@ -3687,14 +3753,14 @@
         <w:rPr>
           <w:sz w:val="22"/>
         </w:rPr>
-        <w:t>Table 5.2   Software tools and their use</w:t>
+        <w:t>Table 4.1   Main subsystems of the planned robot</w:t>
       </w:r>
       <w:r>
         <w:rPr>
           <w:sz w:val="22"/>
         </w:rPr>
         <w:tab/>
-        <w:t>18</w:t>
+        <w:t>11</w:t>
       </w:r>
     </w:p>
     <w:p>
@@ -3709,14 +3775,14 @@
         <w:rPr>
           <w:sz w:val="22"/>
         </w:rPr>
-        <w:t>Table 6.1   Arduino Uno pin allocation on the shield</w:t>
+        <w:t>Table 4.2   Major components and their role in the robot</w:t>
       </w:r>
       <w:r>
         <w:rPr>
           <w:sz w:val="22"/>
         </w:rPr>
         <w:tab/>
-        <w:t>21</w:t>
+        <w:t>13</w:t>
       </w:r>
     </w:p>
     <w:p>
@@ -3731,14 +3797,14 @@
         <w:rPr>
           <w:sz w:val="22"/>
         </w:rPr>
-        <w:t>Table 6.2   Servo socket allocation</w:t>
+        <w:t>Table 4.3   Estimated weight budget of the planned robot (design estimate, not measured)</w:t>
       </w:r>
       <w:r>
         <w:rPr>
           <w:sz w:val="22"/>
         </w:rPr>
         <w:tab/>
-        <w:t>22</w:t>
+        <w:t>16</w:t>
       </w:r>
     </w:p>
     <w:p>
@@ -3753,14 +3819,14 @@
         <w:rPr>
           <w:sz w:val="22"/>
         </w:rPr>
-        <w:t>Table 6.3   ESP32-CAM connector (J25)</w:t>
+        <w:t>Table 5.1   Phase-wise methodology</w:t>
       </w:r>
       <w:r>
         <w:rPr>
           <w:sz w:val="22"/>
         </w:rPr>
         <w:tab/>
-        <w:t>23</w:t>
+        <w:t>17</w:t>
       </w:r>
     </w:p>
     <w:p>
@@ -3775,14 +3841,14 @@
         <w:rPr>
           <w:sz w:val="22"/>
         </w:rPr>
-        <w:t>Table 6.4   Power input terminals on the PCB</w:t>
+        <w:t>Table 5.2   Software tools and their use</w:t>
       </w:r>
       <w:r>
         <w:rPr>
           <w:sz w:val="22"/>
         </w:rPr>
         <w:tab/>
-        <w:t>23</w:t>
+        <w:t>18</w:t>
       </w:r>
     </w:p>
     <w:p>
@@ -3797,14 +3863,14 @@
         <w:rPr>
           <w:sz w:val="22"/>
         </w:rPr>
-        <w:t>Table 6.5   PCB design data (to be filled in from the final KiCad project)</w:t>
+        <w:t>Table 6.1   Arduino Uno pin allocation on the shield</w:t>
       </w:r>
       <w:r>
         <w:rPr>
           <w:sz w:val="22"/>
         </w:rPr>
         <w:tab/>
-        <w:t>26</w:t>
+        <w:t>22</w:t>
       </w:r>
     </w:p>
     <w:p>
@@ -3819,14 +3885,14 @@
         <w:rPr>
           <w:sz w:val="22"/>
         </w:rPr>
-        <w:t>Table 6.6   PCB milestone status</w:t>
+        <w:t>Table 6.2   Servo socket allocation</w:t>
       </w:r>
       <w:r>
         <w:rPr>
           <w:sz w:val="22"/>
         </w:rPr>
         <w:tab/>
-        <w:t>27</w:t>
+        <w:t>23</w:t>
       </w:r>
     </w:p>
     <w:p>
@@ -3841,14 +3907,14 @@
         <w:rPr>
           <w:sz w:val="22"/>
         </w:rPr>
-        <w:t>Table 7.1   Component procurement status</w:t>
+        <w:t>Table 6.3   ESP32-CAM connector (J25)</w:t>
       </w:r>
       <w:r>
         <w:rPr>
           <w:sz w:val="22"/>
         </w:rPr>
         <w:tab/>
-        <w:t>29</w:t>
+        <w:t>24</w:t>
       </w:r>
     </w:p>
     <w:p>
@@ -3863,14 +3929,14 @@
         <w:rPr>
           <w:sz w:val="22"/>
         </w:rPr>
-        <w:t>Table 7.2   Estimated cost of purchased components (from the build plan)</w:t>
+        <w:t>Table 6.4   Power input terminals on the PCB</w:t>
       </w:r>
       <w:r>
         <w:rPr>
           <w:sz w:val="22"/>
         </w:rPr>
         <w:tab/>
-        <w:t>33</w:t>
+        <w:t>24</w:t>
       </w:r>
     </w:p>
     <w:p>
@@ -3885,14 +3951,14 @@
         <w:rPr>
           <w:sz w:val="22"/>
         </w:rPr>
-        <w:t>Table 8.1   Planned 3D-printed parts</w:t>
+        <w:t>Table 6.5   PCB design data (to be filled in from the final KiCad project)</w:t>
       </w:r>
       <w:r>
         <w:rPr>
           <w:sz w:val="22"/>
         </w:rPr>
         <w:tab/>
-        <w:t>34</w:t>
+        <w:t>27</w:t>
       </w:r>
     </w:p>
     <w:p>
@@ -3907,14 +3973,14 @@
         <w:rPr>
           <w:sz w:val="22"/>
         </w:rPr>
-        <w:t>Table 9.1   Current project progress</w:t>
+        <w:t>Table 6.6   PCB milestone status</w:t>
       </w:r>
       <w:r>
         <w:rPr>
           <w:sz w:val="22"/>
         </w:rPr>
         <w:tab/>
-        <w:t>37</w:t>
+        <w:t>30</w:t>
       </w:r>
     </w:p>
     <w:p>
@@ -3929,14 +3995,14 @@
         <w:rPr>
           <w:sz w:val="22"/>
         </w:rPr>
-        <w:t>Table 10.1   Key engineering challenges and how the design addresses them</w:t>
+        <w:t>Table 7.1   Component procurement status</w:t>
       </w:r>
       <w:r>
         <w:rPr>
           <w:sz w:val="22"/>
         </w:rPr>
         <w:tab/>
-        <w:t>39</w:t>
+        <w:t>32</w:t>
       </w:r>
     </w:p>
     <w:p>
@@ -3951,14 +4017,14 @@
         <w:rPr>
           <w:sz w:val="22"/>
         </w:rPr>
-        <w:t>Table 12.1   Tentative plan of action</w:t>
+        <w:t>Table 7.2   Estimated cost of purchased components (from the build plan)</w:t>
       </w:r>
       <w:r>
         <w:rPr>
           <w:sz w:val="22"/>
         </w:rPr>
         <w:tab/>
-        <w:t>43</w:t>
+        <w:t>36</w:t>
       </w:r>
     </w:p>
     <w:p>
@@ -3973,14 +4039,14 @@
         <w:rPr>
           <w:sz w:val="22"/>
         </w:rPr>
-        <w:t>Table A.1   Planned I²C devices</w:t>
+        <w:t>Table 8.1   Planned 3D-printed parts</w:t>
       </w:r>
       <w:r>
         <w:rPr>
           <w:sz w:val="22"/>
         </w:rPr>
         <w:tab/>
-        <w:t>48</w:t>
+        <w:t>37</w:t>
       </w:r>
     </w:p>
     <w:p>
@@ -3995,14 +4061,14 @@
         <w:rPr>
           <w:sz w:val="22"/>
         </w:rPr>
-        <w:t>Table A.2   Planned servo channel map</w:t>
+        <w:t>Table 9.1   Current project progress</w:t>
       </w:r>
       <w:r>
         <w:rPr>
           <w:sz w:val="22"/>
         </w:rPr>
         <w:tab/>
-        <w:t>48</w:t>
+        <w:t>40</w:t>
       </w:r>
     </w:p>
     <w:p>
@@ -4017,14 +4083,14 @@
         <w:rPr>
           <w:sz w:val="22"/>
         </w:rPr>
-        <w:t>Table A.3   Planned firmware limits</w:t>
+        <w:t>Table 10.1   Key engineering challenges and how the design addresses them</w:t>
       </w:r>
       <w:r>
         <w:rPr>
           <w:sz w:val="22"/>
         </w:rPr>
         <w:tab/>
-        <w:t>48</w:t>
+        <w:t>42</w:t>
       </w:r>
     </w:p>
     <w:p>
@@ -4039,6 +4105,94 @@
         <w:rPr>
           <w:sz w:val="22"/>
         </w:rPr>
+        <w:t>Table 12.1   Tentative plan of action</w:t>
+      </w:r>
+      <w:r>
+        <w:rPr>
+          <w:sz w:val="22"/>
+        </w:rPr>
+        <w:tab/>
+        <w:t>46</w:t>
+      </w:r>
+    </w:p>
+    <w:p>
+      <w:pPr>
+        <w:tabs>
+          <w:tab w:pos="9288" w:val="right" w:leader="dot"/>
+        </w:tabs>
+        <w:spacing w:after="20" w:line="276" w:lineRule="auto"/>
+        <w:ind w:left="432"/>
+      </w:pPr>
+      <w:r>
+        <w:rPr>
+          <w:sz w:val="22"/>
+        </w:rPr>
+        <w:t>Table A.1   Planned I²C devices</w:t>
+      </w:r>
+      <w:r>
+        <w:rPr>
+          <w:sz w:val="22"/>
+        </w:rPr>
+        <w:tab/>
+        <w:t>51</w:t>
+      </w:r>
+    </w:p>
+    <w:p>
+      <w:pPr>
+        <w:tabs>
+          <w:tab w:pos="9288" w:val="right" w:leader="dot"/>
+        </w:tabs>
+        <w:spacing w:after="20" w:line="276" w:lineRule="auto"/>
+        <w:ind w:left="432"/>
+      </w:pPr>
+      <w:r>
+        <w:rPr>
+          <w:sz w:val="22"/>
+        </w:rPr>
+        <w:t>Table A.2   Planned servo channel map</w:t>
+      </w:r>
+      <w:r>
+        <w:rPr>
+          <w:sz w:val="22"/>
+        </w:rPr>
+        <w:tab/>
+        <w:t>51</w:t>
+      </w:r>
+    </w:p>
+    <w:p>
+      <w:pPr>
+        <w:tabs>
+          <w:tab w:pos="9288" w:val="right" w:leader="dot"/>
+        </w:tabs>
+        <w:spacing w:after="20" w:line="276" w:lineRule="auto"/>
+        <w:ind w:left="432"/>
+      </w:pPr>
+      <w:r>
+        <w:rPr>
+          <w:sz w:val="22"/>
+        </w:rPr>
+        <w:t>Table A.3   Planned firmware limits</w:t>
+      </w:r>
+      <w:r>
+        <w:rPr>
+          <w:sz w:val="22"/>
+        </w:rPr>
+        <w:tab/>
+        <w:t>51</w:t>
+      </w:r>
+    </w:p>
+    <w:p>
+      <w:pPr>
+        <w:tabs>
+          <w:tab w:pos="9288" w:val="right" w:leader="dot"/>
+        </w:tabs>
+        <w:spacing w:after="20" w:line="276" w:lineRule="auto"/>
+        <w:ind w:left="432"/>
+      </w:pPr>
+      <w:r>
+        <w:rPr>
+          <w:sz w:val="22"/>
+        </w:rPr>
         <w:t>Table A.4   Checklist of figures to be supplied by the team</w:t>
       </w:r>
       <w:r>
@@ -4046,7 +4200,7 @@
           <w:sz w:val="22"/>
         </w:rPr>
         <w:tab/>
-        <w:t>49</w:t>
+        <w:t>52</w:t>
       </w:r>
     </w:p>
     <w:p>
@@ -11192,52 +11346,59 @@
         <w:t xml:space="preserve"> for fabrication.</w:t>
       </w:r>
     </w:p>
-    <w:tbl>
-      <w:tblPr>
+    <w:p>
+      <w:pPr>
+        <w:spacing w:after="120"/>
+        <w:jc w:val="both"/>
+      </w:pPr>
+      <w:r>
+        <w:t>The schematic is drawn on two sheets. The first sheet (Figure 6.1) holds the Arduino shield headers J1–J4, the two PCA9685 modules, the bulk and decoupling capacitors, the camera-servo diode D1, the battery-sense divider, the camera serial divider, the LEDs and the buzzer driver. The second sheet (Figure 6.2) holds the 20 servo sockets, the sensor headers J21–J24, the camera connector J25, the power terminals J26–J30 and the programming jumper JP1.</w:t>
+      </w:r>
+    </w:p>
+    <w:p>
+      <w:pPr>
+        <w:keepNext/>
+        <w:spacing w:after="40"/>
         <w:jc w:val="center"/>
-        <w:tblLayout w:type="fixed"/>
-        <w:tblLook w:firstColumn="1" w:firstRow="1" w:lastColumn="0" w:lastRow="0" w:noHBand="0" w:noVBand="1" w:val="04A0"/>
-        <w:tblW w:w="8063" w:type="dxa"/>
-        <w:tblLayout w:type="fixed"/>
-      </w:tblPr>
-      <w:tblGrid>
-        <w:gridCol w:w="8063"/>
-      </w:tblGrid>
-      <w:tr>
-        <w:trPr>
-          <w:trHeight w:val="3168" w:hRule="atLeast"/>
-        </w:trPr>
-        <w:tc>
-          <w:tcPr>
-            <w:tcW w:type="dxa" w:w="8064"/>
-            <w:tcBorders>
-              <w:top w:val="dashed" w:sz="8" w:space="0" w:color="808080"/>
-              <w:left w:val="dashed" w:sz="8" w:space="0" w:color="808080"/>
-              <w:bottom w:val="dashed" w:sz="8" w:space="0" w:color="808080"/>
-              <w:right w:val="dashed" w:sz="8" w:space="0" w:color="808080"/>
-            </w:tcBorders>
-            <w:shd w:val="clear" w:color="auto" w:fill="F7F7F7"/>
-            <w:vAlign w:val="center"/>
-          </w:tcPr>
-          <w:p>
-            <w:pPr>
-              <w:jc w:val="center"/>
-            </w:pPr>
-            <w:r>
-              <w:rPr>
-                <w:i/>
-                <w:color w:val="555555"/>
-                <w:sz w:val="21"/>
-              </w:rPr>
-              <w:t>[Insert screenshot of the complete KiCad schematic here]</w:t>
-            </w:r>
-          </w:p>
-        </w:tc>
-      </w:tr>
-    </w:tbl>
-    <w:p>
-      <w:pPr>
-        <w:spacing w:before="60"/>
+      </w:pPr>
+      <w:r>
+        <w:drawing>
+          <wp:inline xmlns:a="http://schemas.openxmlformats.org/drawingml/2006/main" xmlns:pic="http://schemas.openxmlformats.org/drawingml/2006/picture">
+            <wp:extent cx="5852160" cy="2761019"/>
+            <wp:docPr id="9" name="Picture 9"/>
+            <wp:cNvGraphicFramePr>
+              <a:graphicFrameLocks noChangeAspect="1"/>
+            </wp:cNvGraphicFramePr>
+            <a:graphic>
+              <a:graphicData uri="http://schemas.openxmlformats.org/drawingml/2006/picture">
+                <pic:pic>
+                  <pic:nvPicPr>
+                    <pic:cNvPr id="0" name="kicad_schematic_1.png"/>
+                    <pic:cNvPicPr/>
+                  </pic:nvPicPr>
+                  <pic:blipFill>
+                    <a:blip r:embed="rId20"/>
+                    <a:stretch>
+                      <a:fillRect/>
+                    </a:stretch>
+                  </pic:blipFill>
+                  <pic:spPr>
+                    <a:xfrm>
+                      <a:off x="0" y="0"/>
+                      <a:ext cx="5852160" cy="2761019"/>
+                    </a:xfrm>
+                    <a:prstGeom prst="rect"/>
+                  </pic:spPr>
+                </pic:pic>
+              </a:graphicData>
+            </a:graphic>
+          </wp:inline>
+        </w:drawing>
+      </w:r>
+    </w:p>
+    <w:p>
+      <w:pPr>
+        <w:spacing w:after="200"/>
         <w:jc w:val="center"/>
       </w:pPr>
       <w:r>
@@ -11251,7 +11412,85 @@
         <w:rPr>
           <w:sz w:val="21"/>
         </w:rPr>
-        <w:t>KiCad schematic of the hexapod shield PCB</w:t>
+        <w:t>KiCad schematic, sheet 1 — Arduino headers, PCA9685 modules (U2, U3), capacitors and support circuits</w:t>
+      </w:r>
+    </w:p>
+    <w:p>
+      <w:pPr>
+        <w:keepNext/>
+        <w:spacing w:after="40"/>
+        <w:jc w:val="center"/>
+      </w:pPr>
+      <w:r>
+        <w:drawing>
+          <wp:inline xmlns:a="http://schemas.openxmlformats.org/drawingml/2006/main" xmlns:pic="http://schemas.openxmlformats.org/drawingml/2006/picture">
+            <wp:extent cx="5852160" cy="2586072"/>
+            <wp:docPr id="10" name="Picture 10"/>
+            <wp:cNvGraphicFramePr>
+              <a:graphicFrameLocks noChangeAspect="1"/>
+            </wp:cNvGraphicFramePr>
+            <a:graphic>
+              <a:graphicData uri="http://schemas.openxmlformats.org/drawingml/2006/picture">
+                <pic:pic>
+                  <pic:nvPicPr>
+                    <pic:cNvPr id="0" name="kicad_schematic_2.png"/>
+                    <pic:cNvPicPr/>
+                  </pic:nvPicPr>
+                  <pic:blipFill>
+                    <a:blip r:embed="rId21"/>
+                    <a:stretch>
+                      <a:fillRect/>
+                    </a:stretch>
+                  </pic:blipFill>
+                  <pic:spPr>
+                    <a:xfrm>
+                      <a:off x="0" y="0"/>
+                      <a:ext cx="5852160" cy="2586072"/>
+                    </a:xfrm>
+                    <a:prstGeom prst="rect"/>
+                  </pic:spPr>
+                </pic:pic>
+              </a:graphicData>
+            </a:graphic>
+          </wp:inline>
+        </w:drawing>
+      </w:r>
+    </w:p>
+    <w:p>
+      <w:pPr>
+        <w:spacing w:after="200"/>
+        <w:jc w:val="center"/>
+      </w:pPr>
+      <w:r>
+        <w:rPr>
+          <w:b/>
+          <w:sz w:val="21"/>
+        </w:rPr>
+        <w:t xml:space="preserve">Figure 6.2: </w:t>
+      </w:r>
+      <w:r>
+        <w:rPr>
+          <w:sz w:val="21"/>
+        </w:rPr>
+        <w:t>KiCad schematic, sheet 2 — servo sockets, sensor headers, camera connector and power terminals</w:t>
+      </w:r>
+    </w:p>
+    <w:p>
+      <w:pPr>
+        <w:spacing w:after="120"/>
+        <w:jc w:val="both"/>
+      </w:pPr>
+      <w:r>
+        <w:t xml:space="preserve">Two details of the schematic are worth pointing out. First, the PCA9685 boards are drawn as 24-pin connector symbols (U2 and U3), because on our PCB they are plug-in modules seated in female headers, not chips soldered to the board. Second, the small blue crosses on unused pins are KiCad </w:t>
+      </w:r>
+      <w:r>
+        <w:rPr>
+          <w:b/>
+        </w:rPr>
+        <w:t>no-connect flags</w:t>
+      </w:r>
+      <w:r>
+        <w:t>, placed with the Q key. They mark pins that we left unconnected on purpose — for example D0/D1, VIN and the unused driver channels — so that the checker knows these pins are not forgotten wiring.</w:t>
       </w:r>
     </w:p>
     <w:p>
@@ -13881,7 +14120,7 @@
         <w:drawing>
           <wp:inline xmlns:a="http://schemas.openxmlformats.org/drawingml/2006/main" xmlns:pic="http://schemas.openxmlformats.org/drawingml/2006/picture">
             <wp:extent cx="4937760" cy="3284589"/>
-            <wp:docPr id="9" name="Picture 9"/>
+            <wp:docPr id="11" name="Picture 11"/>
             <wp:cNvGraphicFramePr>
               <a:graphicFrameLocks noChangeAspect="1"/>
             </wp:cNvGraphicFramePr>
@@ -13893,7 +14132,7 @@
                     <pic:cNvPicPr/>
                   </pic:nvPicPr>
                   <pic:blipFill>
-                    <a:blip r:embed="rId20"/>
+                    <a:blip r:embed="rId22"/>
                     <a:stretch>
                       <a:fillRect/>
                     </a:stretch>
@@ -13922,7 +14161,7 @@
           <w:b/>
           <w:sz w:val="21"/>
         </w:rPr>
-        <w:t xml:space="preserve">Figure 6.2: </w:t>
+        <w:t xml:space="preserve">Figure 6.3: </w:t>
       </w:r>
       <w:r>
         <w:rPr>
@@ -14060,52 +14299,50 @@
         <w:t xml:space="preserve"> the channels on the driver modules sit in four groups of four with uneven gaps, so the footprint was made to match the real module rather than assuming an even 2.54 mm pitch across the block.</w:t>
       </w:r>
     </w:p>
-    <w:tbl>
-      <w:tblPr>
+    <w:p>
+      <w:pPr>
+        <w:keepNext/>
+        <w:spacing w:after="40"/>
         <w:jc w:val="center"/>
-        <w:tblLayout w:type="fixed"/>
-        <w:tblLook w:firstColumn="1" w:firstRow="1" w:lastColumn="0" w:lastRow="0" w:noHBand="0" w:noVBand="1" w:val="04A0"/>
-        <w:tblW w:w="8063" w:type="dxa"/>
-        <w:tblLayout w:type="fixed"/>
-      </w:tblPr>
-      <w:tblGrid>
-        <w:gridCol w:w="8063"/>
-      </w:tblGrid>
-      <w:tr>
-        <w:trPr>
-          <w:trHeight w:val="3744" w:hRule="atLeast"/>
-        </w:trPr>
-        <w:tc>
-          <w:tcPr>
-            <w:tcW w:type="dxa" w:w="8064"/>
-            <w:tcBorders>
-              <w:top w:val="dashed" w:sz="8" w:space="0" w:color="808080"/>
-              <w:left w:val="dashed" w:sz="8" w:space="0" w:color="808080"/>
-              <w:bottom w:val="dashed" w:sz="8" w:space="0" w:color="808080"/>
-              <w:right w:val="dashed" w:sz="8" w:space="0" w:color="808080"/>
-            </w:tcBorders>
-            <w:shd w:val="clear" w:color="auto" w:fill="F7F7F7"/>
-            <w:vAlign w:val="center"/>
-          </w:tcPr>
-          <w:p>
-            <w:pPr>
-              <w:jc w:val="center"/>
-            </w:pPr>
-            <w:r>
-              <w:rPr>
-                <w:i/>
-                <w:color w:val="555555"/>
-                <w:sz w:val="21"/>
-              </w:rPr>
-              <w:t>[Insert screenshot of the completed PCB layout (2D view, all copper layers) from KiCad here]</w:t>
-            </w:r>
-          </w:p>
-        </w:tc>
-      </w:tr>
-    </w:tbl>
-    <w:p>
-      <w:pPr>
-        <w:spacing w:before="60"/>
+      </w:pPr>
+      <w:r>
+        <w:drawing>
+          <wp:inline xmlns:a="http://schemas.openxmlformats.org/drawingml/2006/main" xmlns:pic="http://schemas.openxmlformats.org/drawingml/2006/picture">
+            <wp:extent cx="5852160" cy="4120694"/>
+            <wp:docPr id="12" name="Picture 12"/>
+            <wp:cNvGraphicFramePr>
+              <a:graphicFrameLocks noChangeAspect="1"/>
+            </wp:cNvGraphicFramePr>
+            <a:graphic>
+              <a:graphicData uri="http://schemas.openxmlformats.org/drawingml/2006/picture">
+                <pic:pic>
+                  <pic:nvPicPr>
+                    <pic:cNvPr id="0" name="kicad_layout_2d.png"/>
+                    <pic:cNvPicPr/>
+                  </pic:nvPicPr>
+                  <pic:blipFill>
+                    <a:blip r:embed="rId23"/>
+                    <a:stretch>
+                      <a:fillRect/>
+                    </a:stretch>
+                  </pic:blipFill>
+                  <pic:spPr>
+                    <a:xfrm>
+                      <a:off x="0" y="0"/>
+                      <a:ext cx="5852160" cy="4120694"/>
+                    </a:xfrm>
+                    <a:prstGeom prst="rect"/>
+                  </pic:spPr>
+                </pic:pic>
+              </a:graphicData>
+            </a:graphic>
+          </wp:inline>
+        </w:drawing>
+      </w:r>
+    </w:p>
+    <w:p>
+      <w:pPr>
+        <w:spacing w:after="200"/>
         <w:jc w:val="center"/>
       </w:pPr>
       <w:r>
@@ -14113,13 +14350,22 @@
           <w:b/>
           <w:sz w:val="21"/>
         </w:rPr>
-        <w:t xml:space="preserve">Figure 6.3: </w:t>
+        <w:t xml:space="preserve">Figure 6.4: </w:t>
       </w:r>
       <w:r>
         <w:rPr>
           <w:sz w:val="21"/>
         </w:rPr>
-        <w:t>PCB 2D layout in KiCad</w:t>
+        <w:t>Completed PCB layout in KiCad (red: front copper, blue: back copper ground pour)</w:t>
+      </w:r>
+    </w:p>
+    <w:p>
+      <w:pPr>
+        <w:spacing w:after="120"/>
+        <w:jc w:val="both"/>
+      </w:pPr>
+      <w:r>
+        <w:t>In the finished layout (Figure 6.4), the right-side leg sockets and the two camera-servo sockets run along the top edge and the left-side leg sockets along the bottom edge. The four converter terminals J26–J29 sit on the right edge. The wide +6V_A and +6V_B copper areas run from terminals J26 and J27 to their socket rows, with the 2200 µF capacitors C1 and C2 placed on these areas. The two PCA9685 module footprints occupy the middle of the board, and the four corner holes H1–H4 are for mounting. The blue area is the ground pour on the back copper layer.</w:t>
       </w:r>
     </w:p>
     <w:tbl>
@@ -14175,7 +14421,7 @@
           <w:b/>
           <w:sz w:val="21"/>
         </w:rPr>
-        <w:t xml:space="preserve">Figure 6.4: </w:t>
+        <w:t xml:space="preserve">Figure 6.5: </w:t>
       </w:r>
       <w:r>
         <w:rPr>
@@ -14334,7 +14580,7 @@
               <w:rPr>
                 <w:sz w:val="20"/>
               </w:rPr>
-              <w:t>[fill in]</w:t>
+              <w:t>Two (front and back copper, as seen in the layout)</w:t>
             </w:r>
           </w:p>
         </w:tc>
@@ -14503,7 +14749,93 @@
         <w:jc w:val="both"/>
       </w:pPr>
       <w:r>
-        <w:t>Before exporting fabrication files, the design was checked in the following ways:</w:t>
+        <w:t>Before exporting fabrication files, the design was checked with KiCad's Electrical Rules Checker (ERC) on the schematic and Design Rules Checker (DRC) on the layout. The netlist was also cross-checked by hand against our connection tables, and the footprints against the real modules we had purchased.</w:t>
+      </w:r>
+    </w:p>
+    <w:p>
+      <w:pPr>
+        <w:pStyle w:val="Heading3"/>
+      </w:pPr>
+      <w:r>
+        <w:t>6.6.1  Electrical Rules Check (ERC)</w:t>
+      </w:r>
+    </w:p>
+    <w:p>
+      <w:pPr>
+        <w:keepNext/>
+        <w:spacing w:after="40"/>
+        <w:jc w:val="center"/>
+      </w:pPr>
+      <w:r>
+        <w:drawing>
+          <wp:inline xmlns:a="http://schemas.openxmlformats.org/drawingml/2006/main" xmlns:pic="http://schemas.openxmlformats.org/drawingml/2006/picture">
+            <wp:extent cx="4023360" cy="2646652"/>
+            <wp:docPr id="13" name="Picture 13"/>
+            <wp:cNvGraphicFramePr>
+              <a:graphicFrameLocks noChangeAspect="1"/>
+            </wp:cNvGraphicFramePr>
+            <a:graphic>
+              <a:graphicData uri="http://schemas.openxmlformats.org/drawingml/2006/picture">
+                <pic:pic>
+                  <pic:nvPicPr>
+                    <pic:cNvPr id="0" name="kicad_erc.png"/>
+                    <pic:cNvPicPr/>
+                  </pic:nvPicPr>
+                  <pic:blipFill>
+                    <a:blip r:embed="rId24"/>
+                    <a:stretch>
+                      <a:fillRect/>
+                    </a:stretch>
+                  </pic:blipFill>
+                  <pic:spPr>
+                    <a:xfrm>
+                      <a:off x="0" y="0"/>
+                      <a:ext cx="4023360" cy="2646652"/>
+                    </a:xfrm>
+                    <a:prstGeom prst="rect"/>
+                  </pic:spPr>
+                </pic:pic>
+              </a:graphicData>
+            </a:graphic>
+          </wp:inline>
+        </w:drawing>
+      </w:r>
+    </w:p>
+    <w:p>
+      <w:pPr>
+        <w:spacing w:after="200"/>
+        <w:jc w:val="center"/>
+      </w:pPr>
+      <w:r>
+        <w:rPr>
+          <w:b/>
+          <w:sz w:val="21"/>
+        </w:rPr>
+        <w:t xml:space="preserve">Figure 6.6: </w:t>
+      </w:r>
+      <w:r>
+        <w:rPr>
+          <w:sz w:val="21"/>
+        </w:rPr>
+        <w:t>ERC result — 0 violations, 0 errors and 0 warnings</w:t>
+      </w:r>
+    </w:p>
+    <w:p>
+      <w:pPr>
+        <w:spacing w:after="120"/>
+        <w:jc w:val="both"/>
+      </w:pPr>
+      <w:r>
+        <w:t xml:space="preserve">The final ERC run reports </w:t>
+      </w:r>
+      <w:r>
+        <w:rPr>
+          <w:b/>
+        </w:rPr>
+        <w:t>0 violations, 0 errors and 0 warnings</w:t>
+      </w:r>
+      <w:r>
+        <w:t xml:space="preserve"> (Figure 6.6). Three ERC tests were set to “ignored”. We looked at each one and they are not needed for a board like ours:</w:t>
       </w:r>
     </w:p>
     <w:p>
@@ -14516,10 +14848,10 @@
         <w:rPr>
           <w:b/>
         </w:rPr>
-        <w:t>ERC</w:t>
-      </w:r>
-      <w:r>
-        <w:t xml:space="preserve"> on the schematic, to make sure every pin is connected as intended and every power net has a source.</w:t>
+        <w:t>“Global label only appears once in the schematic.”</w:t>
+      </w:r>
+      <w:r>
+        <w:t xml:space="preserve"> This warning appears when a net label is used on only one wire. For us, some labels (for example VBAT_SENSE) are used only to give a net a readable name. The pins on that net are still joined by wires, so the connection is not affected; the label is there for readability.</w:t>
       </w:r>
     </w:p>
     <w:p>
@@ -14532,10 +14864,10 @@
         <w:rPr>
           <w:b/>
         </w:rPr>
-        <w:t>DRC</w:t>
-      </w:r>
-      <w:r>
-        <w:t xml:space="preserve"> on the layout, to check clearances, unrouted nets and track widths against the rules set for the board.</w:t>
+        <w:t>“Four connection points are joined together.”</w:t>
+      </w:r>
+      <w:r>
+        <w:t xml:space="preserve"> KiCad warns about four-way junctions because a crossing and a junction can look alike on a printed schematic. In our schematic these are deliberate junctions, and each one is marked with a junction dot, so there is no doubt about the connection.</w:t>
       </w:r>
     </w:p>
     <w:p>
@@ -14548,10 +14880,131 @@
         <w:rPr>
           <w:b/>
         </w:rPr>
-        <w:t>Cross-checking the netlist against our connection tables</w:t>
-      </w:r>
-      <w:r>
-        <w:t xml:space="preserve"> — in particular that V+ pads of the driver modules belong to no net, the two 6 V zones are separate, the camera 5 V node is isolated from the logic 5 V, and D0/D1 and VIN are unconnected.</w:t>
+        <w:t>“Assigned footprint doesn't match footprint filters.”</w:t>
+      </w:r>
+      <w:r>
+        <w:t xml:space="preserve"> This happens when a footprint is chosen that is not in the symbol's suggested list. On our board this is intentional: the PCA9685 modules, sensor headers and screw terminals use footprints we chose to match the actual purchased parts, which were checked physically.</w:t>
+      </w:r>
+    </w:p>
+    <w:p>
+      <w:pPr>
+        <w:spacing w:after="120"/>
+        <w:jc w:val="both"/>
+      </w:pPr>
+      <w:r>
+        <w:t>None of these three tests concerns an electrical fault, so leaving them ignored does not hide a real error. Pins that are intentionally unused carry no-connect flags (Section 6.4), which is why ERC reports no unconnected-pin errors.</w:t>
+      </w:r>
+    </w:p>
+    <w:p>
+      <w:pPr>
+        <w:pStyle w:val="Heading3"/>
+      </w:pPr>
+      <w:r>
+        <w:t>6.6.2  Design Rules Check (DRC)</w:t>
+      </w:r>
+    </w:p>
+    <w:p>
+      <w:pPr>
+        <w:keepNext/>
+        <w:spacing w:after="40"/>
+        <w:jc w:val="center"/>
+      </w:pPr>
+      <w:r>
+        <w:drawing>
+          <wp:inline xmlns:a="http://schemas.openxmlformats.org/drawingml/2006/main" xmlns:pic="http://schemas.openxmlformats.org/drawingml/2006/picture">
+            <wp:extent cx="4023360" cy="3330632"/>
+            <wp:docPr id="14" name="Picture 14"/>
+            <wp:cNvGraphicFramePr>
+              <a:graphicFrameLocks noChangeAspect="1"/>
+            </wp:cNvGraphicFramePr>
+            <a:graphic>
+              <a:graphicData uri="http://schemas.openxmlformats.org/drawingml/2006/picture">
+                <pic:pic>
+                  <pic:nvPicPr>
+                    <pic:cNvPr id="0" name="kicad_drc.png"/>
+                    <pic:cNvPicPr/>
+                  </pic:nvPicPr>
+                  <pic:blipFill>
+                    <a:blip r:embed="rId25"/>
+                    <a:stretch>
+                      <a:fillRect/>
+                    </a:stretch>
+                  </pic:blipFill>
+                  <pic:spPr>
+                    <a:xfrm>
+                      <a:off x="0" y="0"/>
+                      <a:ext cx="4023360" cy="3330632"/>
+                    </a:xfrm>
+                    <a:prstGeom prst="rect"/>
+                  </pic:spPr>
+                </pic:pic>
+              </a:graphicData>
+            </a:graphic>
+          </wp:inline>
+        </w:drawing>
+      </w:r>
+    </w:p>
+    <w:p>
+      <w:pPr>
+        <w:spacing w:after="200"/>
+        <w:jc w:val="center"/>
+      </w:pPr>
+      <w:r>
+        <w:rPr>
+          <w:b/>
+          <w:sz w:val="21"/>
+        </w:rPr>
+        <w:t xml:space="preserve">Figure 6.7: </w:t>
+      </w:r>
+      <w:r>
+        <w:rPr>
+          <w:sz w:val="21"/>
+        </w:rPr>
+        <w:t>DRC result — 0 unconnected items; the listed violations are silkscreen clearance</w:t>
+      </w:r>
+    </w:p>
+    <w:p>
+      <w:pPr>
+        <w:spacing w:after="120"/>
+        <w:jc w:val="both"/>
+      </w:pPr>
+      <w:r>
+        <w:t xml:space="preserve">The DRC result is shown in Figure 6.7. The most important number here is </w:t>
+      </w:r>
+      <w:r>
+        <w:rPr>
+          <w:b/>
+        </w:rPr>
+        <w:t>Unconnected Items: 0</w:t>
+      </w:r>
+      <w:r>
+        <w:t xml:space="preserve"> — every net in the schematic is routed on the board, and no connection is missing. The DRC also lists 141 errors and 48 warnings. The errors are of the </w:t>
+      </w:r>
+      <w:r>
+        <w:rPr>
+          <w:b/>
+        </w:rPr>
+        <w:t>silkscreen clearance</w:t>
+      </w:r>
+      <w:r>
+        <w:t xml:space="preserve"> type, for example the outline of capacitor C4 on the front silkscreen layer sitting too close to the reference text of J29. These concern only the printed white markings on the board. They do not change any copper track, pad, clearance between copper or connection, so they do not affect how the board works electrically. We know the connections of this board in detail and checked them against our connection tables, so we treated these markings-related errors as acceptable for this board.</w:t>
+      </w:r>
+    </w:p>
+    <w:p>
+      <w:pPr>
+        <w:spacing w:after="120"/>
+        <w:jc w:val="both"/>
+      </w:pPr>
+      <w:r>
+        <w:t>A practical note: when the board is fabricated, the manufacturer usually clips any silkscreen that overlaps a pad, so some labels may appear slightly trimmed. This is cosmetic only. If time allows before ordering, the overlapping labels can be moved to make the printed markings neater.</w:t>
+      </w:r>
+    </w:p>
+    <w:p>
+      <w:pPr>
+        <w:pStyle w:val="Heading3"/>
+      </w:pPr>
+      <w:r>
+        <w:t>6.6.3  Other Checks</w:t>
       </w:r>
     </w:p>
     <w:p>
@@ -14564,81 +15017,26 @@
         <w:rPr>
           <w:b/>
         </w:rPr>
+        <w:t>Cross-checking the netlist against our connection tables</w:t>
+      </w:r>
+      <w:r>
+        <w:t xml:space="preserve"> — in particular that the V+ pads of the driver modules belong to no net, the two 6 V zones are separate, the camera 5 V node is isolated from the logic 5 V, and D0/D1 and VIN are unconnected.</w:t>
+      </w:r>
+    </w:p>
+    <w:p>
+      <w:pPr>
+        <w:pStyle w:val="ListBullet"/>
+        <w:spacing w:after="60"/>
+        <w:jc w:val="both"/>
+      </w:pPr>
+      <w:r>
+        <w:rPr>
+          <w:b/>
+        </w:rPr>
         <w:t>Footprint checks against the real modules</w:t>
       </w:r>
       <w:r>
         <w:t xml:space="preserve"> that we had purchased, using the physical parts.</w:t>
-      </w:r>
-    </w:p>
-    <w:p>
-      <w:pPr>
-        <w:spacing w:after="120"/>
-        <w:jc w:val="both"/>
-      </w:pPr>
-      <w:r>
-        <w:t>The board was taken to Gerber export only after these checks had been run and the reported problems resolved.</w:t>
-      </w:r>
-    </w:p>
-    <w:tbl>
-      <w:tblPr>
-        <w:jc w:val="center"/>
-        <w:tblLayout w:type="fixed"/>
-        <w:tblLook w:firstColumn="1" w:firstRow="1" w:lastColumn="0" w:lastRow="0" w:noHBand="0" w:noVBand="1" w:val="04A0"/>
-        <w:tblW w:w="8063" w:type="dxa"/>
-        <w:tblLayout w:type="fixed"/>
-      </w:tblPr>
-      <w:tblGrid>
-        <w:gridCol w:w="8063"/>
-      </w:tblGrid>
-      <w:tr>
-        <w:trPr>
-          <w:trHeight w:val="2592" w:hRule="atLeast"/>
-        </w:trPr>
-        <w:tc>
-          <w:tcPr>
-            <w:tcW w:type="dxa" w:w="8064"/>
-            <w:tcBorders>
-              <w:top w:val="dashed" w:sz="8" w:space="0" w:color="808080"/>
-              <w:left w:val="dashed" w:sz="8" w:space="0" w:color="808080"/>
-              <w:bottom w:val="dashed" w:sz="8" w:space="0" w:color="808080"/>
-              <w:right w:val="dashed" w:sz="8" w:space="0" w:color="808080"/>
-            </w:tcBorders>
-            <w:shd w:val="clear" w:color="auto" w:fill="F7F7F7"/>
-            <w:vAlign w:val="center"/>
-          </w:tcPr>
-          <w:p>
-            <w:pPr>
-              <w:jc w:val="center"/>
-            </w:pPr>
-            <w:r>
-              <w:rPr>
-                <w:i/>
-                <w:color w:val="555555"/>
-                <w:sz w:val="21"/>
-              </w:rPr>
-              <w:t>[Insert screenshot of the KiCad DRC report / ERC result here]</w:t>
-            </w:r>
-          </w:p>
-        </w:tc>
-      </w:tr>
-    </w:tbl>
-    <w:p>
-      <w:pPr>
-        <w:spacing w:before="60"/>
-        <w:jc w:val="center"/>
-      </w:pPr>
-      <w:r>
-        <w:rPr>
-          <w:b/>
-          <w:sz w:val="21"/>
-        </w:rPr>
-        <w:t xml:space="preserve">Figure 6.5: </w:t>
-      </w:r>
-      <w:r>
-        <w:rPr>
-          <w:sz w:val="21"/>
-        </w:rPr>
-        <w:t>Design rule check result in KiCad</w:t>
       </w:r>
     </w:p>
     <w:p>
@@ -14720,7 +15118,7 @@
           <w:b/>
           <w:sz w:val="21"/>
         </w:rPr>
-        <w:t xml:space="preserve">Figure 6.6: </w:t>
+        <w:t xml:space="preserve">Figure 6.8: </w:t>
       </w:r>
       <w:r>
         <w:rPr>
@@ -14981,7 +15379,7 @@
               <w:rPr>
                 <w:sz w:val="20"/>
               </w:rPr>
-              <w:t>Completed</w:t>
+              <w:t>Completed — 0 errors, 0 warnings</w:t>
             </w:r>
           </w:p>
         </w:tc>
@@ -15089,7 +15487,7 @@
               <w:rPr>
                 <w:sz w:val="20"/>
               </w:rPr>
-              <w:t>Completed</w:t>
+              <w:t>Completed — 0 unconnected items; silkscreen-only violations</w:t>
             </w:r>
           </w:p>
         </w:tc>
@@ -18367,7 +18765,7 @@
         <w:drawing>
           <wp:inline xmlns:a="http://schemas.openxmlformats.org/drawingml/2006/main" xmlns:pic="http://schemas.openxmlformats.org/drawingml/2006/picture">
             <wp:extent cx="5120640" cy="4871436"/>
-            <wp:docPr id="10" name="Picture 10"/>
+            <wp:docPr id="15" name="Picture 15"/>
             <wp:cNvGraphicFramePr>
               <a:graphicFrameLocks noChangeAspect="1"/>
             </wp:cNvGraphicFramePr>
@@ -18379,7 +18777,7 @@
                     <pic:cNvPicPr/>
                   </pic:nvPicPr>
                   <pic:blipFill>
-                    <a:blip r:embed="rId21"/>
+                    <a:blip r:embed="rId26"/>
                     <a:stretch>
                       <a:fillRect/>
                     </a:stretch>
@@ -18436,7 +18834,7 @@
         <w:drawing>
           <wp:inline xmlns:a="http://schemas.openxmlformats.org/drawingml/2006/main" xmlns:pic="http://schemas.openxmlformats.org/drawingml/2006/picture">
             <wp:extent cx="4206240" cy="3665086"/>
-            <wp:docPr id="11" name="Picture 11"/>
+            <wp:docPr id="16" name="Picture 16"/>
             <wp:cNvGraphicFramePr>
               <a:graphicFrameLocks noChangeAspect="1"/>
             </wp:cNvGraphicFramePr>
@@ -18448,7 +18846,7 @@
                     <pic:cNvPicPr/>
                   </pic:nvPicPr>
                   <pic:blipFill>
-                    <a:blip r:embed="rId22"/>
+                    <a:blip r:embed="rId27"/>
                     <a:stretch>
                       <a:fillRect/>
                     </a:stretch>
@@ -18496,7 +18894,7 @@
         <w:drawing>
           <wp:inline xmlns:a="http://schemas.openxmlformats.org/drawingml/2006/main" xmlns:pic="http://schemas.openxmlformats.org/drawingml/2006/picture">
             <wp:extent cx="5577840" cy="3319082"/>
-            <wp:docPr id="12" name="Picture 12"/>
+            <wp:docPr id="17" name="Picture 17"/>
             <wp:cNvGraphicFramePr>
               <a:graphicFrameLocks noChangeAspect="1"/>
             </wp:cNvGraphicFramePr>
@@ -18508,7 +18906,7 @@
                     <pic:cNvPicPr/>
                   </pic:nvPicPr>
                   <pic:blipFill>
-                    <a:blip r:embed="rId23"/>
+                    <a:blip r:embed="rId28"/>
                     <a:stretch>
                       <a:fillRect/>
                     </a:stretch>
@@ -19869,6 +20267,68 @@
         <w:t>We plan to start from an existing leg model, study it, and adapt it to our link lengths and to the dimensions of our actual servos, rather than design every leg part from zero.</w:t>
       </w:r>
     </w:p>
+    <w:tbl>
+      <w:tblPr>
+        <w:jc w:val="center"/>
+        <w:tblLayout w:type="fixed"/>
+        <w:tblLook w:firstColumn="1" w:firstRow="1" w:lastColumn="0" w:lastRow="0" w:noHBand="0" w:noVBand="1" w:val="04A0"/>
+        <w:tblW w:w="8063" w:type="dxa"/>
+        <w:tblLayout w:type="fixed"/>
+      </w:tblPr>
+      <w:tblGrid>
+        <w:gridCol w:w="8063"/>
+      </w:tblGrid>
+      <w:tr>
+        <w:trPr>
+          <w:trHeight w:val="2304" w:hRule="atLeast"/>
+        </w:trPr>
+        <w:tc>
+          <w:tcPr>
+            <w:tcW w:type="dxa" w:w="8064"/>
+            <w:tcBorders>
+              <w:top w:val="dashed" w:sz="8" w:space="0" w:color="808080"/>
+              <w:left w:val="dashed" w:sz="8" w:space="0" w:color="808080"/>
+              <w:bottom w:val="dashed" w:sz="8" w:space="0" w:color="808080"/>
+              <w:right w:val="dashed" w:sz="8" w:space="0" w:color="808080"/>
+            </w:tcBorders>
+            <w:shd w:val="clear" w:color="auto" w:fill="F7F7F7"/>
+            <w:vAlign w:val="center"/>
+          </w:tcPr>
+          <w:p>
+            <w:pPr>
+              <w:jc w:val="center"/>
+            </w:pPr>
+            <w:r>
+              <w:rPr>
+                <w:i/>
+                <w:color w:val="555555"/>
+                <w:sz w:val="21"/>
+              </w:rPr>
+              <w:t>[The 3D printing phase has not been started yet, so no image is available at this stage. The 3D model of the hexapod will be added here once it is ready.]</w:t>
+            </w:r>
+          </w:p>
+        </w:tc>
+      </w:tr>
+    </w:tbl>
+    <w:p>
+      <w:pPr>
+        <w:spacing w:before="60"/>
+        <w:jc w:val="center"/>
+      </w:pPr>
+      <w:r>
+        <w:rPr>
+          <w:b/>
+          <w:sz w:val="21"/>
+        </w:rPr>
+        <w:t xml:space="preserve">Figure 8.1: </w:t>
+      </w:r>
+      <w:r>
+        <w:rPr>
+          <w:sz w:val="21"/>
+        </w:rPr>
+        <w:t>3D model of the hexapod</w:t>
+      </w:r>
+    </w:p>
     <w:p>
       <w:pPr>
         <w:pStyle w:val="Heading2"/>
@@ -20000,7 +20460,7 @@
         <w:drawing>
           <wp:inline xmlns:a="http://schemas.openxmlformats.org/drawingml/2006/main" xmlns:pic="http://schemas.openxmlformats.org/drawingml/2006/picture">
             <wp:extent cx="5669280" cy="1703905"/>
-            <wp:docPr id="13" name="Picture 13"/>
+            <wp:docPr id="18" name="Picture 18"/>
             <wp:cNvGraphicFramePr>
               <a:graphicFrameLocks noChangeAspect="1"/>
             </wp:cNvGraphicFramePr>
@@ -20012,7 +20472,7 @@
                     <pic:cNvPicPr/>
                   </pic:nvPicPr>
                   <pic:blipFill>
-                    <a:blip r:embed="rId24"/>
+                    <a:blip r:embed="rId29"/>
                     <a:stretch>
                       <a:fillRect/>
                     </a:stretch>
@@ -20041,7 +20501,7 @@
           <w:b/>
           <w:sz w:val="21"/>
         </w:rPr>
-        <w:t xml:space="preserve">Figure 8.1: </w:t>
+        <w:t xml:space="preserve">Figure 8.2: </w:t>
       </w:r>
       <w:r>
         <w:rPr>
@@ -20164,6 +20624,68 @@
       </w:pPr>
       <w:r>
         <w:t>The mechanical layout follows directly from the stability discussion in Chapter 3. The battery and converters (about 245 g) are placed under the body plate, at the lowest point of the robot, which offsets the camera turret on top. The turret is kept light and over the centre of the box, not out on the nose, because a heavy camera on a long arm would raise the centre of mass and push its projection towards the edge of the support triangle during turns. The planned standing height of the body is 70–90 mm off the floor; standing taller looks impressive but uses more battery and makes tipping more likely.</w:t>
+      </w:r>
+    </w:p>
+    <w:tbl>
+      <w:tblPr>
+        <w:jc w:val="center"/>
+        <w:tblLayout w:type="fixed"/>
+        <w:tblLook w:firstColumn="1" w:firstRow="1" w:lastColumn="0" w:lastRow="0" w:noHBand="0" w:noVBand="1" w:val="04A0"/>
+        <w:tblW w:w="8063" w:type="dxa"/>
+        <w:tblLayout w:type="fixed"/>
+      </w:tblPr>
+      <w:tblGrid>
+        <w:gridCol w:w="8063"/>
+      </w:tblGrid>
+      <w:tr>
+        <w:trPr>
+          <w:trHeight w:val="2304" w:hRule="atLeast"/>
+        </w:trPr>
+        <w:tc>
+          <w:tcPr>
+            <w:tcW w:type="dxa" w:w="8064"/>
+            <w:tcBorders>
+              <w:top w:val="dashed" w:sz="8" w:space="0" w:color="808080"/>
+              <w:left w:val="dashed" w:sz="8" w:space="0" w:color="808080"/>
+              <w:bottom w:val="dashed" w:sz="8" w:space="0" w:color="808080"/>
+              <w:right w:val="dashed" w:sz="8" w:space="0" w:color="808080"/>
+            </w:tcBorders>
+            <w:shd w:val="clear" w:color="auto" w:fill="F7F7F7"/>
+            <w:vAlign w:val="center"/>
+          </w:tcPr>
+          <w:p>
+            <w:pPr>
+              <w:jc w:val="center"/>
+            </w:pPr>
+            <w:r>
+              <w:rPr>
+                <w:i/>
+                <w:color w:val="555555"/>
+                <w:sz w:val="21"/>
+              </w:rPr>
+              <w:t>[The 3D printing phase has not been started yet, so no photographs of printed parts are available at this stage. They will be added here after the first parts are printed.]</w:t>
+            </w:r>
+          </w:p>
+        </w:tc>
+      </w:tr>
+    </w:tbl>
+    <w:p>
+      <w:pPr>
+        <w:spacing w:before="60"/>
+        <w:jc w:val="center"/>
+      </w:pPr>
+      <w:r>
+        <w:rPr>
+          <w:b/>
+          <w:sz w:val="21"/>
+        </w:rPr>
+        <w:t xml:space="preserve">Figure 8.3: </w:t>
+      </w:r>
+      <w:r>
+        <w:rPr>
+          <w:sz w:val="21"/>
+        </w:rPr>
+        <w:t>First 3D-printed test parts</w:t>
       </w:r>
     </w:p>
     <w:p>
@@ -24917,7 +25439,7 @@
               <w:rPr>
                 <w:sz w:val="20"/>
               </w:rPr>
-              <w:t>KiCad schematic screenshot</w:t>
+              <w:t>KiCad schematic screenshots</w:t>
             </w:r>
           </w:p>
         </w:tc>
@@ -24951,7 +25473,7 @@
               <w:rPr>
                 <w:sz w:val="20"/>
               </w:rPr>
-              <w:t>Yes</w:t>
+              <w:t>Included (Figs. 6.1, 6.2)</w:t>
             </w:r>
           </w:p>
         </w:tc>
@@ -25004,7 +25526,7 @@
               <w:rPr>
                 <w:sz w:val="20"/>
               </w:rPr>
-              <w:t>Yes</w:t>
+              <w:t>Included (Fig. 6.4)</w:t>
             </w:r>
           </w:p>
         </w:tc>
@@ -25057,7 +25579,7 @@
               <w:rPr>
                 <w:sz w:val="20"/>
               </w:rPr>
-              <w:t>Yes</w:t>
+              <w:t>To be added</w:t>
             </w:r>
           </w:p>
         </w:tc>
@@ -25076,7 +25598,7 @@
               <w:rPr>
                 <w:sz w:val="20"/>
               </w:rPr>
-              <w:t>DRC / ERC result screenshot</w:t>
+              <w:t>ERC and DRC result screenshots</w:t>
             </w:r>
           </w:p>
         </w:tc>
@@ -25110,7 +25632,7 @@
               <w:rPr>
                 <w:sz w:val="20"/>
               </w:rPr>
-              <w:t>Yes</w:t>
+              <w:t>Included (Figs. 6.6, 6.7)</w:t>
             </w:r>
           </w:p>
         </w:tc>
@@ -25163,7 +25685,7 @@
               <w:rPr>
                 <w:sz w:val="20"/>
               </w:rPr>
-              <w:t>Yes</w:t>
+              <w:t>To be added</w:t>
             </w:r>
           </w:p>
         </w:tc>
@@ -25288,7 +25810,7 @@
               <w:rPr>
                 <w:sz w:val="20"/>
               </w:rPr>
-              <w:t>3D model / printed parts</w:t>
+              <w:t>3D model of the hexapod</w:t>
             </w:r>
           </w:p>
         </w:tc>
@@ -25305,7 +25827,7 @@
               <w:rPr>
                 <w:sz w:val="20"/>
               </w:rPr>
-              <w:t>Chapter 8</w:t>
+              <w:t>Section 8.2</w:t>
             </w:r>
           </w:p>
         </w:tc>
@@ -25322,7 +25844,60 @@
               <w:rPr>
                 <w:sz w:val="20"/>
               </w:rPr>
-              <w:t>Not applicable yet — 3D printing not started</w:t>
+              <w:t>Not available — 3D printing not started</w:t>
+            </w:r>
+          </w:p>
+        </w:tc>
+      </w:tr>
+      <w:tr>
+        <w:tc>
+          <w:tcPr>
+            <w:tcW w:type="dxa" w:w="4334"/>
+          </w:tcPr>
+          <w:p>
+            <w:pPr>
+              <w:spacing w:line="240" w:lineRule="auto" w:after="20"/>
+              <w:jc w:val="both"/>
+            </w:pPr>
+            <w:r>
+              <w:rPr>
+                <w:sz w:val="20"/>
+              </w:rPr>
+              <w:t>3D-printed test parts</w:t>
+            </w:r>
+          </w:p>
+        </w:tc>
+        <w:tc>
+          <w:tcPr>
+            <w:tcW w:type="dxa" w:w="2322"/>
+          </w:tcPr>
+          <w:p>
+            <w:pPr>
+              <w:spacing w:line="240" w:lineRule="auto" w:after="20"/>
+              <w:jc w:val="left"/>
+            </w:pPr>
+            <w:r>
+              <w:rPr>
+                <w:sz w:val="20"/>
+              </w:rPr>
+              <w:t>Section 8.5</w:t>
+            </w:r>
+          </w:p>
+        </w:tc>
+        <w:tc>
+          <w:tcPr>
+            <w:tcW w:type="dxa" w:w="2632"/>
+          </w:tcPr>
+          <w:p>
+            <w:pPr>
+              <w:spacing w:line="240" w:lineRule="auto" w:after="20"/>
+              <w:jc w:val="left"/>
+            </w:pPr>
+            <w:r>
+              <w:rPr>
+                <w:sz w:val="20"/>
+              </w:rPr>
+              <w:t>Not available — 3D printing not started</w:t>
             </w:r>
           </w:p>
         </w:tc>

</xml_diff>

<commit_message>
Report: add PCB 3D views and Gerber file list; final cleanup of placeholders
Co-Authored-By: Claude Opus 5.5 <noreply@anthropic.com>
Claude-Session: https://claude.ai/code/session_015VBADvj4gQyLxERYHXi5YL
</commit_message>
<xml_diff>
--- a/hexapod-progress-report/Hexapod_Progress_Report.docx
+++ b/hexapod-progress-report/Hexapod_Progress_Report.docx
@@ -891,7 +891,7 @@
                 <w:b/>
                 <w:sz w:val="22"/>
               </w:rPr>
-              <w:t>[Name of Head of Department]</w:t>
+              <w:t>Name: ____________________</w:t>
             </w:r>
           </w:p>
         </w:tc>
@@ -2383,13 +2383,13 @@
           <w:tab w:pos="9288" w:val="right" w:leader="dot"/>
         </w:tabs>
         <w:spacing w:after="20" w:line="276" w:lineRule="auto"/>
-        <w:ind w:left="432"/>
+        <w:ind w:left="864"/>
       </w:pPr>
       <w:r>
         <w:rPr>
           <w:sz w:val="22"/>
         </w:rPr>
-        <w:t>6.6  Design Verification</w:t>
+        <w:t>6.5.1  3D View of the Board</w:t>
       </w:r>
       <w:r>
         <w:rPr>
@@ -2397,6 +2397,28 @@
         </w:rPr>
         <w:tab/>
         <w:t>27</w:t>
+      </w:r>
+    </w:p>
+    <w:p>
+      <w:pPr>
+        <w:tabs>
+          <w:tab w:pos="9288" w:val="right" w:leader="dot"/>
+        </w:tabs>
+        <w:spacing w:after="20" w:line="276" w:lineRule="auto"/>
+        <w:ind w:left="432"/>
+      </w:pPr>
+      <w:r>
+        <w:rPr>
+          <w:sz w:val="22"/>
+        </w:rPr>
+        <w:t>6.6  Design Verification</w:t>
+      </w:r>
+      <w:r>
+        <w:rPr>
+          <w:sz w:val="22"/>
+        </w:rPr>
+        <w:tab/>
+        <w:t>29</w:t>
       </w:r>
     </w:p>
     <w:p>
@@ -2418,7 +2440,7 @@
           <w:sz w:val="22"/>
         </w:rPr>
         <w:tab/>
-        <w:t>28</w:t>
+        <w:t>29</w:t>
       </w:r>
     </w:p>
     <w:p>
@@ -2440,7 +2462,7 @@
           <w:sz w:val="22"/>
         </w:rPr>
         <w:tab/>
-        <w:t>29</w:t>
+        <w:t>30</w:t>
       </w:r>
     </w:p>
     <w:p>
@@ -2462,7 +2484,7 @@
           <w:sz w:val="22"/>
         </w:rPr>
         <w:tab/>
-        <w:t>29</w:t>
+        <w:t>31</w:t>
       </w:r>
     </w:p>
     <w:p>
@@ -2484,7 +2506,7 @@
           <w:sz w:val="22"/>
         </w:rPr>
         <w:tab/>
-        <w:t>30</w:t>
+        <w:t>31</w:t>
       </w:r>
     </w:p>
     <w:p>
@@ -2506,7 +2528,7 @@
           <w:sz w:val="22"/>
         </w:rPr>
         <w:tab/>
-        <w:t>30</w:t>
+        <w:t>32</w:t>
       </w:r>
     </w:p>
     <w:p>
@@ -2528,7 +2550,7 @@
           <w:sz w:val="22"/>
         </w:rPr>
         <w:tab/>
-        <w:t>31</w:t>
+        <w:t>32</w:t>
       </w:r>
     </w:p>
     <w:p>
@@ -2552,7 +2574,7 @@
           <w:sz w:val="24"/>
         </w:rPr>
         <w:tab/>
-        <w:t>32</w:t>
+        <w:t>34</w:t>
       </w:r>
     </w:p>
     <w:p>
@@ -2574,7 +2596,7 @@
           <w:sz w:val="22"/>
         </w:rPr>
         <w:tab/>
-        <w:t>32</w:t>
+        <w:t>34</w:t>
       </w:r>
     </w:p>
     <w:p>
@@ -2596,7 +2618,7 @@
           <w:sz w:val="22"/>
         </w:rPr>
         <w:tab/>
-        <w:t>32</w:t>
+        <w:t>34</w:t>
       </w:r>
     </w:p>
     <w:p>
@@ -2618,7 +2640,7 @@
           <w:sz w:val="22"/>
         </w:rPr>
         <w:tab/>
-        <w:t>35</w:t>
+        <w:t>37</w:t>
       </w:r>
     </w:p>
     <w:p>
@@ -2640,7 +2662,7 @@
           <w:sz w:val="22"/>
         </w:rPr>
         <w:tab/>
-        <w:t>36</w:t>
+        <w:t>38</w:t>
       </w:r>
     </w:p>
     <w:p>
@@ -2664,7 +2686,7 @@
           <w:sz w:val="24"/>
         </w:rPr>
         <w:tab/>
-        <w:t>37</w:t>
+        <w:t>39</w:t>
       </w:r>
     </w:p>
     <w:p>
@@ -2686,7 +2708,7 @@
           <w:sz w:val="22"/>
         </w:rPr>
         <w:tab/>
-        <w:t>37</w:t>
+        <w:t>39</w:t>
       </w:r>
     </w:p>
     <w:p>
@@ -2708,7 +2730,7 @@
           <w:sz w:val="22"/>
         </w:rPr>
         <w:tab/>
-        <w:t>37</w:t>
+        <w:t>39</w:t>
       </w:r>
     </w:p>
     <w:p>
@@ -2730,7 +2752,7 @@
           <w:sz w:val="22"/>
         </w:rPr>
         <w:tab/>
-        <w:t>38</w:t>
+        <w:t>40</w:t>
       </w:r>
     </w:p>
     <w:p>
@@ -2752,7 +2774,7 @@
           <w:sz w:val="22"/>
         </w:rPr>
         <w:tab/>
-        <w:t>38</w:t>
+        <w:t>40</w:t>
       </w:r>
     </w:p>
     <w:p>
@@ -2774,7 +2796,7 @@
           <w:sz w:val="22"/>
         </w:rPr>
         <w:tab/>
-        <w:t>39</w:t>
+        <w:t>41</w:t>
       </w:r>
     </w:p>
     <w:p>
@@ -2798,7 +2820,7 @@
           <w:sz w:val="24"/>
         </w:rPr>
         <w:tab/>
-        <w:t>40</w:t>
+        <w:t>42</w:t>
       </w:r>
     </w:p>
     <w:p>
@@ -2820,7 +2842,7 @@
           <w:sz w:val="22"/>
         </w:rPr>
         <w:tab/>
-        <w:t>40</w:t>
+        <w:t>42</w:t>
       </w:r>
     </w:p>
     <w:p>
@@ -2842,7 +2864,7 @@
           <w:sz w:val="22"/>
         </w:rPr>
         <w:tab/>
-        <w:t>40</w:t>
+        <w:t>42</w:t>
       </w:r>
     </w:p>
     <w:p>
@@ -2864,7 +2886,7 @@
           <w:sz w:val="22"/>
         </w:rPr>
         <w:tab/>
-        <w:t>41</w:t>
+        <w:t>43</w:t>
       </w:r>
     </w:p>
     <w:p>
@@ -2886,7 +2908,7 @@
           <w:sz w:val="22"/>
         </w:rPr>
         <w:tab/>
-        <w:t>41</w:t>
+        <w:t>43</w:t>
       </w:r>
     </w:p>
     <w:p>
@@ -2910,7 +2932,7 @@
           <w:sz w:val="24"/>
         </w:rPr>
         <w:tab/>
-        <w:t>42</w:t>
+        <w:t>44</w:t>
       </w:r>
     </w:p>
     <w:p>
@@ -2932,7 +2954,7 @@
           <w:sz w:val="22"/>
         </w:rPr>
         <w:tab/>
-        <w:t>42</w:t>
+        <w:t>44</w:t>
       </w:r>
     </w:p>
     <w:p>
@@ -2956,7 +2978,7 @@
           <w:sz w:val="24"/>
         </w:rPr>
         <w:tab/>
-        <w:t>44</w:t>
+        <w:t>46</w:t>
       </w:r>
     </w:p>
     <w:p>
@@ -2978,7 +3000,7 @@
           <w:sz w:val="22"/>
         </w:rPr>
         <w:tab/>
-        <w:t>44</w:t>
+        <w:t>46</w:t>
       </w:r>
     </w:p>
     <w:p>
@@ -3000,7 +3022,7 @@
           <w:sz w:val="22"/>
         </w:rPr>
         <w:tab/>
-        <w:t>44</w:t>
+        <w:t>46</w:t>
       </w:r>
     </w:p>
     <w:p>
@@ -3022,7 +3044,7 @@
           <w:sz w:val="22"/>
         </w:rPr>
         <w:tab/>
-        <w:t>45</w:t>
+        <w:t>47</w:t>
       </w:r>
     </w:p>
     <w:p>
@@ -3046,7 +3068,7 @@
           <w:sz w:val="24"/>
         </w:rPr>
         <w:tab/>
-        <w:t>46</w:t>
+        <w:t>48</w:t>
       </w:r>
     </w:p>
     <w:p>
@@ -3068,7 +3090,7 @@
           <w:sz w:val="22"/>
         </w:rPr>
         <w:tab/>
-        <w:t>46</w:t>
+        <w:t>48</w:t>
       </w:r>
     </w:p>
     <w:p>
@@ -3090,7 +3112,7 @@
           <w:sz w:val="22"/>
         </w:rPr>
         <w:tab/>
-        <w:t>46</w:t>
+        <w:t>48</w:t>
       </w:r>
     </w:p>
     <w:p>
@@ -3112,7 +3134,7 @@
           <w:sz w:val="22"/>
         </w:rPr>
         <w:tab/>
-        <w:t>47</w:t>
+        <w:t>49</w:t>
       </w:r>
     </w:p>
     <w:p>
@@ -3136,7 +3158,7 @@
           <w:sz w:val="24"/>
         </w:rPr>
         <w:tab/>
-        <w:t>48</w:t>
+        <w:t>50</w:t>
       </w:r>
     </w:p>
     <w:p>
@@ -3160,7 +3182,7 @@
           <w:sz w:val="24"/>
         </w:rPr>
         <w:tab/>
-        <w:t>49</w:t>
+        <w:t>51</w:t>
       </w:r>
     </w:p>
     <w:p>
@@ -3184,7 +3206,7 @@
           <w:sz w:val="24"/>
         </w:rPr>
         <w:tab/>
-        <w:t>50</w:t>
+        <w:t>52</w:t>
       </w:r>
     </w:p>
     <w:p>
@@ -3208,31 +3230,7 @@
           <w:sz w:val="24"/>
         </w:rPr>
         <w:tab/>
-        <w:t>51</w:t>
-      </w:r>
-    </w:p>
-    <w:p>
-      <w:pPr>
-        <w:tabs>
-          <w:tab w:pos="9288" w:val="right" w:leader="dot"/>
-        </w:tabs>
-        <w:spacing w:after="20" w:line="276" w:lineRule="auto" w:before="120"/>
-        <w:ind w:left="0"/>
-      </w:pPr>
-      <w:r>
-        <w:rPr>
-          <w:b/>
-          <w:sz w:val="24"/>
-        </w:rPr>
-        <w:t>Appendix B: Evidence to Be Attached</w:t>
-      </w:r>
-      <w:r>
-        <w:rPr>
-          <w:b/>
-          <w:sz w:val="24"/>
-        </w:rPr>
-        <w:tab/>
-        <w:t>52</w:t>
+        <w:t>53</w:t>
       </w:r>
     </w:p>
     <w:p>
@@ -3478,7 +3476,7 @@
         <w:rPr>
           <w:sz w:val="22"/>
         </w:rPr>
-        <w:t>Figure 6.5   3D view of the PCB in KiCad</w:t>
+        <w:t>Figure 6.5   3D view of the PCB in KiCad — top view</w:t>
       </w:r>
       <w:r>
         <w:rPr>
@@ -3500,7 +3498,7 @@
         <w:rPr>
           <w:sz w:val="22"/>
         </w:rPr>
-        <w:t>Figure 6.6   ERC result — 0 violations, 0 errors and 0 warnings</w:t>
+        <w:t>Figure 6.6   3D views of the PCB from both sides</w:t>
       </w:r>
       <w:r>
         <w:rPr>
@@ -3522,14 +3520,14 @@
         <w:rPr>
           <w:sz w:val="22"/>
         </w:rPr>
-        <w:t>Figure 6.7   DRC result — 0 unconnected items; the listed violations are silkscreen clearance</w:t>
+        <w:t>Figure 6.7   Side and edge views of the PCB, showing component heights</w:t>
       </w:r>
       <w:r>
         <w:rPr>
           <w:sz w:val="22"/>
         </w:rPr>
         <w:tab/>
-        <w:t>29</w:t>
+        <w:t>28</w:t>
       </w:r>
     </w:p>
     <w:p>
@@ -3544,14 +3542,14 @@
         <w:rPr>
           <w:sz w:val="22"/>
         </w:rPr>
-        <w:t>Figure 6.8   Gerber files exported from KiCad</w:t>
+        <w:t>Figure 6.8   ERC result — 0 violations, 0 errors and 0 warnings</w:t>
       </w:r>
       <w:r>
         <w:rPr>
           <w:sz w:val="22"/>
         </w:rPr>
         <w:tab/>
-        <w:t>30</w:t>
+        <w:t>29</w:t>
       </w:r>
     </w:p>
     <w:p>
@@ -3566,14 +3564,14 @@
         <w:rPr>
           <w:sz w:val="22"/>
         </w:rPr>
-        <w:t>Figure 7.1   Some of the procured components (photograph taken by the team)</w:t>
+        <w:t>Figure 6.9   DRC result — 0 unconnected items; the listed violations are silkscreen clearance</w:t>
       </w:r>
       <w:r>
         <w:rPr>
           <w:sz w:val="22"/>
         </w:rPr>
         <w:tab/>
-        <w:t>34</w:t>
+        <w:t>30</w:t>
       </w:r>
     </w:p>
     <w:p>
@@ -3588,14 +3586,14 @@
         <w:rPr>
           <w:sz w:val="22"/>
         </w:rPr>
-        <w:t>Figure 7.2   (a) Arduino Uno R3 — main controller; (b) ESP32-WROOM-32 development board — programmer for the ESP32-CAM</w:t>
+        <w:t>Figure 7.1   Some of the procured components (photograph taken by the team)</w:t>
       </w:r>
       <w:r>
         <w:rPr>
           <w:sz w:val="22"/>
         </w:rPr>
         <w:tab/>
-        <w:t>35</w:t>
+        <w:t>36</w:t>
       </w:r>
     </w:p>
     <w:p>
@@ -3610,14 +3608,14 @@
         <w:rPr>
           <w:sz w:val="22"/>
         </w:rPr>
-        <w:t>Figure 7.3   (c) TowerPro MG996R metal-gear servo — leg actuator; (d) PCA9685 16-channel PWM driver</w:t>
+        <w:t>Figure 7.2   (a) Arduino Uno R3 — main controller; (b) ESP32-WROOM-32 development board — programmer for the ESP32-CAM</w:t>
       </w:r>
       <w:r>
         <w:rPr>
           <w:sz w:val="22"/>
         </w:rPr>
         <w:tab/>
-        <w:t>35</w:t>
+        <w:t>37</w:t>
       </w:r>
     </w:p>
     <w:p>
@@ -3632,14 +3630,14 @@
         <w:rPr>
           <w:sz w:val="22"/>
         </w:rPr>
-        <w:t>Figure 8.1   3D model of the hexapod</w:t>
+        <w:t>Figure 7.3   (c) TowerPro MG996R metal-gear servo — leg actuator; (d) PCA9685 16-channel PWM driver</w:t>
       </w:r>
       <w:r>
         <w:rPr>
           <w:sz w:val="22"/>
         </w:rPr>
         <w:tab/>
-        <w:t>38</w:t>
+        <w:t>37</w:t>
       </w:r>
     </w:p>
     <w:p>
@@ -3654,14 +3652,14 @@
         <w:rPr>
           <w:sz w:val="22"/>
         </w:rPr>
-        <w:t>Figure 8.2   Planned 3D printing workflow — each step is checked before the next</w:t>
+        <w:t>Figure 8.1   3D model of the hexapod</w:t>
       </w:r>
       <w:r>
         <w:rPr>
           <w:sz w:val="22"/>
         </w:rPr>
         <w:tab/>
-        <w:t>38</w:t>
+        <w:t>40</w:t>
       </w:r>
     </w:p>
     <w:p>
@@ -3676,25 +3674,14 @@
         <w:rPr>
           <w:sz w:val="22"/>
         </w:rPr>
-        <w:t>Figure 8.3   First 3D-printed test parts</w:t>
+        <w:t>Figure 8.2   Planned 3D printing workflow — each step is checked before the next</w:t>
       </w:r>
       <w:r>
         <w:rPr>
           <w:sz w:val="22"/>
         </w:rPr>
         <w:tab/>
-        <w:t>39</w:t>
-      </w:r>
-    </w:p>
-    <w:p>
-      <w:pPr>
-        <w:pStyle w:val="Heading1"/>
-        <w:pageBreakBefore/>
-        <w:spacing w:after="360"/>
-        <w:jc w:val="center"/>
-      </w:pPr>
-      <w:r>
-        <w:t>LIST OF TABLES</w:t>
+        <w:t>40</w:t>
       </w:r>
     </w:p>
     <w:p>
@@ -3709,14 +3696,25 @@
         <w:rPr>
           <w:sz w:val="22"/>
         </w:rPr>
-        <w:t>Table 2.1   Summary of the reviewed literature and its relevance to our project</w:t>
+        <w:t>Figure 8.3   First 3D-printed test parts</w:t>
       </w:r>
       <w:r>
         <w:rPr>
           <w:sz w:val="22"/>
         </w:rPr>
         <w:tab/>
-        <w:t>5</w:t>
+        <w:t>41</w:t>
+      </w:r>
+    </w:p>
+    <w:p>
+      <w:pPr>
+        <w:pStyle w:val="Heading1"/>
+        <w:pageBreakBefore/>
+        <w:spacing w:after="360"/>
+        <w:jc w:val="center"/>
+      </w:pPr>
+      <w:r>
+        <w:t>LIST OF TABLES</w:t>
       </w:r>
     </w:p>
     <w:p>
@@ -3731,14 +3729,14 @@
         <w:rPr>
           <w:sz w:val="22"/>
         </w:rPr>
-        <w:t>Table 3.1   Comparison between the base paper and our project</w:t>
+        <w:t>Table 2.1   Summary of the reviewed literature and its relevance to our project</w:t>
       </w:r>
       <w:r>
         <w:rPr>
           <w:sz w:val="22"/>
         </w:rPr>
         <w:tab/>
-        <w:t>9</w:t>
+        <w:t>5</w:t>
       </w:r>
     </w:p>
     <w:p>
@@ -3753,14 +3751,14 @@
         <w:rPr>
           <w:sz w:val="22"/>
         </w:rPr>
-        <w:t>Table 4.1   Main subsystems of the planned robot</w:t>
+        <w:t>Table 3.1   Comparison between the base paper and our project</w:t>
       </w:r>
       <w:r>
         <w:rPr>
           <w:sz w:val="22"/>
         </w:rPr>
         <w:tab/>
-        <w:t>11</w:t>
+        <w:t>9</w:t>
       </w:r>
     </w:p>
     <w:p>
@@ -3775,14 +3773,14 @@
         <w:rPr>
           <w:sz w:val="22"/>
         </w:rPr>
-        <w:t>Table 4.2   Major components and their role in the robot</w:t>
+        <w:t>Table 4.1   Main subsystems of the planned robot</w:t>
       </w:r>
       <w:r>
         <w:rPr>
           <w:sz w:val="22"/>
         </w:rPr>
         <w:tab/>
-        <w:t>13</w:t>
+        <w:t>11</w:t>
       </w:r>
     </w:p>
     <w:p>
@@ -3797,14 +3795,14 @@
         <w:rPr>
           <w:sz w:val="22"/>
         </w:rPr>
-        <w:t>Table 4.3   Estimated weight budget of the planned robot (design estimate, not measured)</w:t>
+        <w:t>Table 4.2   Major components and their role in the robot</w:t>
       </w:r>
       <w:r>
         <w:rPr>
           <w:sz w:val="22"/>
         </w:rPr>
         <w:tab/>
-        <w:t>16</w:t>
+        <w:t>13</w:t>
       </w:r>
     </w:p>
     <w:p>
@@ -3819,14 +3817,14 @@
         <w:rPr>
           <w:sz w:val="22"/>
         </w:rPr>
-        <w:t>Table 5.1   Phase-wise methodology</w:t>
+        <w:t>Table 4.3   Estimated weight budget of the planned robot (design estimate, not measured)</w:t>
       </w:r>
       <w:r>
         <w:rPr>
           <w:sz w:val="22"/>
         </w:rPr>
         <w:tab/>
-        <w:t>17</w:t>
+        <w:t>16</w:t>
       </w:r>
     </w:p>
     <w:p>
@@ -3841,14 +3839,14 @@
         <w:rPr>
           <w:sz w:val="22"/>
         </w:rPr>
-        <w:t>Table 5.2   Software tools and their use</w:t>
+        <w:t>Table 5.1   Phase-wise methodology</w:t>
       </w:r>
       <w:r>
         <w:rPr>
           <w:sz w:val="22"/>
         </w:rPr>
         <w:tab/>
-        <w:t>18</w:t>
+        <w:t>17</w:t>
       </w:r>
     </w:p>
     <w:p>
@@ -3863,14 +3861,14 @@
         <w:rPr>
           <w:sz w:val="22"/>
         </w:rPr>
-        <w:t>Table 6.1   Arduino Uno pin allocation on the shield</w:t>
+        <w:t>Table 5.2   Software tools and their use</w:t>
       </w:r>
       <w:r>
         <w:rPr>
           <w:sz w:val="22"/>
         </w:rPr>
         <w:tab/>
-        <w:t>22</w:t>
+        <w:t>18</w:t>
       </w:r>
     </w:p>
     <w:p>
@@ -3885,14 +3883,14 @@
         <w:rPr>
           <w:sz w:val="22"/>
         </w:rPr>
-        <w:t>Table 6.2   Servo socket allocation</w:t>
+        <w:t>Table 6.1   Arduino Uno pin allocation on the shield</w:t>
       </w:r>
       <w:r>
         <w:rPr>
           <w:sz w:val="22"/>
         </w:rPr>
         <w:tab/>
-        <w:t>23</w:t>
+        <w:t>22</w:t>
       </w:r>
     </w:p>
     <w:p>
@@ -3907,14 +3905,14 @@
         <w:rPr>
           <w:sz w:val="22"/>
         </w:rPr>
-        <w:t>Table 6.3   ESP32-CAM connector (J25)</w:t>
+        <w:t>Table 6.2   Servo socket allocation</w:t>
       </w:r>
       <w:r>
         <w:rPr>
           <w:sz w:val="22"/>
         </w:rPr>
         <w:tab/>
-        <w:t>24</w:t>
+        <w:t>23</w:t>
       </w:r>
     </w:p>
     <w:p>
@@ -3929,7 +3927,7 @@
         <w:rPr>
           <w:sz w:val="22"/>
         </w:rPr>
-        <w:t>Table 6.4   Power input terminals on the PCB</w:t>
+        <w:t>Table 6.3   ESP32-CAM connector (J25)</w:t>
       </w:r>
       <w:r>
         <w:rPr>
@@ -3951,14 +3949,14 @@
         <w:rPr>
           <w:sz w:val="22"/>
         </w:rPr>
-        <w:t>Table 6.5   PCB design data (to be filled in from the final KiCad project)</w:t>
+        <w:t>Table 6.4   Power input terminals on the PCB</w:t>
       </w:r>
       <w:r>
         <w:rPr>
           <w:sz w:val="22"/>
         </w:rPr>
         <w:tab/>
-        <w:t>27</w:t>
+        <w:t>24</w:t>
       </w:r>
     </w:p>
     <w:p>
@@ -3973,14 +3971,14 @@
         <w:rPr>
           <w:sz w:val="22"/>
         </w:rPr>
-        <w:t>Table 6.6   PCB milestone status</w:t>
+        <w:t>Table 6.5   PCB design data</w:t>
       </w:r>
       <w:r>
         <w:rPr>
           <w:sz w:val="22"/>
         </w:rPr>
         <w:tab/>
-        <w:t>30</w:t>
+        <w:t>29</w:t>
       </w:r>
     </w:p>
     <w:p>
@@ -3995,14 +3993,14 @@
         <w:rPr>
           <w:sz w:val="22"/>
         </w:rPr>
-        <w:t>Table 7.1   Component procurement status</w:t>
+        <w:t>Table 6.6   Fabrication files exported from KiCad</w:t>
       </w:r>
       <w:r>
         <w:rPr>
           <w:sz w:val="22"/>
         </w:rPr>
         <w:tab/>
-        <w:t>32</w:t>
+        <w:t>31</w:t>
       </w:r>
     </w:p>
     <w:p>
@@ -4017,14 +4015,14 @@
         <w:rPr>
           <w:sz w:val="22"/>
         </w:rPr>
-        <w:t>Table 7.2   Estimated cost of purchased components (from the build plan)</w:t>
+        <w:t>Table 6.7   PCB milestone status</w:t>
       </w:r>
       <w:r>
         <w:rPr>
           <w:sz w:val="22"/>
         </w:rPr>
         <w:tab/>
-        <w:t>36</w:t>
+        <w:t>32</w:t>
       </w:r>
     </w:p>
     <w:p>
@@ -4039,14 +4037,14 @@
         <w:rPr>
           <w:sz w:val="22"/>
         </w:rPr>
-        <w:t>Table 8.1   Planned 3D-printed parts</w:t>
+        <w:t>Table 7.1   Component procurement status</w:t>
       </w:r>
       <w:r>
         <w:rPr>
           <w:sz w:val="22"/>
         </w:rPr>
         <w:tab/>
-        <w:t>37</w:t>
+        <w:t>34</w:t>
       </w:r>
     </w:p>
     <w:p>
@@ -4061,14 +4059,14 @@
         <w:rPr>
           <w:sz w:val="22"/>
         </w:rPr>
-        <w:t>Table 9.1   Current project progress</w:t>
+        <w:t>Table 7.2   Estimated cost of purchased components (from the build plan)</w:t>
       </w:r>
       <w:r>
         <w:rPr>
           <w:sz w:val="22"/>
         </w:rPr>
         <w:tab/>
-        <w:t>40</w:t>
+        <w:t>38</w:t>
       </w:r>
     </w:p>
     <w:p>
@@ -4083,14 +4081,14 @@
         <w:rPr>
           <w:sz w:val="22"/>
         </w:rPr>
-        <w:t>Table 10.1   Key engineering challenges and how the design addresses them</w:t>
+        <w:t>Table 8.1   Planned 3D-printed parts</w:t>
       </w:r>
       <w:r>
         <w:rPr>
           <w:sz w:val="22"/>
         </w:rPr>
         <w:tab/>
-        <w:t>42</w:t>
+        <w:t>39</w:t>
       </w:r>
     </w:p>
     <w:p>
@@ -4105,14 +4103,14 @@
         <w:rPr>
           <w:sz w:val="22"/>
         </w:rPr>
-        <w:t>Table 12.1   Tentative plan of action</w:t>
+        <w:t>Table 9.1   Current project progress</w:t>
       </w:r>
       <w:r>
         <w:rPr>
           <w:sz w:val="22"/>
         </w:rPr>
         <w:tab/>
-        <w:t>46</w:t>
+        <w:t>42</w:t>
       </w:r>
     </w:p>
     <w:p>
@@ -4127,14 +4125,14 @@
         <w:rPr>
           <w:sz w:val="22"/>
         </w:rPr>
-        <w:t>Table A.1   Planned I²C devices</w:t>
+        <w:t>Table 10.1   Key engineering challenges and how the design addresses them</w:t>
       </w:r>
       <w:r>
         <w:rPr>
           <w:sz w:val="22"/>
         </w:rPr>
         <w:tab/>
-        <w:t>51</w:t>
+        <w:t>44</w:t>
       </w:r>
     </w:p>
     <w:p>
@@ -4149,14 +4147,14 @@
         <w:rPr>
           <w:sz w:val="22"/>
         </w:rPr>
-        <w:t>Table A.2   Planned servo channel map</w:t>
+        <w:t>Table 12.1   Tentative plan of action</w:t>
       </w:r>
       <w:r>
         <w:rPr>
           <w:sz w:val="22"/>
         </w:rPr>
         <w:tab/>
-        <w:t>51</w:t>
+        <w:t>48</w:t>
       </w:r>
     </w:p>
     <w:p>
@@ -4171,14 +4169,14 @@
         <w:rPr>
           <w:sz w:val="22"/>
         </w:rPr>
-        <w:t>Table A.3   Planned firmware limits</w:t>
+        <w:t>Table A.1   Planned I²C devices</w:t>
       </w:r>
       <w:r>
         <w:rPr>
           <w:sz w:val="22"/>
         </w:rPr>
         <w:tab/>
-        <w:t>51</w:t>
+        <w:t>53</w:t>
       </w:r>
     </w:p>
     <w:p>
@@ -4193,14 +4191,36 @@
         <w:rPr>
           <w:sz w:val="22"/>
         </w:rPr>
-        <w:t>Table A.4   Checklist of figures to be supplied by the team</w:t>
+        <w:t>Table A.2   Planned servo channel map</w:t>
       </w:r>
       <w:r>
         <w:rPr>
           <w:sz w:val="22"/>
         </w:rPr>
         <w:tab/>
-        <w:t>52</w:t>
+        <w:t>53</w:t>
+      </w:r>
+    </w:p>
+    <w:p>
+      <w:pPr>
+        <w:tabs>
+          <w:tab w:pos="9288" w:val="right" w:leader="dot"/>
+        </w:tabs>
+        <w:spacing w:after="20" w:line="276" w:lineRule="auto"/>
+        <w:ind w:left="432"/>
+      </w:pPr>
+      <w:r>
+        <w:rPr>
+          <w:sz w:val="22"/>
+        </w:rPr>
+        <w:t>Table A.3   Planned firmware limits</w:t>
+      </w:r>
+      <w:r>
+        <w:rPr>
+          <w:sz w:val="22"/>
+        </w:rPr>
+        <w:tab/>
+        <w:t>53</w:t>
       </w:r>
     </w:p>
     <w:p>
@@ -5718,7 +5738,7 @@
           <w:p>
             <w:pPr>
               <w:spacing w:line="240" w:lineRule="auto" w:after="20"/>
-              <w:jc w:val="both"/>
+              <w:jc w:val="left"/>
             </w:pPr>
             <w:r>
               <w:rPr>
@@ -5735,7 +5755,7 @@
           <w:p>
             <w:pPr>
               <w:spacing w:line="240" w:lineRule="auto" w:after="20"/>
-              <w:jc w:val="both"/>
+              <w:jc w:val="left"/>
             </w:pPr>
             <w:r>
               <w:rPr>
@@ -5788,7 +5808,7 @@
           <w:p>
             <w:pPr>
               <w:spacing w:line="240" w:lineRule="auto" w:after="20"/>
-              <w:jc w:val="both"/>
+              <w:jc w:val="left"/>
             </w:pPr>
             <w:r>
               <w:rPr>
@@ -5805,7 +5825,7 @@
           <w:p>
             <w:pPr>
               <w:spacing w:line="240" w:lineRule="auto" w:after="20"/>
-              <w:jc w:val="both"/>
+              <w:jc w:val="left"/>
             </w:pPr>
             <w:r>
               <w:rPr>
@@ -5858,7 +5878,7 @@
           <w:p>
             <w:pPr>
               <w:spacing w:line="240" w:lineRule="auto" w:after="20"/>
-              <w:jc w:val="both"/>
+              <w:jc w:val="left"/>
             </w:pPr>
             <w:r>
               <w:rPr>
@@ -5875,7 +5895,7 @@
           <w:p>
             <w:pPr>
               <w:spacing w:line="240" w:lineRule="auto" w:after="20"/>
-              <w:jc w:val="both"/>
+              <w:jc w:val="left"/>
             </w:pPr>
             <w:r>
               <w:rPr>
@@ -5928,7 +5948,7 @@
           <w:p>
             <w:pPr>
               <w:spacing w:line="240" w:lineRule="auto" w:after="20"/>
-              <w:jc w:val="both"/>
+              <w:jc w:val="left"/>
             </w:pPr>
             <w:r>
               <w:rPr>
@@ -5945,7 +5965,7 @@
           <w:p>
             <w:pPr>
               <w:spacing w:line="240" w:lineRule="auto" w:after="20"/>
-              <w:jc w:val="both"/>
+              <w:jc w:val="left"/>
             </w:pPr>
             <w:r>
               <w:rPr>
@@ -5998,7 +6018,7 @@
           <w:p>
             <w:pPr>
               <w:spacing w:line="240" w:lineRule="auto" w:after="20"/>
-              <w:jc w:val="both"/>
+              <w:jc w:val="left"/>
             </w:pPr>
             <w:r>
               <w:rPr>
@@ -6015,7 +6035,7 @@
           <w:p>
             <w:pPr>
               <w:spacing w:line="240" w:lineRule="auto" w:after="20"/>
-              <w:jc w:val="both"/>
+              <w:jc w:val="left"/>
             </w:pPr>
             <w:r>
               <w:rPr>
@@ -6068,7 +6088,7 @@
           <w:p>
             <w:pPr>
               <w:spacing w:line="240" w:lineRule="auto" w:after="20"/>
-              <w:jc w:val="both"/>
+              <w:jc w:val="left"/>
             </w:pPr>
             <w:r>
               <w:rPr>
@@ -6085,7 +6105,7 @@
           <w:p>
             <w:pPr>
               <w:spacing w:line="240" w:lineRule="auto" w:after="20"/>
-              <w:jc w:val="both"/>
+              <w:jc w:val="left"/>
             </w:pPr>
             <w:r>
               <w:rPr>
@@ -6138,7 +6158,7 @@
           <w:p>
             <w:pPr>
               <w:spacing w:line="240" w:lineRule="auto" w:after="20"/>
-              <w:jc w:val="both"/>
+              <w:jc w:val="left"/>
             </w:pPr>
             <w:r>
               <w:rPr>
@@ -6155,7 +6175,7 @@
           <w:p>
             <w:pPr>
               <w:spacing w:line="240" w:lineRule="auto" w:after="20"/>
-              <w:jc w:val="both"/>
+              <w:jc w:val="left"/>
             </w:pPr>
             <w:r>
               <w:rPr>
@@ -6208,7 +6228,7 @@
           <w:p>
             <w:pPr>
               <w:spacing w:line="240" w:lineRule="auto" w:after="20"/>
-              <w:jc w:val="both"/>
+              <w:jc w:val="left"/>
             </w:pPr>
             <w:r>
               <w:rPr>
@@ -6225,7 +6245,7 @@
           <w:p>
             <w:pPr>
               <w:spacing w:line="240" w:lineRule="auto" w:after="20"/>
-              <w:jc w:val="both"/>
+              <w:jc w:val="left"/>
             </w:pPr>
             <w:r>
               <w:rPr>
@@ -6278,7 +6298,7 @@
           <w:p>
             <w:pPr>
               <w:spacing w:line="240" w:lineRule="auto" w:after="20"/>
-              <w:jc w:val="both"/>
+              <w:jc w:val="left"/>
             </w:pPr>
             <w:r>
               <w:rPr>
@@ -6295,7 +6315,7 @@
           <w:p>
             <w:pPr>
               <w:spacing w:line="240" w:lineRule="auto" w:after="20"/>
-              <w:jc w:val="both"/>
+              <w:jc w:val="left"/>
             </w:pPr>
             <w:r>
               <w:rPr>
@@ -6348,7 +6368,7 @@
           <w:p>
             <w:pPr>
               <w:spacing w:line="240" w:lineRule="auto" w:after="20"/>
-              <w:jc w:val="both"/>
+              <w:jc w:val="left"/>
             </w:pPr>
             <w:r>
               <w:rPr>
@@ -6365,7 +6385,7 @@
           <w:p>
             <w:pPr>
               <w:spacing w:line="240" w:lineRule="auto" w:after="20"/>
-              <w:jc w:val="both"/>
+              <w:jc w:val="left"/>
             </w:pPr>
             <w:r>
               <w:rPr>
@@ -6969,7 +6989,7 @@
           <w:p>
             <w:pPr>
               <w:spacing w:line="240" w:lineRule="auto" w:after="20"/>
-              <w:jc w:val="both"/>
+              <w:jc w:val="left"/>
             </w:pPr>
             <w:r>
               <w:rPr>
@@ -7023,7 +7043,7 @@
           <w:p>
             <w:pPr>
               <w:spacing w:line="240" w:lineRule="auto" w:after="20"/>
-              <w:jc w:val="both"/>
+              <w:jc w:val="left"/>
             </w:pPr>
             <w:r>
               <w:rPr>
@@ -7077,7 +7097,7 @@
           <w:p>
             <w:pPr>
               <w:spacing w:line="240" w:lineRule="auto" w:after="20"/>
-              <w:jc w:val="both"/>
+              <w:jc w:val="left"/>
             </w:pPr>
             <w:r>
               <w:rPr>
@@ -7131,7 +7151,7 @@
           <w:p>
             <w:pPr>
               <w:spacing w:line="240" w:lineRule="auto" w:after="20"/>
-              <w:jc w:val="both"/>
+              <w:jc w:val="left"/>
             </w:pPr>
             <w:r>
               <w:rPr>
@@ -7185,7 +7205,7 @@
           <w:p>
             <w:pPr>
               <w:spacing w:line="240" w:lineRule="auto" w:after="20"/>
-              <w:jc w:val="both"/>
+              <w:jc w:val="left"/>
             </w:pPr>
             <w:r>
               <w:rPr>
@@ -7239,7 +7259,7 @@
           <w:p>
             <w:pPr>
               <w:spacing w:line="240" w:lineRule="auto" w:after="20"/>
-              <w:jc w:val="both"/>
+              <w:jc w:val="left"/>
             </w:pPr>
             <w:r>
               <w:rPr>
@@ -7293,7 +7313,7 @@
           <w:p>
             <w:pPr>
               <w:spacing w:line="240" w:lineRule="auto" w:after="20"/>
-              <w:jc w:val="both"/>
+              <w:jc w:val="left"/>
             </w:pPr>
             <w:r>
               <w:rPr>
@@ -7347,7 +7367,7 @@
           <w:p>
             <w:pPr>
               <w:spacing w:line="240" w:lineRule="auto" w:after="20"/>
-              <w:jc w:val="both"/>
+              <w:jc w:val="left"/>
             </w:pPr>
             <w:r>
               <w:rPr>
@@ -7401,7 +7421,7 @@
           <w:p>
             <w:pPr>
               <w:spacing w:line="240" w:lineRule="auto" w:after="20"/>
-              <w:jc w:val="both"/>
+              <w:jc w:val="left"/>
             </w:pPr>
             <w:r>
               <w:rPr>
@@ -8362,7 +8382,7 @@
           <w:p>
             <w:pPr>
               <w:spacing w:line="240" w:lineRule="auto" w:after="20"/>
-              <w:jc w:val="both"/>
+              <w:jc w:val="left"/>
             </w:pPr>
             <w:r>
               <w:rPr>
@@ -8415,7 +8435,7 @@
           <w:p>
             <w:pPr>
               <w:spacing w:line="240" w:lineRule="auto" w:after="20"/>
-              <w:jc w:val="both"/>
+              <w:jc w:val="left"/>
             </w:pPr>
             <w:r>
               <w:rPr>
@@ -8468,7 +8488,7 @@
           <w:p>
             <w:pPr>
               <w:spacing w:line="240" w:lineRule="auto" w:after="20"/>
-              <w:jc w:val="both"/>
+              <w:jc w:val="left"/>
             </w:pPr>
             <w:r>
               <w:rPr>
@@ -8521,7 +8541,7 @@
           <w:p>
             <w:pPr>
               <w:spacing w:line="240" w:lineRule="auto" w:after="20"/>
-              <w:jc w:val="both"/>
+              <w:jc w:val="left"/>
             </w:pPr>
             <w:r>
               <w:rPr>
@@ -8574,7 +8594,7 @@
           <w:p>
             <w:pPr>
               <w:spacing w:line="240" w:lineRule="auto" w:after="20"/>
-              <w:jc w:val="both"/>
+              <w:jc w:val="left"/>
             </w:pPr>
             <w:r>
               <w:rPr>
@@ -8627,7 +8647,7 @@
           <w:p>
             <w:pPr>
               <w:spacing w:line="240" w:lineRule="auto" w:after="20"/>
-              <w:jc w:val="both"/>
+              <w:jc w:val="left"/>
             </w:pPr>
             <w:r>
               <w:rPr>
@@ -8680,7 +8700,7 @@
           <w:p>
             <w:pPr>
               <w:spacing w:line="240" w:lineRule="auto" w:after="20"/>
-              <w:jc w:val="both"/>
+              <w:jc w:val="left"/>
             </w:pPr>
             <w:r>
               <w:rPr>
@@ -8733,7 +8753,7 @@
           <w:p>
             <w:pPr>
               <w:spacing w:line="240" w:lineRule="auto" w:after="20"/>
-              <w:jc w:val="both"/>
+              <w:jc w:val="left"/>
             </w:pPr>
             <w:r>
               <w:rPr>
@@ -8786,7 +8806,7 @@
           <w:p>
             <w:pPr>
               <w:spacing w:line="240" w:lineRule="auto" w:after="20"/>
-              <w:jc w:val="both"/>
+              <w:jc w:val="left"/>
             </w:pPr>
             <w:r>
               <w:rPr>
@@ -8839,7 +8859,7 @@
           <w:p>
             <w:pPr>
               <w:spacing w:line="240" w:lineRule="auto" w:after="20"/>
-              <w:jc w:val="both"/>
+              <w:jc w:val="left"/>
             </w:pPr>
             <w:r>
               <w:rPr>
@@ -8892,7 +8912,7 @@
           <w:p>
             <w:pPr>
               <w:spacing w:line="240" w:lineRule="auto" w:after="20"/>
-              <w:jc w:val="both"/>
+              <w:jc w:val="left"/>
             </w:pPr>
             <w:r>
               <w:rPr>
@@ -8945,7 +8965,7 @@
           <w:p>
             <w:pPr>
               <w:spacing w:line="240" w:lineRule="auto" w:after="20"/>
-              <w:jc w:val="both"/>
+              <w:jc w:val="left"/>
             </w:pPr>
             <w:r>
               <w:rPr>
@@ -9409,7 +9429,7 @@
           <w:p>
             <w:pPr>
               <w:spacing w:line="240" w:lineRule="auto" w:after="20"/>
-              <w:jc w:val="both"/>
+              <w:jc w:val="left"/>
             </w:pPr>
             <w:r>
               <w:rPr>
@@ -9462,7 +9482,7 @@
           <w:p>
             <w:pPr>
               <w:spacing w:line="240" w:lineRule="auto" w:after="20"/>
-              <w:jc w:val="both"/>
+              <w:jc w:val="left"/>
             </w:pPr>
             <w:r>
               <w:rPr>
@@ -9515,7 +9535,7 @@
           <w:p>
             <w:pPr>
               <w:spacing w:line="240" w:lineRule="auto" w:after="20"/>
-              <w:jc w:val="both"/>
+              <w:jc w:val="left"/>
             </w:pPr>
             <w:r>
               <w:rPr>
@@ -9568,7 +9588,7 @@
           <w:p>
             <w:pPr>
               <w:spacing w:line="240" w:lineRule="auto" w:after="20"/>
-              <w:jc w:val="both"/>
+              <w:jc w:val="left"/>
             </w:pPr>
             <w:r>
               <w:rPr>
@@ -9621,7 +9641,7 @@
           <w:p>
             <w:pPr>
               <w:spacing w:line="240" w:lineRule="auto" w:after="20"/>
-              <w:jc w:val="both"/>
+              <w:jc w:val="left"/>
             </w:pPr>
             <w:r>
               <w:rPr>
@@ -9674,7 +9694,7 @@
           <w:p>
             <w:pPr>
               <w:spacing w:line="240" w:lineRule="auto" w:after="20"/>
-              <w:jc w:val="both"/>
+              <w:jc w:val="left"/>
             </w:pPr>
             <w:r>
               <w:rPr>
@@ -9727,7 +9747,7 @@
           <w:p>
             <w:pPr>
               <w:spacing w:line="240" w:lineRule="auto" w:after="20"/>
-              <w:jc w:val="both"/>
+              <w:jc w:val="left"/>
             </w:pPr>
             <w:r>
               <w:rPr>
@@ -9780,7 +9800,7 @@
           <w:p>
             <w:pPr>
               <w:spacing w:line="240" w:lineRule="auto" w:after="20"/>
-              <w:jc w:val="both"/>
+              <w:jc w:val="left"/>
             </w:pPr>
             <w:r>
               <w:rPr>
@@ -9835,7 +9855,7 @@
           <w:p>
             <w:pPr>
               <w:spacing w:line="240" w:lineRule="auto" w:after="20"/>
-              <w:jc w:val="both"/>
+              <w:jc w:val="left"/>
             </w:pPr>
             <w:r>
               <w:rPr>
@@ -10762,7 +10782,7 @@
           <w:p>
             <w:pPr>
               <w:spacing w:line="240" w:lineRule="auto" w:after="20"/>
-              <w:jc w:val="both"/>
+              <w:jc w:val="left"/>
             </w:pPr>
             <w:r>
               <w:rPr>
@@ -10798,7 +10818,7 @@
           <w:p>
             <w:pPr>
               <w:spacing w:line="240" w:lineRule="auto" w:after="20"/>
-              <w:jc w:val="both"/>
+              <w:jc w:val="left"/>
             </w:pPr>
             <w:r>
               <w:rPr>
@@ -10834,7 +10854,7 @@
           <w:p>
             <w:pPr>
               <w:spacing w:line="240" w:lineRule="auto" w:after="20"/>
-              <w:jc w:val="both"/>
+              <w:jc w:val="left"/>
             </w:pPr>
             <w:r>
               <w:rPr>
@@ -10870,7 +10890,7 @@
           <w:p>
             <w:pPr>
               <w:spacing w:line="240" w:lineRule="auto" w:after="20"/>
-              <w:jc w:val="both"/>
+              <w:jc w:val="left"/>
             </w:pPr>
             <w:r>
               <w:rPr>
@@ -10906,7 +10926,7 @@
           <w:p>
             <w:pPr>
               <w:spacing w:line="240" w:lineRule="auto" w:after="20"/>
-              <w:jc w:val="both"/>
+              <w:jc w:val="left"/>
             </w:pPr>
             <w:r>
               <w:rPr>
@@ -11653,7 +11673,7 @@
           <w:p>
             <w:pPr>
               <w:spacing w:line="240" w:lineRule="auto" w:after="20"/>
-              <w:jc w:val="both"/>
+              <w:jc w:val="left"/>
             </w:pPr>
             <w:r>
               <w:rPr>
@@ -11706,7 +11726,7 @@
           <w:p>
             <w:pPr>
               <w:spacing w:line="240" w:lineRule="auto" w:after="20"/>
-              <w:jc w:val="both"/>
+              <w:jc w:val="left"/>
             </w:pPr>
             <w:r>
               <w:rPr>
@@ -11759,7 +11779,7 @@
           <w:p>
             <w:pPr>
               <w:spacing w:line="240" w:lineRule="auto" w:after="20"/>
-              <w:jc w:val="both"/>
+              <w:jc w:val="left"/>
             </w:pPr>
             <w:r>
               <w:rPr>
@@ -11812,7 +11832,7 @@
           <w:p>
             <w:pPr>
               <w:spacing w:line="240" w:lineRule="auto" w:after="20"/>
-              <w:jc w:val="both"/>
+              <w:jc w:val="left"/>
             </w:pPr>
             <w:r>
               <w:rPr>
@@ -11865,7 +11885,7 @@
           <w:p>
             <w:pPr>
               <w:spacing w:line="240" w:lineRule="auto" w:after="20"/>
-              <w:jc w:val="both"/>
+              <w:jc w:val="left"/>
             </w:pPr>
             <w:r>
               <w:rPr>
@@ -11918,7 +11938,7 @@
           <w:p>
             <w:pPr>
               <w:spacing w:line="240" w:lineRule="auto" w:after="20"/>
-              <w:jc w:val="both"/>
+              <w:jc w:val="left"/>
             </w:pPr>
             <w:r>
               <w:rPr>
@@ -11971,7 +11991,7 @@
           <w:p>
             <w:pPr>
               <w:spacing w:line="240" w:lineRule="auto" w:after="20"/>
-              <w:jc w:val="both"/>
+              <w:jc w:val="left"/>
             </w:pPr>
             <w:r>
               <w:rPr>
@@ -12024,7 +12044,7 @@
           <w:p>
             <w:pPr>
               <w:spacing w:line="240" w:lineRule="auto" w:after="20"/>
-              <w:jc w:val="both"/>
+              <w:jc w:val="left"/>
             </w:pPr>
             <w:r>
               <w:rPr>
@@ -12077,7 +12097,7 @@
           <w:p>
             <w:pPr>
               <w:spacing w:line="240" w:lineRule="auto" w:after="20"/>
-              <w:jc w:val="both"/>
+              <w:jc w:val="left"/>
             </w:pPr>
             <w:r>
               <w:rPr>
@@ -12130,7 +12150,7 @@
           <w:p>
             <w:pPr>
               <w:spacing w:line="240" w:lineRule="auto" w:after="20"/>
-              <w:jc w:val="both"/>
+              <w:jc w:val="left"/>
             </w:pPr>
             <w:r>
               <w:rPr>
@@ -12183,7 +12203,7 @@
           <w:p>
             <w:pPr>
               <w:spacing w:line="240" w:lineRule="auto" w:after="20"/>
-              <w:jc w:val="both"/>
+              <w:jc w:val="left"/>
             </w:pPr>
             <w:r>
               <w:rPr>
@@ -12236,7 +12256,7 @@
           <w:p>
             <w:pPr>
               <w:spacing w:line="240" w:lineRule="auto" w:after="20"/>
-              <w:jc w:val="both"/>
+              <w:jc w:val="left"/>
             </w:pPr>
             <w:r>
               <w:rPr>
@@ -12289,7 +12309,7 @@
           <w:p>
             <w:pPr>
               <w:spacing w:line="240" w:lineRule="auto" w:after="20"/>
-              <w:jc w:val="both"/>
+              <w:jc w:val="left"/>
             </w:pPr>
             <w:r>
               <w:rPr>
@@ -12342,7 +12362,7 @@
           <w:p>
             <w:pPr>
               <w:spacing w:line="240" w:lineRule="auto" w:after="20"/>
-              <w:jc w:val="both"/>
+              <w:jc w:val="left"/>
             </w:pPr>
             <w:r>
               <w:rPr>
@@ -12395,7 +12415,7 @@
           <w:p>
             <w:pPr>
               <w:spacing w:line="240" w:lineRule="auto" w:after="20"/>
-              <w:jc w:val="both"/>
+              <w:jc w:val="left"/>
             </w:pPr>
             <w:r>
               <w:rPr>
@@ -14368,52 +14388,67 @@
         <w:t>In the finished layout (Figure 6.4), the right-side leg sockets and the two camera-servo sockets run along the top edge and the left-side leg sockets along the bottom edge. The four converter terminals J26–J29 sit on the right edge. The wide +6V_A and +6V_B copper areas run from terminals J26 and J27 to their socket rows, with the 2200 µF capacitors C1 and C2 placed on these areas. The two PCA9685 module footprints occupy the middle of the board, and the four corner holes H1–H4 are for mounting. The blue area is the ground pour on the back copper layer.</w:t>
       </w:r>
     </w:p>
-    <w:tbl>
-      <w:tblPr>
+    <w:p>
+      <w:pPr>
+        <w:pStyle w:val="Heading3"/>
+      </w:pPr>
+      <w:r>
+        <w:t>6.5.1  3D View of the Board</w:t>
+      </w:r>
+    </w:p>
+    <w:p>
+      <w:pPr>
+        <w:spacing w:after="120"/>
+        <w:jc w:val="both"/>
+      </w:pPr>
+      <w:r>
+        <w:t>KiCad's 3D viewer was used to check the assembled board before exporting the fabrication files. It shows every through-hole part at its real size, which helps catch problems that a flat layout hides — parts that are too close together, connectors facing the wrong way, or components that are too tall for the space they will sit in.</w:t>
+      </w:r>
+    </w:p>
+    <w:p>
+      <w:pPr>
+        <w:keepNext/>
+        <w:spacing w:after="40"/>
         <w:jc w:val="center"/>
-        <w:tblLayout w:type="fixed"/>
-        <w:tblLook w:firstColumn="1" w:firstRow="1" w:lastColumn="0" w:lastRow="0" w:noHBand="0" w:noVBand="1" w:val="04A0"/>
-        <w:tblW w:w="8063" w:type="dxa"/>
-        <w:tblLayout w:type="fixed"/>
-      </w:tblPr>
-      <w:tblGrid>
-        <w:gridCol w:w="8063"/>
-      </w:tblGrid>
-      <w:tr>
-        <w:trPr>
-          <w:trHeight w:val="3456" w:hRule="atLeast"/>
-        </w:trPr>
-        <w:tc>
-          <w:tcPr>
-            <w:tcW w:type="dxa" w:w="8064"/>
-            <w:tcBorders>
-              <w:top w:val="dashed" w:sz="8" w:space="0" w:color="808080"/>
-              <w:left w:val="dashed" w:sz="8" w:space="0" w:color="808080"/>
-              <w:bottom w:val="dashed" w:sz="8" w:space="0" w:color="808080"/>
-              <w:right w:val="dashed" w:sz="8" w:space="0" w:color="808080"/>
-            </w:tcBorders>
-            <w:shd w:val="clear" w:color="auto" w:fill="F7F7F7"/>
-            <w:vAlign w:val="center"/>
-          </w:tcPr>
-          <w:p>
-            <w:pPr>
-              <w:jc w:val="center"/>
-            </w:pPr>
-            <w:r>
-              <w:rPr>
-                <w:i/>
-                <w:color w:val="555555"/>
-                <w:sz w:val="21"/>
-              </w:rPr>
-              <w:t>[Insert screenshot of the KiCad 3D viewer (top view) of the finished board here]</w:t>
-            </w:r>
-          </w:p>
-        </w:tc>
-      </w:tr>
-    </w:tbl>
-    <w:p>
-      <w:pPr>
-        <w:spacing w:before="60"/>
+      </w:pPr>
+      <w:r>
+        <w:drawing>
+          <wp:inline xmlns:a="http://schemas.openxmlformats.org/drawingml/2006/main" xmlns:pic="http://schemas.openxmlformats.org/drawingml/2006/picture">
+            <wp:extent cx="5120640" cy="3894832"/>
+            <wp:docPr id="13" name="Picture 13"/>
+            <wp:cNvGraphicFramePr>
+              <a:graphicFrameLocks noChangeAspect="1"/>
+            </wp:cNvGraphicFramePr>
+            <a:graphic>
+              <a:graphicData uri="http://schemas.openxmlformats.org/drawingml/2006/picture">
+                <pic:pic>
+                  <pic:nvPicPr>
+                    <pic:cNvPr id="0" name="kicad_3d_top.png"/>
+                    <pic:cNvPicPr/>
+                  </pic:nvPicPr>
+                  <pic:blipFill>
+                    <a:blip r:embed="rId24"/>
+                    <a:stretch>
+                      <a:fillRect/>
+                    </a:stretch>
+                  </pic:blipFill>
+                  <pic:spPr>
+                    <a:xfrm>
+                      <a:off x="0" y="0"/>
+                      <a:ext cx="5120640" cy="3894832"/>
+                    </a:xfrm>
+                    <a:prstGeom prst="rect"/>
+                  </pic:spPr>
+                </pic:pic>
+              </a:graphicData>
+            </a:graphic>
+          </wp:inline>
+        </w:drawing>
+      </w:r>
+    </w:p>
+    <w:p>
+      <w:pPr>
+        <w:spacing w:after="200"/>
         <w:jc w:val="center"/>
       </w:pPr>
       <w:r>
@@ -14427,7 +14462,127 @@
         <w:rPr>
           <w:sz w:val="21"/>
         </w:rPr>
-        <w:t>3D view of the PCB in KiCad</w:t>
+        <w:t>3D view of the PCB in KiCad — top view</w:t>
+      </w:r>
+    </w:p>
+    <w:p>
+      <w:pPr>
+        <w:keepNext/>
+        <w:spacing w:after="40"/>
+        <w:jc w:val="center"/>
+      </w:pPr>
+      <w:r>
+        <w:drawing>
+          <wp:inline xmlns:a="http://schemas.openxmlformats.org/drawingml/2006/main" xmlns:pic="http://schemas.openxmlformats.org/drawingml/2006/picture">
+            <wp:extent cx="5852160" cy="2443648"/>
+            <wp:docPr id="14" name="Picture 14"/>
+            <wp:cNvGraphicFramePr>
+              <a:graphicFrameLocks noChangeAspect="1"/>
+            </wp:cNvGraphicFramePr>
+            <a:graphic>
+              <a:graphicData uri="http://schemas.openxmlformats.org/drawingml/2006/picture">
+                <pic:pic>
+                  <pic:nvPicPr>
+                    <pic:cNvPr id="0" name="kicad_3d_iso.png"/>
+                    <pic:cNvPicPr/>
+                  </pic:nvPicPr>
+                  <pic:blipFill>
+                    <a:blip r:embed="rId25"/>
+                    <a:stretch>
+                      <a:fillRect/>
+                    </a:stretch>
+                  </pic:blipFill>
+                  <pic:spPr>
+                    <a:xfrm>
+                      <a:off x="0" y="0"/>
+                      <a:ext cx="5852160" cy="2443648"/>
+                    </a:xfrm>
+                    <a:prstGeom prst="rect"/>
+                  </pic:spPr>
+                </pic:pic>
+              </a:graphicData>
+            </a:graphic>
+          </wp:inline>
+        </w:drawing>
+      </w:r>
+    </w:p>
+    <w:p>
+      <w:pPr>
+        <w:spacing w:after="200"/>
+        <w:jc w:val="center"/>
+      </w:pPr>
+      <w:r>
+        <w:rPr>
+          <w:b/>
+          <w:sz w:val="21"/>
+        </w:rPr>
+        <w:t xml:space="preserve">Figure 6.6: </w:t>
+      </w:r>
+      <w:r>
+        <w:rPr>
+          <w:sz w:val="21"/>
+        </w:rPr>
+        <w:t>3D views of the PCB from both sides</w:t>
+      </w:r>
+    </w:p>
+    <w:p>
+      <w:pPr>
+        <w:keepNext/>
+        <w:spacing w:after="40"/>
+        <w:jc w:val="center"/>
+      </w:pPr>
+      <w:r>
+        <w:drawing>
+          <wp:inline xmlns:a="http://schemas.openxmlformats.org/drawingml/2006/main" xmlns:pic="http://schemas.openxmlformats.org/drawingml/2006/picture">
+            <wp:extent cx="5852160" cy="1698115"/>
+            <wp:docPr id="15" name="Picture 15"/>
+            <wp:cNvGraphicFramePr>
+              <a:graphicFrameLocks noChangeAspect="1"/>
+            </wp:cNvGraphicFramePr>
+            <a:graphic>
+              <a:graphicData uri="http://schemas.openxmlformats.org/drawingml/2006/picture">
+                <pic:pic>
+                  <pic:nvPicPr>
+                    <pic:cNvPr id="0" name="kicad_3d_side.png"/>
+                    <pic:cNvPicPr/>
+                  </pic:nvPicPr>
+                  <pic:blipFill>
+                    <a:blip r:embed="rId26"/>
+                    <a:stretch>
+                      <a:fillRect/>
+                    </a:stretch>
+                  </pic:blipFill>
+                  <pic:spPr>
+                    <a:xfrm>
+                      <a:off x="0" y="0"/>
+                      <a:ext cx="5852160" cy="1698115"/>
+                    </a:xfrm>
+                    <a:prstGeom prst="rect"/>
+                  </pic:spPr>
+                </pic:pic>
+              </a:graphicData>
+            </a:graphic>
+          </wp:inline>
+        </w:drawing>
+      </w:r>
+    </w:p>
+    <w:p>
+      <w:pPr>
+        <w:spacing w:after="200"/>
+        <w:jc w:val="center"/>
+      </w:pPr>
+      <w:r>
+        <w:rPr>
+          <w:b/>
+          <w:sz w:val="21"/>
+        </w:rPr>
+        <w:t xml:space="preserve">Figure 6.7: </w:t>
+      </w:r>
+      <w:r>
+        <w:rPr>
+          <w:sz w:val="21"/>
+        </w:rPr>
+        <w:t>Side and edge views of the PCB, showing component heights</w:t>
       </w:r>
     </w:p>
     <w:p>
@@ -14436,7 +14591,112 @@
         <w:jc w:val="both"/>
       </w:pPr>
       <w:r>
-        <w:t>Some board parameters should be read directly from our final KiCad files. They are listed below so that the table can be completed before submission.</w:t>
+        <w:t>From the 3D views we made the following observations about the board:</w:t>
+      </w:r>
+    </w:p>
+    <w:p>
+      <w:pPr>
+        <w:pStyle w:val="ListBullet"/>
+        <w:spacing w:after="60"/>
+        <w:jc w:val="both"/>
+      </w:pPr>
+      <w:r>
+        <w:rPr>
+          <w:b/>
+        </w:rPr>
+        <w:t>Power terminals:</w:t>
+      </w:r>
+      <w:r>
+        <w:t xml:space="preserve"> the four screw terminals J26–J29 sit in a row along one edge with their wire entries facing outwards, so the converter leads can be tightened from the side without reaching over other parts (Figure 6.7(d)).</w:t>
+      </w:r>
+    </w:p>
+    <w:p>
+      <w:pPr>
+        <w:pStyle w:val="ListBullet"/>
+        <w:spacing w:after="60"/>
+        <w:jc w:val="both"/>
+      </w:pPr>
+      <w:r>
+        <w:rPr>
+          <w:b/>
+        </w:rPr>
+        <w:t>Power copper areas:</w:t>
+      </w:r>
+      <w:r>
+        <w:t xml:space="preserve"> the wide +6V_A and +6V_B areas are clearly visible in the top view (Figure 6.5), running from J26 and J27 to the two rows of servo sockets.</w:t>
+      </w:r>
+    </w:p>
+    <w:p>
+      <w:pPr>
+        <w:pStyle w:val="ListBullet"/>
+        <w:spacing w:after="60"/>
+        <w:jc w:val="both"/>
+      </w:pPr>
+      <w:r>
+        <w:rPr>
+          <w:b/>
+        </w:rPr>
+        <w:t>Servo sockets:</w:t>
+      </w:r>
+      <w:r>
+        <w:t xml:space="preserve"> the three-pin servo headers are grouped in labelled blocks along the top and bottom edges, so each leg's cables leave the board in one bundle.</w:t>
+      </w:r>
+    </w:p>
+    <w:p>
+      <w:pPr>
+        <w:pStyle w:val="ListBullet"/>
+        <w:spacing w:after="60"/>
+        <w:jc w:val="both"/>
+      </w:pPr>
+      <w:r>
+        <w:rPr>
+          <w:b/>
+        </w:rPr>
+        <w:t>Component height:</w:t>
+      </w:r>
+      <w:r>
+        <w:t xml:space="preserve"> the tallest parts are the 2200 µF capacitors C1 and C2 and the screw terminals (Figure 6.7(c)). The electronics box, which will be designed during the 3D-printing stage, must leave enough height above these parts, and also above the PCA9685 modules, which plug into their headers from above.</w:t>
+      </w:r>
+    </w:p>
+    <w:p>
+      <w:pPr>
+        <w:pStyle w:val="ListBullet"/>
+        <w:spacing w:after="60"/>
+        <w:jc w:val="both"/>
+      </w:pPr>
+      <w:r>
+        <w:rPr>
+          <w:b/>
+        </w:rPr>
+        <w:t>Leads under the board:</w:t>
+      </w:r>
+      <w:r>
+        <w:t xml:space="preserve"> the side views show the through-hole leads coming out underneath the board. Because the shield sits directly on top of the Arduino Uno, these leads will be trimmed short after soldering and checked for clearance from the Uno's USB and power jacks, so that nothing on the underside can short against the Arduino.</w:t>
+      </w:r>
+    </w:p>
+    <w:p>
+      <w:pPr>
+        <w:pStyle w:val="ListBullet"/>
+        <w:spacing w:after="60"/>
+        <w:jc w:val="both"/>
+      </w:pPr>
+      <w:r>
+        <w:rPr>
+          <w:b/>
+        </w:rPr>
+        <w:t>Indicators:</w:t>
+      </w:r>
+      <w:r>
+        <w:t xml:space="preserve"> the two LEDs and the buzzer BZ1 are placed at the board edge, where they will be visible and audible through the electronics box.</w:t>
+      </w:r>
+    </w:p>
+    <w:p>
+      <w:pPr>
+        <w:spacing w:after="120"/>
+        <w:jc w:val="both"/>
+      </w:pPr>
+      <w:r>
+        <w:t>The main board parameters are summarised in Table 6.5.</w:t>
       </w:r>
     </w:p>
     <w:p>
@@ -14456,7 +14716,7 @@
         <w:rPr>
           <w:sz w:val="21"/>
         </w:rPr>
-        <w:t>PCB design data (to be filled in from the final KiCad project)</w:t>
+        <w:t>PCB design data</w:t>
       </w:r>
     </w:p>
     <w:tbl>
@@ -14527,7 +14787,7 @@
               <w:rPr>
                 <w:sz w:val="20"/>
               </w:rPr>
-              <w:t>Board size</w:t>
+              <w:t>Board type</w:t>
             </w:r>
           </w:p>
         </w:tc>
@@ -14544,7 +14804,7 @@
               <w:rPr>
                 <w:sz w:val="20"/>
               </w:rPr>
-              <w:t>About 114 × 84 mm per the design plan — [confirm final outline from KiCad]</w:t>
+              <w:t>Shield for the Arduino Uno R3 (stacking headers J1–J4)</w:t>
             </w:r>
           </w:p>
         </w:tc>
@@ -14563,7 +14823,7 @@
               <w:rPr>
                 <w:sz w:val="20"/>
               </w:rPr>
-              <w:t>Number of copper layers</w:t>
+              <w:t>Board size</w:t>
             </w:r>
           </w:p>
         </w:tc>
@@ -14580,7 +14840,7 @@
               <w:rPr>
                 <w:sz w:val="20"/>
               </w:rPr>
-              <w:t>Two (front and back copper, as seen in the layout)</w:t>
+              <w:t>About 114 × 84 mm (as per the design plan)</w:t>
             </w:r>
           </w:p>
         </w:tc>
@@ -14599,7 +14859,7 @@
               <w:rPr>
                 <w:sz w:val="20"/>
               </w:rPr>
-              <w:t>Minimum signal track width / clearance</w:t>
+              <w:t>Number of copper layers</w:t>
             </w:r>
           </w:p>
         </w:tc>
@@ -14616,7 +14876,7 @@
               <w:rPr>
                 <w:sz w:val="20"/>
               </w:rPr>
-              <w:t>[fill in]</w:t>
+              <w:t>Two (front and back copper)</w:t>
             </w:r>
           </w:p>
         </w:tc>
@@ -14635,7 +14895,7 @@
               <w:rPr>
                 <w:sz w:val="20"/>
               </w:rPr>
-              <w:t>Width / type of 6 V power paths</w:t>
+              <w:t>Power distribution</w:t>
             </w:r>
           </w:p>
         </w:tc>
@@ -14652,7 +14912,7 @@
               <w:rPr>
                 <w:sz w:val="20"/>
               </w:rPr>
-              <w:t>[fill in — copper zones / track width]</w:t>
+              <w:t>Copper areas for +6V_A and +6V_B; ground pour on the back layer</w:t>
             </w:r>
           </w:p>
         </w:tc>
@@ -14671,7 +14931,7 @@
               <w:rPr>
                 <w:sz w:val="20"/>
               </w:rPr>
-              <w:t>KiCad version used</w:t>
+              <w:t>Mounting</w:t>
             </w:r>
           </w:p>
         </w:tc>
@@ -14688,7 +14948,7 @@
               <w:rPr>
                 <w:sz w:val="20"/>
               </w:rPr>
-              <w:t>[fill in]</w:t>
+              <w:t>Four corner mounting holes (H1–H4)</w:t>
             </w:r>
           </w:p>
         </w:tc>
@@ -14707,7 +14967,7 @@
               <w:rPr>
                 <w:sz w:val="20"/>
               </w:rPr>
-              <w:t>Fabrication house (planned)</w:t>
+              <w:t>Components</w:t>
             </w:r>
           </w:p>
         </w:tc>
@@ -14724,7 +14984,43 @@
               <w:rPr>
                 <w:sz w:val="20"/>
               </w:rPr>
-              <w:t>[fill in when ordered]</w:t>
+              <w:t>Through-hole parts throughout</w:t>
+            </w:r>
+          </w:p>
+        </w:tc>
+      </w:tr>
+      <w:tr>
+        <w:tc>
+          <w:tcPr>
+            <w:tcW w:type="dxa" w:w="3745"/>
+          </w:tcPr>
+          <w:p>
+            <w:pPr>
+              <w:spacing w:line="240" w:lineRule="auto" w:after="20"/>
+              <w:jc w:val="both"/>
+            </w:pPr>
+            <w:r>
+              <w:rPr>
+                <w:sz w:val="20"/>
+              </w:rPr>
+              <w:t>Fabrication</w:t>
+            </w:r>
+          </w:p>
+        </w:tc>
+        <w:tc>
+          <w:tcPr>
+            <w:tcW w:type="dxa" w:w="5543"/>
+          </w:tcPr>
+          <w:p>
+            <w:pPr>
+              <w:spacing w:line="240" w:lineRule="auto" w:after="20"/>
+              <w:jc w:val="both"/>
+            </w:pPr>
+            <w:r>
+              <w:rPr>
+                <w:sz w:val="20"/>
+              </w:rPr>
+              <w:t>Gerber files ready; order pending</w:t>
             </w:r>
           </w:p>
         </w:tc>
@@ -14770,7 +15066,7 @@
         <w:drawing>
           <wp:inline xmlns:a="http://schemas.openxmlformats.org/drawingml/2006/main" xmlns:pic="http://schemas.openxmlformats.org/drawingml/2006/picture">
             <wp:extent cx="4023360" cy="2646652"/>
-            <wp:docPr id="13" name="Picture 13"/>
+            <wp:docPr id="16" name="Picture 16"/>
             <wp:cNvGraphicFramePr>
               <a:graphicFrameLocks noChangeAspect="1"/>
             </wp:cNvGraphicFramePr>
@@ -14782,7 +15078,7 @@
                     <pic:cNvPicPr/>
                   </pic:nvPicPr>
                   <pic:blipFill>
-                    <a:blip r:embed="rId24"/>
+                    <a:blip r:embed="rId27"/>
                     <a:stretch>
                       <a:fillRect/>
                     </a:stretch>
@@ -14811,7 +15107,7 @@
           <w:b/>
           <w:sz w:val="21"/>
         </w:rPr>
-        <w:t xml:space="preserve">Figure 6.6: </w:t>
+        <w:t xml:space="preserve">Figure 6.8: </w:t>
       </w:r>
       <w:r>
         <w:rPr>
@@ -14835,7 +15131,7 @@
         <w:t>0 violations, 0 errors and 0 warnings</w:t>
       </w:r>
       <w:r>
-        <w:t xml:space="preserve"> (Figure 6.6). Three ERC tests were set to “ignored”. We looked at each one and they are not needed for a board like ours:</w:t>
+        <w:t xml:space="preserve"> (Figure 6.8). Three ERC tests were set to “ignored”. We looked at each one and they are not needed for a board like ours:</w:t>
       </w:r>
     </w:p>
     <w:p>
@@ -14913,7 +15209,7 @@
         <w:drawing>
           <wp:inline xmlns:a="http://schemas.openxmlformats.org/drawingml/2006/main" xmlns:pic="http://schemas.openxmlformats.org/drawingml/2006/picture">
             <wp:extent cx="4023360" cy="3330632"/>
-            <wp:docPr id="14" name="Picture 14"/>
+            <wp:docPr id="17" name="Picture 17"/>
             <wp:cNvGraphicFramePr>
               <a:graphicFrameLocks noChangeAspect="1"/>
             </wp:cNvGraphicFramePr>
@@ -14925,7 +15221,7 @@
                     <pic:cNvPicPr/>
                   </pic:nvPicPr>
                   <pic:blipFill>
-                    <a:blip r:embed="rId25"/>
+                    <a:blip r:embed="rId28"/>
                     <a:stretch>
                       <a:fillRect/>
                     </a:stretch>
@@ -14954,7 +15250,7 @@
           <w:b/>
           <w:sz w:val="21"/>
         </w:rPr>
-        <w:t xml:space="preserve">Figure 6.7: </w:t>
+        <w:t xml:space="preserve">Figure 6.9: </w:t>
       </w:r>
       <w:r>
         <w:rPr>
@@ -14969,7 +15265,7 @@
         <w:jc w:val="both"/>
       </w:pPr>
       <w:r>
-        <w:t xml:space="preserve">The DRC result is shown in Figure 6.7. The most important number here is </w:t>
+        <w:t xml:space="preserve">The DRC result is shown in Figure 6.9. The most important number here is </w:t>
       </w:r>
       <w:r>
         <w:rPr>
@@ -15065,44 +15361,581 @@
         <w:t>After the checks, the fabrication outputs were exported from KiCad: Gerber files for the copper, solder-mask, silkscreen and board-outline (edge cut) layers, together with the drill file. These files are what a PCB manufacturer uses to make the board, and they are ready to be uploaded for fabrication.</w:t>
       </w:r>
     </w:p>
+    <w:p>
+      <w:pPr>
+        <w:spacing w:after="120"/>
+        <w:jc w:val="both"/>
+      </w:pPr>
+      <w:r>
+        <w:t>The exported file set (project name “hex-pcb”, exported on 27 September 2026) is listed in Table 6.6.</w:t>
+      </w:r>
+    </w:p>
+    <w:p>
+      <w:pPr>
+        <w:keepNext/>
+        <w:spacing w:after="80"/>
+        <w:jc w:val="center"/>
+      </w:pPr>
+      <w:r>
+        <w:rPr>
+          <w:b/>
+          <w:sz w:val="21"/>
+        </w:rPr>
+        <w:t xml:space="preserve">Table 6.6: </w:t>
+      </w:r>
+      <w:r>
+        <w:rPr>
+          <w:sz w:val="21"/>
+        </w:rPr>
+        <w:t>Fabrication files exported from KiCad</w:t>
+      </w:r>
+    </w:p>
     <w:tbl>
       <w:tblPr>
+        <w:tblStyle w:val="TableGrid"/>
         <w:jc w:val="center"/>
         <w:tblLayout w:type="fixed"/>
         <w:tblLook w:firstColumn="1" w:firstRow="1" w:lastColumn="0" w:lastRow="0" w:noHBand="0" w:noVBand="1" w:val="04A0"/>
-        <w:tblW w:w="8063" w:type="dxa"/>
+        <w:tblW w:w="9288" w:type="dxa"/>
         <w:tblLayout w:type="fixed"/>
       </w:tblPr>
       <w:tblGrid>
-        <w:gridCol w:w="8063"/>
+        <w:gridCol w:w="3482"/>
+        <w:gridCol w:w="4498"/>
+        <w:gridCol w:w="1306"/>
       </w:tblGrid>
       <w:tr>
         <w:trPr>
-          <w:trHeight w:val="3168" w:hRule="atLeast"/>
+          <w:tblHeader w:val="true"/>
         </w:trPr>
         <w:tc>
           <w:tcPr>
-            <w:tcW w:type="dxa" w:w="8064"/>
-            <w:tcBorders>
-              <w:top w:val="dashed" w:sz="8" w:space="0" w:color="808080"/>
-              <w:left w:val="dashed" w:sz="8" w:space="0" w:color="808080"/>
-              <w:bottom w:val="dashed" w:sz="8" w:space="0" w:color="808080"/>
-              <w:right w:val="dashed" w:sz="8" w:space="0" w:color="808080"/>
-            </w:tcBorders>
-            <w:shd w:val="clear" w:color="auto" w:fill="F7F7F7"/>
-            <w:vAlign w:val="center"/>
-          </w:tcPr>
-          <w:p>
-            <w:pPr>
-              <w:jc w:val="center"/>
-            </w:pPr>
-            <w:r>
-              <w:rPr>
-                <w:i/>
-                <w:color w:val="555555"/>
-                <w:sz w:val="21"/>
-              </w:rPr>
-              <w:t>[Insert screenshot of the Gerber files generated in KiCad (plot dialog or Gerber viewer) here]</w:t>
+            <w:tcW w:type="dxa" w:w="3483"/>
+            <w:shd w:val="clear" w:color="auto" w:fill="D9E2EC"/>
+          </w:tcPr>
+          <w:p>
+            <w:pPr>
+              <w:spacing w:line="240" w:lineRule="auto"/>
+            </w:pPr>
+            <w:r>
+              <w:rPr>
+                <w:b/>
+                <w:sz w:val="19"/>
+              </w:rPr>
+              <w:t>File</w:t>
+            </w:r>
+          </w:p>
+        </w:tc>
+        <w:tc>
+          <w:tcPr>
+            <w:tcW w:type="dxa" w:w="4499"/>
+            <w:shd w:val="clear" w:color="auto" w:fill="D9E2EC"/>
+          </w:tcPr>
+          <w:p>
+            <w:pPr>
+              <w:spacing w:line="240" w:lineRule="auto"/>
+            </w:pPr>
+            <w:r>
+              <w:rPr>
+                <w:b/>
+                <w:sz w:val="19"/>
+              </w:rPr>
+              <w:t>Contents</w:t>
+            </w:r>
+          </w:p>
+        </w:tc>
+        <w:tc>
+          <w:tcPr>
+            <w:tcW w:type="dxa" w:w="1306"/>
+            <w:shd w:val="clear" w:color="auto" w:fill="D9E2EC"/>
+          </w:tcPr>
+          <w:p>
+            <w:pPr>
+              <w:spacing w:line="240" w:lineRule="auto"/>
+            </w:pPr>
+            <w:r>
+              <w:rPr>
+                <w:b/>
+                <w:sz w:val="19"/>
+              </w:rPr>
+              <w:t>Size</w:t>
+            </w:r>
+          </w:p>
+        </w:tc>
+      </w:tr>
+      <w:tr>
+        <w:tc>
+          <w:tcPr>
+            <w:tcW w:type="dxa" w:w="3483"/>
+          </w:tcPr>
+          <w:p>
+            <w:pPr>
+              <w:spacing w:line="240" w:lineRule="auto" w:after="20"/>
+              <w:jc w:val="left"/>
+            </w:pPr>
+            <w:r>
+              <w:rPr>
+                <w:sz w:val="19"/>
+              </w:rPr>
+              <w:t>hex-pcb-F_Cu.gbr</w:t>
+            </w:r>
+          </w:p>
+        </w:tc>
+        <w:tc>
+          <w:tcPr>
+            <w:tcW w:type="dxa" w:w="4499"/>
+          </w:tcPr>
+          <w:p>
+            <w:pPr>
+              <w:spacing w:line="240" w:lineRule="auto" w:after="20"/>
+              <w:jc w:val="both"/>
+            </w:pPr>
+            <w:r>
+              <w:rPr>
+                <w:sz w:val="19"/>
+              </w:rPr>
+              <w:t>Front copper layer (tracks and pads)</w:t>
+            </w:r>
+          </w:p>
+        </w:tc>
+        <w:tc>
+          <w:tcPr>
+            <w:tcW w:type="dxa" w:w="1306"/>
+          </w:tcPr>
+          <w:p>
+            <w:pPr>
+              <w:spacing w:line="240" w:lineRule="auto" w:after="20"/>
+              <w:jc w:val="left"/>
+            </w:pPr>
+            <w:r>
+              <w:rPr>
+                <w:sz w:val="19"/>
+              </w:rPr>
+              <w:t>66 KB</w:t>
+            </w:r>
+          </w:p>
+        </w:tc>
+      </w:tr>
+      <w:tr>
+        <w:tc>
+          <w:tcPr>
+            <w:tcW w:type="dxa" w:w="3483"/>
+          </w:tcPr>
+          <w:p>
+            <w:pPr>
+              <w:spacing w:line="240" w:lineRule="auto" w:after="20"/>
+              <w:jc w:val="left"/>
+            </w:pPr>
+            <w:r>
+              <w:rPr>
+                <w:sz w:val="19"/>
+              </w:rPr>
+              <w:t>hex-pcb-B_Cu.gbr</w:t>
+            </w:r>
+          </w:p>
+        </w:tc>
+        <w:tc>
+          <w:tcPr>
+            <w:tcW w:type="dxa" w:w="4499"/>
+          </w:tcPr>
+          <w:p>
+            <w:pPr>
+              <w:spacing w:line="240" w:lineRule="auto" w:after="20"/>
+              <w:jc w:val="both"/>
+            </w:pPr>
+            <w:r>
+              <w:rPr>
+                <w:sz w:val="19"/>
+              </w:rPr>
+              <w:t>Back copper layer, including the ground pour</w:t>
+            </w:r>
+          </w:p>
+        </w:tc>
+        <w:tc>
+          <w:tcPr>
+            <w:tcW w:type="dxa" w:w="1306"/>
+          </w:tcPr>
+          <w:p>
+            <w:pPr>
+              <w:spacing w:line="240" w:lineRule="auto" w:after="20"/>
+              <w:jc w:val="left"/>
+            </w:pPr>
+            <w:r>
+              <w:rPr>
+                <w:sz w:val="19"/>
+              </w:rPr>
+              <w:t>426 KB</w:t>
+            </w:r>
+          </w:p>
+        </w:tc>
+      </w:tr>
+      <w:tr>
+        <w:tc>
+          <w:tcPr>
+            <w:tcW w:type="dxa" w:w="3483"/>
+          </w:tcPr>
+          <w:p>
+            <w:pPr>
+              <w:spacing w:line="240" w:lineRule="auto" w:after="20"/>
+              <w:jc w:val="left"/>
+            </w:pPr>
+            <w:r>
+              <w:rPr>
+                <w:sz w:val="19"/>
+              </w:rPr>
+              <w:t>hex-pcb-F_Mask.gbr / B_Mask.gbr</w:t>
+            </w:r>
+          </w:p>
+        </w:tc>
+        <w:tc>
+          <w:tcPr>
+            <w:tcW w:type="dxa" w:w="4499"/>
+          </w:tcPr>
+          <w:p>
+            <w:pPr>
+              <w:spacing w:line="240" w:lineRule="auto" w:after="20"/>
+              <w:jc w:val="both"/>
+            </w:pPr>
+            <w:r>
+              <w:rPr>
+                <w:sz w:val="19"/>
+              </w:rPr>
+              <w:t>Solder mask, front and back</w:t>
+            </w:r>
+          </w:p>
+        </w:tc>
+        <w:tc>
+          <w:tcPr>
+            <w:tcW w:type="dxa" w:w="1306"/>
+          </w:tcPr>
+          <w:p>
+            <w:pPr>
+              <w:spacing w:line="240" w:lineRule="auto" w:after="20"/>
+              <w:jc w:val="left"/>
+            </w:pPr>
+            <w:r>
+              <w:rPr>
+                <w:sz w:val="19"/>
+              </w:rPr>
+              <w:t>12 KB each</w:t>
+            </w:r>
+          </w:p>
+        </w:tc>
+      </w:tr>
+      <w:tr>
+        <w:tc>
+          <w:tcPr>
+            <w:tcW w:type="dxa" w:w="3483"/>
+          </w:tcPr>
+          <w:p>
+            <w:pPr>
+              <w:spacing w:line="240" w:lineRule="auto" w:after="20"/>
+              <w:jc w:val="left"/>
+            </w:pPr>
+            <w:r>
+              <w:rPr>
+                <w:sz w:val="19"/>
+              </w:rPr>
+              <w:t>hex-pcb-F_Silkscreen.gbr / B_Silkscreen.gbr</w:t>
+            </w:r>
+          </w:p>
+        </w:tc>
+        <w:tc>
+          <w:tcPr>
+            <w:tcW w:type="dxa" w:w="4499"/>
+          </w:tcPr>
+          <w:p>
+            <w:pPr>
+              <w:spacing w:line="240" w:lineRule="auto" w:after="20"/>
+              <w:jc w:val="both"/>
+            </w:pPr>
+            <w:r>
+              <w:rPr>
+                <w:sz w:val="19"/>
+              </w:rPr>
+              <w:t>Silkscreen (labels and outlines), front and back</w:t>
+            </w:r>
+          </w:p>
+        </w:tc>
+        <w:tc>
+          <w:tcPr>
+            <w:tcW w:type="dxa" w:w="1306"/>
+          </w:tcPr>
+          <w:p>
+            <w:pPr>
+              <w:spacing w:line="240" w:lineRule="auto" w:after="20"/>
+              <w:jc w:val="left"/>
+            </w:pPr>
+            <w:r>
+              <w:rPr>
+                <w:sz w:val="19"/>
+              </w:rPr>
+              <w:t>182 KB / 12 KB</w:t>
+            </w:r>
+          </w:p>
+        </w:tc>
+      </w:tr>
+      <w:tr>
+        <w:tc>
+          <w:tcPr>
+            <w:tcW w:type="dxa" w:w="3483"/>
+          </w:tcPr>
+          <w:p>
+            <w:pPr>
+              <w:spacing w:line="240" w:lineRule="auto" w:after="20"/>
+              <w:jc w:val="left"/>
+            </w:pPr>
+            <w:r>
+              <w:rPr>
+                <w:sz w:val="19"/>
+              </w:rPr>
+              <w:t>hex-pcb-F_Paste.gbr / B_Paste.gbr</w:t>
+            </w:r>
+          </w:p>
+        </w:tc>
+        <w:tc>
+          <w:tcPr>
+            <w:tcW w:type="dxa" w:w="4499"/>
+          </w:tcPr>
+          <w:p>
+            <w:pPr>
+              <w:spacing w:line="240" w:lineRule="auto" w:after="20"/>
+              <w:jc w:val="both"/>
+            </w:pPr>
+            <w:r>
+              <w:rPr>
+                <w:sz w:val="19"/>
+              </w:rPr>
+              <w:t>Solder paste layers — practically empty, as all parts are through-hole</w:t>
+            </w:r>
+          </w:p>
+        </w:tc>
+        <w:tc>
+          <w:tcPr>
+            <w:tcW w:type="dxa" w:w="1306"/>
+          </w:tcPr>
+          <w:p>
+            <w:pPr>
+              <w:spacing w:line="240" w:lineRule="auto" w:after="20"/>
+              <w:jc w:val="left"/>
+            </w:pPr>
+            <w:r>
+              <w:rPr>
+                <w:sz w:val="19"/>
+              </w:rPr>
+              <w:t>1 KB each</w:t>
+            </w:r>
+          </w:p>
+        </w:tc>
+      </w:tr>
+      <w:tr>
+        <w:tc>
+          <w:tcPr>
+            <w:tcW w:type="dxa" w:w="3483"/>
+          </w:tcPr>
+          <w:p>
+            <w:pPr>
+              <w:spacing w:line="240" w:lineRule="auto" w:after="20"/>
+              <w:jc w:val="left"/>
+            </w:pPr>
+            <w:r>
+              <w:rPr>
+                <w:sz w:val="19"/>
+              </w:rPr>
+              <w:t>hex-pcb-Edge_Cuts.gbr</w:t>
+            </w:r>
+          </w:p>
+        </w:tc>
+        <w:tc>
+          <w:tcPr>
+            <w:tcW w:type="dxa" w:w="4499"/>
+          </w:tcPr>
+          <w:p>
+            <w:pPr>
+              <w:spacing w:line="240" w:lineRule="auto" w:after="20"/>
+              <w:jc w:val="both"/>
+            </w:pPr>
+            <w:r>
+              <w:rPr>
+                <w:sz w:val="19"/>
+              </w:rPr>
+              <w:t>Board outline</w:t>
+            </w:r>
+          </w:p>
+        </w:tc>
+        <w:tc>
+          <w:tcPr>
+            <w:tcW w:type="dxa" w:w="1306"/>
+          </w:tcPr>
+          <w:p>
+            <w:pPr>
+              <w:spacing w:line="240" w:lineRule="auto" w:after="20"/>
+              <w:jc w:val="left"/>
+            </w:pPr>
+            <w:r>
+              <w:rPr>
+                <w:sz w:val="19"/>
+              </w:rPr>
+              <w:t>1 KB</w:t>
+            </w:r>
+          </w:p>
+        </w:tc>
+      </w:tr>
+      <w:tr>
+        <w:tc>
+          <w:tcPr>
+            <w:tcW w:type="dxa" w:w="3483"/>
+          </w:tcPr>
+          <w:p>
+            <w:pPr>
+              <w:spacing w:line="240" w:lineRule="auto" w:after="20"/>
+              <w:jc w:val="left"/>
+            </w:pPr>
+            <w:r>
+              <w:rPr>
+                <w:sz w:val="19"/>
+              </w:rPr>
+              <w:t>hex-pcb-PTH.drl</w:t>
+            </w:r>
+          </w:p>
+        </w:tc>
+        <w:tc>
+          <w:tcPr>
+            <w:tcW w:type="dxa" w:w="4499"/>
+          </w:tcPr>
+          <w:p>
+            <w:pPr>
+              <w:spacing w:line="240" w:lineRule="auto" w:after="20"/>
+              <w:jc w:val="both"/>
+            </w:pPr>
+            <w:r>
+              <w:rPr>
+                <w:sz w:val="19"/>
+              </w:rPr>
+              <w:t>Drill file for plated through-holes (component pins, vias)</w:t>
+            </w:r>
+          </w:p>
+        </w:tc>
+        <w:tc>
+          <w:tcPr>
+            <w:tcW w:type="dxa" w:w="1306"/>
+          </w:tcPr>
+          <w:p>
+            <w:pPr>
+              <w:spacing w:line="240" w:lineRule="auto" w:after="20"/>
+              <w:jc w:val="left"/>
+            </w:pPr>
+            <w:r>
+              <w:rPr>
+                <w:sz w:val="19"/>
+              </w:rPr>
+              <w:t>6 KB</w:t>
+            </w:r>
+          </w:p>
+        </w:tc>
+      </w:tr>
+      <w:tr>
+        <w:tc>
+          <w:tcPr>
+            <w:tcW w:type="dxa" w:w="3483"/>
+          </w:tcPr>
+          <w:p>
+            <w:pPr>
+              <w:spacing w:line="240" w:lineRule="auto" w:after="20"/>
+              <w:jc w:val="left"/>
+            </w:pPr>
+            <w:r>
+              <w:rPr>
+                <w:sz w:val="19"/>
+              </w:rPr>
+              <w:t>hex-pcb-NPTH.drl</w:t>
+            </w:r>
+          </w:p>
+        </w:tc>
+        <w:tc>
+          <w:tcPr>
+            <w:tcW w:type="dxa" w:w="4499"/>
+          </w:tcPr>
+          <w:p>
+            <w:pPr>
+              <w:spacing w:line="240" w:lineRule="auto" w:after="20"/>
+              <w:jc w:val="both"/>
+            </w:pPr>
+            <w:r>
+              <w:rPr>
+                <w:sz w:val="19"/>
+              </w:rPr>
+              <w:t>Drill file for non-plated holes (mounting holes)</w:t>
+            </w:r>
+          </w:p>
+        </w:tc>
+        <w:tc>
+          <w:tcPr>
+            <w:tcW w:type="dxa" w:w="1306"/>
+          </w:tcPr>
+          <w:p>
+            <w:pPr>
+              <w:spacing w:line="240" w:lineRule="auto" w:after="20"/>
+              <w:jc w:val="left"/>
+            </w:pPr>
+            <w:r>
+              <w:rPr>
+                <w:sz w:val="19"/>
+              </w:rPr>
+              <w:t>1 KB</w:t>
+            </w:r>
+          </w:p>
+        </w:tc>
+      </w:tr>
+      <w:tr>
+        <w:tc>
+          <w:tcPr>
+            <w:tcW w:type="dxa" w:w="3483"/>
+          </w:tcPr>
+          <w:p>
+            <w:pPr>
+              <w:spacing w:line="240" w:lineRule="auto" w:after="20"/>
+              <w:jc w:val="left"/>
+            </w:pPr>
+            <w:r>
+              <w:rPr>
+                <w:sz w:val="19"/>
+              </w:rPr>
+              <w:t>hex-pcb-job.gbrjob</w:t>
+            </w:r>
+          </w:p>
+        </w:tc>
+        <w:tc>
+          <w:tcPr>
+            <w:tcW w:type="dxa" w:w="4499"/>
+          </w:tcPr>
+          <w:p>
+            <w:pPr>
+              <w:spacing w:line="240" w:lineRule="auto" w:after="20"/>
+              <w:jc w:val="both"/>
+            </w:pPr>
+            <w:r>
+              <w:rPr>
+                <w:sz w:val="19"/>
+              </w:rPr>
+              <w:t>Gerber job file describing the layer stack for the manufacturer</w:t>
+            </w:r>
+          </w:p>
+        </w:tc>
+        <w:tc>
+          <w:tcPr>
+            <w:tcW w:type="dxa" w:w="1306"/>
+          </w:tcPr>
+          <w:p>
+            <w:pPr>
+              <w:spacing w:line="240" w:lineRule="auto" w:after="20"/>
+              <w:jc w:val="left"/>
+            </w:pPr>
+            <w:r>
+              <w:rPr>
+                <w:sz w:val="19"/>
+              </w:rPr>
+              <w:t>3 KB</w:t>
             </w:r>
           </w:p>
         </w:tc>
@@ -15110,21 +15943,16 @@
     </w:tbl>
     <w:p>
       <w:pPr>
-        <w:spacing w:before="60"/>
-        <w:jc w:val="center"/>
-      </w:pPr>
-      <w:r>
-        <w:rPr>
-          <w:b/>
-          <w:sz w:val="21"/>
-        </w:rPr>
-        <w:t xml:space="preserve">Figure 6.8: </w:t>
-      </w:r>
-      <w:r>
-        <w:rPr>
-          <w:sz w:val="21"/>
-        </w:rPr>
-        <w:t>Gerber files exported from KiCad</w:t>
+        <w:spacing w:after="80"/>
+      </w:pPr>
+    </w:p>
+    <w:p>
+      <w:pPr>
+        <w:spacing w:after="120"/>
+        <w:jc w:val="both"/>
+      </w:pPr>
+      <w:r>
+        <w:t>The back copper file is by far the largest because it contains the ground pour that covers most of the back of the board. These files will be compressed into a single ZIP archive and uploaded when the board is ordered.</w:t>
       </w:r>
     </w:p>
     <w:p>
@@ -15213,7 +16041,7 @@
           <w:b/>
           <w:sz w:val="21"/>
         </w:rPr>
-        <w:t xml:space="preserve">Table 6.6: </w:t>
+        <w:t xml:space="preserve">Table 6.7: </w:t>
       </w:r>
       <w:r>
         <w:rPr>
@@ -15723,6 +16551,16 @@
       </w:pPr>
       <w:r>
         <w:t>the 6 V zones actually reach pin 2 of the correct servo sockets;</w:t>
+      </w:r>
+    </w:p>
+    <w:p>
+      <w:pPr>
+        <w:pStyle w:val="ListBullet"/>
+        <w:spacing w:after="60"/>
+        <w:jc w:val="both"/>
+      </w:pPr>
+      <w:r>
+        <w:t>after soldering: trim all through-hole leads on the underside and check that nothing touches the Arduino Uno's USB or power jack when the shield is plugged in;</w:t>
       </w:r>
     </w:p>
     <w:p>
@@ -16009,7 +16847,7 @@
           <w:p>
             <w:pPr>
               <w:spacing w:line="240" w:lineRule="auto" w:after="20"/>
-              <w:jc w:val="both"/>
+              <w:jc w:val="left"/>
             </w:pPr>
             <w:r>
               <w:rPr>
@@ -16079,7 +16917,7 @@
           <w:p>
             <w:pPr>
               <w:spacing w:line="240" w:lineRule="auto" w:after="20"/>
-              <w:jc w:val="both"/>
+              <w:jc w:val="left"/>
             </w:pPr>
             <w:r>
               <w:rPr>
@@ -16149,7 +16987,7 @@
           <w:p>
             <w:pPr>
               <w:spacing w:line="240" w:lineRule="auto" w:after="20"/>
-              <w:jc w:val="both"/>
+              <w:jc w:val="left"/>
             </w:pPr>
             <w:r>
               <w:rPr>
@@ -16219,7 +17057,7 @@
           <w:p>
             <w:pPr>
               <w:spacing w:line="240" w:lineRule="auto" w:after="20"/>
-              <w:jc w:val="both"/>
+              <w:jc w:val="left"/>
             </w:pPr>
             <w:r>
               <w:rPr>
@@ -16289,7 +17127,7 @@
           <w:p>
             <w:pPr>
               <w:spacing w:line="240" w:lineRule="auto" w:after="20"/>
-              <w:jc w:val="both"/>
+              <w:jc w:val="left"/>
             </w:pPr>
             <w:r>
               <w:rPr>
@@ -16359,7 +17197,7 @@
           <w:p>
             <w:pPr>
               <w:spacing w:line="240" w:lineRule="auto" w:after="20"/>
-              <w:jc w:val="both"/>
+              <w:jc w:val="left"/>
             </w:pPr>
             <w:r>
               <w:rPr>
@@ -16429,7 +17267,7 @@
           <w:p>
             <w:pPr>
               <w:spacing w:line="240" w:lineRule="auto" w:after="20"/>
-              <w:jc w:val="both"/>
+              <w:jc w:val="left"/>
             </w:pPr>
             <w:r>
               <w:rPr>
@@ -16499,7 +17337,7 @@
           <w:p>
             <w:pPr>
               <w:spacing w:line="240" w:lineRule="auto" w:after="20"/>
-              <w:jc w:val="both"/>
+              <w:jc w:val="left"/>
             </w:pPr>
             <w:r>
               <w:rPr>
@@ -16569,7 +17407,7 @@
           <w:p>
             <w:pPr>
               <w:spacing w:line="240" w:lineRule="auto" w:after="20"/>
-              <w:jc w:val="both"/>
+              <w:jc w:val="left"/>
             </w:pPr>
             <w:r>
               <w:rPr>
@@ -16639,7 +17477,7 @@
           <w:p>
             <w:pPr>
               <w:spacing w:line="240" w:lineRule="auto" w:after="20"/>
-              <w:jc w:val="both"/>
+              <w:jc w:val="left"/>
             </w:pPr>
             <w:r>
               <w:rPr>
@@ -16709,7 +17547,7 @@
           <w:p>
             <w:pPr>
               <w:spacing w:line="240" w:lineRule="auto" w:after="20"/>
-              <w:jc w:val="both"/>
+              <w:jc w:val="left"/>
             </w:pPr>
             <w:r>
               <w:rPr>
@@ -16779,7 +17617,7 @@
           <w:p>
             <w:pPr>
               <w:spacing w:line="240" w:lineRule="auto" w:after="20"/>
-              <w:jc w:val="both"/>
+              <w:jc w:val="left"/>
             </w:pPr>
             <w:r>
               <w:rPr>
@@ -16849,7 +17687,7 @@
           <w:p>
             <w:pPr>
               <w:spacing w:line="240" w:lineRule="auto" w:after="20"/>
-              <w:jc w:val="both"/>
+              <w:jc w:val="left"/>
             </w:pPr>
             <w:r>
               <w:rPr>
@@ -16919,7 +17757,7 @@
           <w:p>
             <w:pPr>
               <w:spacing w:line="240" w:lineRule="auto" w:after="20"/>
-              <w:jc w:val="both"/>
+              <w:jc w:val="left"/>
             </w:pPr>
             <w:r>
               <w:rPr>
@@ -16989,7 +17827,7 @@
           <w:p>
             <w:pPr>
               <w:spacing w:line="240" w:lineRule="auto" w:after="20"/>
-              <w:jc w:val="both"/>
+              <w:jc w:val="left"/>
             </w:pPr>
             <w:r>
               <w:rPr>
@@ -17059,7 +17897,7 @@
           <w:p>
             <w:pPr>
               <w:spacing w:line="240" w:lineRule="auto" w:after="20"/>
-              <w:jc w:val="both"/>
+              <w:jc w:val="left"/>
             </w:pPr>
             <w:r>
               <w:rPr>
@@ -17129,7 +17967,7 @@
           <w:p>
             <w:pPr>
               <w:spacing w:line="240" w:lineRule="auto" w:after="20"/>
-              <w:jc w:val="both"/>
+              <w:jc w:val="left"/>
             </w:pPr>
             <w:r>
               <w:rPr>
@@ -17199,7 +18037,7 @@
           <w:p>
             <w:pPr>
               <w:spacing w:line="240" w:lineRule="auto" w:after="20"/>
-              <w:jc w:val="both"/>
+              <w:jc w:val="left"/>
             </w:pPr>
             <w:r>
               <w:rPr>
@@ -17269,7 +18107,7 @@
           <w:p>
             <w:pPr>
               <w:spacing w:line="240" w:lineRule="auto" w:after="20"/>
-              <w:jc w:val="both"/>
+              <w:jc w:val="left"/>
             </w:pPr>
             <w:r>
               <w:rPr>
@@ -17339,7 +18177,7 @@
           <w:p>
             <w:pPr>
               <w:spacing w:line="240" w:lineRule="auto" w:after="20"/>
-              <w:jc w:val="both"/>
+              <w:jc w:val="left"/>
             </w:pPr>
             <w:r>
               <w:rPr>
@@ -17409,7 +18247,7 @@
           <w:p>
             <w:pPr>
               <w:spacing w:line="240" w:lineRule="auto" w:after="20"/>
-              <w:jc w:val="both"/>
+              <w:jc w:val="left"/>
             </w:pPr>
             <w:r>
               <w:rPr>
@@ -17479,7 +18317,7 @@
           <w:p>
             <w:pPr>
               <w:spacing w:line="240" w:lineRule="auto" w:after="20"/>
-              <w:jc w:val="both"/>
+              <w:jc w:val="left"/>
             </w:pPr>
             <w:r>
               <w:rPr>
@@ -17549,7 +18387,7 @@
           <w:p>
             <w:pPr>
               <w:spacing w:line="240" w:lineRule="auto" w:after="20"/>
-              <w:jc w:val="both"/>
+              <w:jc w:val="left"/>
             </w:pPr>
             <w:r>
               <w:rPr>
@@ -17619,7 +18457,7 @@
           <w:p>
             <w:pPr>
               <w:spacing w:line="240" w:lineRule="auto" w:after="20"/>
-              <w:jc w:val="both"/>
+              <w:jc w:val="left"/>
             </w:pPr>
             <w:r>
               <w:rPr>
@@ -17689,7 +18527,7 @@
           <w:p>
             <w:pPr>
               <w:spacing w:line="240" w:lineRule="auto" w:after="20"/>
-              <w:jc w:val="both"/>
+              <w:jc w:val="left"/>
             </w:pPr>
             <w:r>
               <w:rPr>
@@ -17759,7 +18597,7 @@
           <w:p>
             <w:pPr>
               <w:spacing w:line="240" w:lineRule="auto" w:after="20"/>
-              <w:jc w:val="both"/>
+              <w:jc w:val="left"/>
             </w:pPr>
             <w:r>
               <w:rPr>
@@ -17829,7 +18667,7 @@
           <w:p>
             <w:pPr>
               <w:spacing w:line="240" w:lineRule="auto" w:after="20"/>
-              <w:jc w:val="both"/>
+              <w:jc w:val="left"/>
             </w:pPr>
             <w:r>
               <w:rPr>
@@ -17899,7 +18737,7 @@
           <w:p>
             <w:pPr>
               <w:spacing w:line="240" w:lineRule="auto" w:after="20"/>
-              <w:jc w:val="both"/>
+              <w:jc w:val="left"/>
             </w:pPr>
             <w:r>
               <w:rPr>
@@ -17969,7 +18807,7 @@
           <w:p>
             <w:pPr>
               <w:spacing w:line="240" w:lineRule="auto" w:after="20"/>
-              <w:jc w:val="both"/>
+              <w:jc w:val="left"/>
             </w:pPr>
             <w:r>
               <w:rPr>
@@ -18039,7 +18877,7 @@
           <w:p>
             <w:pPr>
               <w:spacing w:line="240" w:lineRule="auto" w:after="20"/>
-              <w:jc w:val="both"/>
+              <w:jc w:val="left"/>
             </w:pPr>
             <w:r>
               <w:rPr>
@@ -18109,7 +18947,7 @@
           <w:p>
             <w:pPr>
               <w:spacing w:line="240" w:lineRule="auto" w:after="20"/>
-              <w:jc w:val="both"/>
+              <w:jc w:val="left"/>
             </w:pPr>
             <w:r>
               <w:rPr>
@@ -18179,7 +19017,7 @@
           <w:p>
             <w:pPr>
               <w:spacing w:line="240" w:lineRule="auto" w:after="20"/>
-              <w:jc w:val="both"/>
+              <w:jc w:val="left"/>
             </w:pPr>
             <w:r>
               <w:rPr>
@@ -18249,7 +19087,7 @@
           <w:p>
             <w:pPr>
               <w:spacing w:line="240" w:lineRule="auto" w:after="20"/>
-              <w:jc w:val="both"/>
+              <w:jc w:val="left"/>
             </w:pPr>
             <w:r>
               <w:rPr>
@@ -18319,7 +19157,7 @@
           <w:p>
             <w:pPr>
               <w:spacing w:line="240" w:lineRule="auto" w:after="20"/>
-              <w:jc w:val="both"/>
+              <w:jc w:val="left"/>
             </w:pPr>
             <w:r>
               <w:rPr>
@@ -18389,7 +19227,7 @@
           <w:p>
             <w:pPr>
               <w:spacing w:line="240" w:lineRule="auto" w:after="20"/>
-              <w:jc w:val="both"/>
+              <w:jc w:val="left"/>
             </w:pPr>
             <w:r>
               <w:rPr>
@@ -18459,7 +19297,7 @@
           <w:p>
             <w:pPr>
               <w:spacing w:line="240" w:lineRule="auto" w:after="20"/>
-              <w:jc w:val="both"/>
+              <w:jc w:val="left"/>
             </w:pPr>
             <w:r>
               <w:rPr>
@@ -18529,7 +19367,7 @@
           <w:p>
             <w:pPr>
               <w:spacing w:line="240" w:lineRule="auto" w:after="20"/>
-              <w:jc w:val="both"/>
+              <w:jc w:val="left"/>
             </w:pPr>
             <w:r>
               <w:rPr>
@@ -18599,7 +19437,7 @@
           <w:p>
             <w:pPr>
               <w:spacing w:line="240" w:lineRule="auto" w:after="20"/>
-              <w:jc w:val="both"/>
+              <w:jc w:val="left"/>
             </w:pPr>
             <w:r>
               <w:rPr>
@@ -18669,7 +19507,7 @@
           <w:p>
             <w:pPr>
               <w:spacing w:line="240" w:lineRule="auto" w:after="20"/>
-              <w:jc w:val="both"/>
+              <w:jc w:val="left"/>
             </w:pPr>
             <w:r>
               <w:rPr>
@@ -18743,7 +19581,7 @@
         <w:jc w:val="both"/>
       </w:pPr>
       <w:r>
-        <w:t>Two optional items in the build plan — a microSD card for on-board recording and a 12 V 8–10 A switching supply for tethered table-top demonstrations — are not part of the required list. [Team to state here whether these were bought.]</w:t>
+        <w:t>Two optional items in the build plan — a microSD card for on-board recording and a 12 V 8–10 A switching supply for tethered table-top demonstrations — are not part of the required list and are not included in the table above.</w:t>
       </w:r>
     </w:p>
     <w:p>
@@ -18765,7 +19603,7 @@
         <w:drawing>
           <wp:inline xmlns:a="http://schemas.openxmlformats.org/drawingml/2006/main" xmlns:pic="http://schemas.openxmlformats.org/drawingml/2006/picture">
             <wp:extent cx="5120640" cy="4871436"/>
-            <wp:docPr id="15" name="Picture 15"/>
+            <wp:docPr id="18" name="Picture 18"/>
             <wp:cNvGraphicFramePr>
               <a:graphicFrameLocks noChangeAspect="1"/>
             </wp:cNvGraphicFramePr>
@@ -18777,7 +19615,7 @@
                     <pic:cNvPicPr/>
                   </pic:nvPicPr>
                   <pic:blipFill>
-                    <a:blip r:embed="rId26"/>
+                    <a:blip r:embed="rId29"/>
                     <a:stretch>
                       <a:fillRect/>
                     </a:stretch>
@@ -18834,7 +19672,7 @@
         <w:drawing>
           <wp:inline xmlns:a="http://schemas.openxmlformats.org/drawingml/2006/main" xmlns:pic="http://schemas.openxmlformats.org/drawingml/2006/picture">
             <wp:extent cx="4206240" cy="3665086"/>
-            <wp:docPr id="16" name="Picture 16"/>
+            <wp:docPr id="19" name="Picture 19"/>
             <wp:cNvGraphicFramePr>
               <a:graphicFrameLocks noChangeAspect="1"/>
             </wp:cNvGraphicFramePr>
@@ -18846,7 +19684,7 @@
                     <pic:cNvPicPr/>
                   </pic:nvPicPr>
                   <pic:blipFill>
-                    <a:blip r:embed="rId27"/>
+                    <a:blip r:embed="rId30"/>
                     <a:stretch>
                       <a:fillRect/>
                     </a:stretch>
@@ -18894,7 +19732,7 @@
         <w:drawing>
           <wp:inline xmlns:a="http://schemas.openxmlformats.org/drawingml/2006/main" xmlns:pic="http://schemas.openxmlformats.org/drawingml/2006/picture">
             <wp:extent cx="5577840" cy="3319082"/>
-            <wp:docPr id="17" name="Picture 17"/>
+            <wp:docPr id="20" name="Picture 20"/>
             <wp:cNvGraphicFramePr>
               <a:graphicFrameLocks noChangeAspect="1"/>
             </wp:cNvGraphicFramePr>
@@ -18906,7 +19744,7 @@
                     <pic:cNvPicPr/>
                   </pic:nvPicPr>
                   <pic:blipFill>
-                    <a:blip r:embed="rId28"/>
+                    <a:blip r:embed="rId31"/>
                     <a:stretch>
                       <a:fillRect/>
                     </a:stretch>
@@ -19095,7 +19933,7 @@
           <w:p>
             <w:pPr>
               <w:spacing w:line="240" w:lineRule="auto" w:after="20"/>
-              <w:jc w:val="both"/>
+              <w:jc w:val="left"/>
             </w:pPr>
             <w:r>
               <w:rPr>
@@ -19131,7 +19969,7 @@
           <w:p>
             <w:pPr>
               <w:spacing w:line="240" w:lineRule="auto" w:after="20"/>
-              <w:jc w:val="both"/>
+              <w:jc w:val="left"/>
             </w:pPr>
             <w:r>
               <w:rPr>
@@ -19167,7 +20005,7 @@
           <w:p>
             <w:pPr>
               <w:spacing w:line="240" w:lineRule="auto" w:after="20"/>
-              <w:jc w:val="both"/>
+              <w:jc w:val="left"/>
             </w:pPr>
             <w:r>
               <w:rPr>
@@ -19203,7 +20041,7 @@
           <w:p>
             <w:pPr>
               <w:spacing w:line="240" w:lineRule="auto" w:after="20"/>
-              <w:jc w:val="both"/>
+              <w:jc w:val="left"/>
             </w:pPr>
             <w:r>
               <w:rPr>
@@ -19239,7 +20077,7 @@
           <w:p>
             <w:pPr>
               <w:spacing w:line="240" w:lineRule="auto" w:after="20"/>
-              <w:jc w:val="both"/>
+              <w:jc w:val="left"/>
             </w:pPr>
             <w:r>
               <w:rPr>
@@ -19275,7 +20113,7 @@
           <w:p>
             <w:pPr>
               <w:spacing w:line="240" w:lineRule="auto" w:after="20"/>
-              <w:jc w:val="both"/>
+              <w:jc w:val="left"/>
             </w:pPr>
             <w:r>
               <w:rPr>
@@ -19311,7 +20149,7 @@
           <w:p>
             <w:pPr>
               <w:spacing w:line="240" w:lineRule="auto" w:after="20"/>
-              <w:jc w:val="both"/>
+              <w:jc w:val="left"/>
             </w:pPr>
             <w:r>
               <w:rPr>
@@ -19347,7 +20185,7 @@
           <w:p>
             <w:pPr>
               <w:spacing w:line="240" w:lineRule="auto" w:after="20"/>
-              <w:jc w:val="both"/>
+              <w:jc w:val="left"/>
             </w:pPr>
             <w:r>
               <w:rPr>
@@ -19384,7 +20222,7 @@
           <w:p>
             <w:pPr>
               <w:spacing w:line="240" w:lineRule="auto" w:after="20"/>
-              <w:jc w:val="both"/>
+              <w:jc w:val="left"/>
             </w:pPr>
             <w:r>
               <w:rPr>
@@ -19421,7 +20259,7 @@
           <w:p>
             <w:pPr>
               <w:spacing w:line="240" w:lineRule="auto" w:after="20"/>
-              <w:jc w:val="both"/>
+              <w:jc w:val="left"/>
             </w:pPr>
             <w:r>
               <w:rPr>
@@ -19457,7 +20295,7 @@
           <w:p>
             <w:pPr>
               <w:spacing w:line="240" w:lineRule="auto" w:after="20"/>
-              <w:jc w:val="both"/>
+              <w:jc w:val="left"/>
             </w:pPr>
             <w:r>
               <w:rPr>
@@ -19493,7 +20331,7 @@
           <w:p>
             <w:pPr>
               <w:spacing w:line="240" w:lineRule="auto" w:after="20"/>
-              <w:jc w:val="both"/>
+              <w:jc w:val="left"/>
             </w:pPr>
             <w:r>
               <w:rPr>
@@ -19516,7 +20354,7 @@
         <w:jc w:val="both"/>
       </w:pPr>
       <w:r>
-        <w:t>Our earlier presentation mentioned a target of under ₹12,000. The detailed build plan came out higher, mainly because of 19 genuine MG996R servos and two battery packs, which we decided not to compromise on. [Team to add actual amount spent, if required by the department.]</w:t>
+        <w:t>Our earlier presentation mentioned a target of under ₹12,000. The detailed build plan came out higher, mainly because of 19 genuine MG996R servos and two battery packs, which we decided not to compromise on.</w:t>
       </w:r>
     </w:p>
     <w:p>
@@ -19730,7 +20568,7 @@
           <w:p>
             <w:pPr>
               <w:spacing w:line="240" w:lineRule="auto" w:after="20"/>
-              <w:jc w:val="both"/>
+              <w:jc w:val="left"/>
             </w:pPr>
             <w:r>
               <w:rPr>
@@ -19783,7 +20621,7 @@
           <w:p>
             <w:pPr>
               <w:spacing w:line="240" w:lineRule="auto" w:after="20"/>
-              <w:jc w:val="both"/>
+              <w:jc w:val="left"/>
             </w:pPr>
             <w:r>
               <w:rPr>
@@ -19836,7 +20674,7 @@
           <w:p>
             <w:pPr>
               <w:spacing w:line="240" w:lineRule="auto" w:after="20"/>
-              <w:jc w:val="both"/>
+              <w:jc w:val="left"/>
             </w:pPr>
             <w:r>
               <w:rPr>
@@ -19889,7 +20727,7 @@
           <w:p>
             <w:pPr>
               <w:spacing w:line="240" w:lineRule="auto" w:after="20"/>
-              <w:jc w:val="both"/>
+              <w:jc w:val="left"/>
             </w:pPr>
             <w:r>
               <w:rPr>
@@ -19942,7 +20780,7 @@
           <w:p>
             <w:pPr>
               <w:spacing w:line="240" w:lineRule="auto" w:after="20"/>
-              <w:jc w:val="both"/>
+              <w:jc w:val="left"/>
             </w:pPr>
             <w:r>
               <w:rPr>
@@ -19995,7 +20833,7 @@
           <w:p>
             <w:pPr>
               <w:spacing w:line="240" w:lineRule="auto" w:after="20"/>
-              <w:jc w:val="both"/>
+              <w:jc w:val="left"/>
             </w:pPr>
             <w:r>
               <w:rPr>
@@ -20048,7 +20886,7 @@
           <w:p>
             <w:pPr>
               <w:spacing w:line="240" w:lineRule="auto" w:after="20"/>
-              <w:jc w:val="both"/>
+              <w:jc w:val="left"/>
             </w:pPr>
             <w:r>
               <w:rPr>
@@ -20101,7 +20939,7 @@
           <w:p>
             <w:pPr>
               <w:spacing w:line="240" w:lineRule="auto" w:after="20"/>
-              <w:jc w:val="both"/>
+              <w:jc w:val="left"/>
             </w:pPr>
             <w:r>
               <w:rPr>
@@ -20154,7 +20992,7 @@
           <w:p>
             <w:pPr>
               <w:spacing w:line="240" w:lineRule="auto" w:after="20"/>
-              <w:jc w:val="both"/>
+              <w:jc w:val="left"/>
             </w:pPr>
             <w:r>
               <w:rPr>
@@ -20207,7 +21045,7 @@
           <w:p>
             <w:pPr>
               <w:spacing w:line="240" w:lineRule="auto" w:after="20"/>
-              <w:jc w:val="both"/>
+              <w:jc w:val="left"/>
             </w:pPr>
             <w:r>
               <w:rPr>
@@ -20460,7 +21298,7 @@
         <w:drawing>
           <wp:inline xmlns:a="http://schemas.openxmlformats.org/drawingml/2006/main" xmlns:pic="http://schemas.openxmlformats.org/drawingml/2006/picture">
             <wp:extent cx="5669280" cy="1703905"/>
-            <wp:docPr id="18" name="Picture 18"/>
+            <wp:docPr id="21" name="Picture 21"/>
             <wp:cNvGraphicFramePr>
               <a:graphicFrameLocks noChangeAspect="1"/>
             </wp:cNvGraphicFramePr>
@@ -20472,7 +21310,7 @@
                     <pic:cNvPicPr/>
                   </pic:nvPicPr>
                   <pic:blipFill>
-                    <a:blip r:embed="rId29"/>
+                    <a:blip r:embed="rId32"/>
                     <a:stretch>
                       <a:fillRect/>
                     </a:stretch>
@@ -20825,7 +21663,7 @@
           <w:p>
             <w:pPr>
               <w:spacing w:line="240" w:lineRule="auto" w:after="20"/>
-              <w:jc w:val="both"/>
+              <w:jc w:val="left"/>
             </w:pPr>
             <w:r>
               <w:rPr>
@@ -20861,7 +21699,7 @@
           <w:p>
             <w:pPr>
               <w:spacing w:line="240" w:lineRule="auto" w:after="20"/>
-              <w:jc w:val="both"/>
+              <w:jc w:val="left"/>
             </w:pPr>
             <w:r>
               <w:rPr>
@@ -20897,7 +21735,7 @@
           <w:p>
             <w:pPr>
               <w:spacing w:line="240" w:lineRule="auto" w:after="20"/>
-              <w:jc w:val="both"/>
+              <w:jc w:val="left"/>
             </w:pPr>
             <w:r>
               <w:rPr>
@@ -20933,7 +21771,7 @@
           <w:p>
             <w:pPr>
               <w:spacing w:line="240" w:lineRule="auto" w:after="20"/>
-              <w:jc w:val="both"/>
+              <w:jc w:val="left"/>
             </w:pPr>
             <w:r>
               <w:rPr>
@@ -20969,7 +21807,7 @@
           <w:p>
             <w:pPr>
               <w:spacing w:line="240" w:lineRule="auto" w:after="20"/>
-              <w:jc w:val="both"/>
+              <w:jc w:val="left"/>
             </w:pPr>
             <w:r>
               <w:rPr>
@@ -21005,7 +21843,7 @@
           <w:p>
             <w:pPr>
               <w:spacing w:line="240" w:lineRule="auto" w:after="20"/>
-              <w:jc w:val="both"/>
+              <w:jc w:val="left"/>
             </w:pPr>
             <w:r>
               <w:rPr>
@@ -21041,7 +21879,7 @@
           <w:p>
             <w:pPr>
               <w:spacing w:line="240" w:lineRule="auto" w:after="20"/>
-              <w:jc w:val="both"/>
+              <w:jc w:val="left"/>
             </w:pPr>
             <w:r>
               <w:rPr>
@@ -21077,7 +21915,7 @@
           <w:p>
             <w:pPr>
               <w:spacing w:line="240" w:lineRule="auto" w:after="20"/>
-              <w:jc w:val="both"/>
+              <w:jc w:val="left"/>
             </w:pPr>
             <w:r>
               <w:rPr>
@@ -21113,7 +21951,7 @@
           <w:p>
             <w:pPr>
               <w:spacing w:line="240" w:lineRule="auto" w:after="20"/>
-              <w:jc w:val="both"/>
+              <w:jc w:val="left"/>
             </w:pPr>
             <w:r>
               <w:rPr>
@@ -21149,7 +21987,7 @@
           <w:p>
             <w:pPr>
               <w:spacing w:line="240" w:lineRule="auto" w:after="20"/>
-              <w:jc w:val="both"/>
+              <w:jc w:val="left"/>
             </w:pPr>
             <w:r>
               <w:rPr>
@@ -21185,7 +22023,7 @@
           <w:p>
             <w:pPr>
               <w:spacing w:line="240" w:lineRule="auto" w:after="20"/>
-              <w:jc w:val="both"/>
+              <w:jc w:val="left"/>
             </w:pPr>
             <w:r>
               <w:rPr>
@@ -21221,7 +22059,7 @@
           <w:p>
             <w:pPr>
               <w:spacing w:line="240" w:lineRule="auto" w:after="20"/>
-              <w:jc w:val="both"/>
+              <w:jc w:val="left"/>
             </w:pPr>
             <w:r>
               <w:rPr>
@@ -21257,7 +22095,7 @@
           <w:p>
             <w:pPr>
               <w:spacing w:line="240" w:lineRule="auto" w:after="20"/>
-              <w:jc w:val="both"/>
+              <w:jc w:val="left"/>
             </w:pPr>
             <w:r>
               <w:rPr>
@@ -21293,7 +22131,7 @@
           <w:p>
             <w:pPr>
               <w:spacing w:line="240" w:lineRule="auto" w:after="20"/>
-              <w:jc w:val="both"/>
+              <w:jc w:val="left"/>
             </w:pPr>
             <w:r>
               <w:rPr>
@@ -21329,7 +22167,7 @@
           <w:p>
             <w:pPr>
               <w:spacing w:line="240" w:lineRule="auto" w:after="20"/>
-              <w:jc w:val="both"/>
+              <w:jc w:val="left"/>
             </w:pPr>
             <w:r>
               <w:rPr>
@@ -21365,7 +22203,7 @@
           <w:p>
             <w:pPr>
               <w:spacing w:line="240" w:lineRule="auto" w:after="20"/>
-              <w:jc w:val="both"/>
+              <w:jc w:val="left"/>
             </w:pPr>
             <w:r>
               <w:rPr>
@@ -21401,7 +22239,7 @@
           <w:p>
             <w:pPr>
               <w:spacing w:line="240" w:lineRule="auto" w:after="20"/>
-              <w:jc w:val="both"/>
+              <w:jc w:val="left"/>
             </w:pPr>
             <w:r>
               <w:rPr>
@@ -21437,7 +22275,7 @@
           <w:p>
             <w:pPr>
               <w:spacing w:line="240" w:lineRule="auto" w:after="20"/>
-              <w:jc w:val="both"/>
+              <w:jc w:val="left"/>
             </w:pPr>
             <w:r>
               <w:rPr>
@@ -21887,7 +22725,7 @@
           <w:p>
             <w:pPr>
               <w:spacing w:line="240" w:lineRule="auto" w:after="20"/>
-              <w:jc w:val="both"/>
+              <w:jc w:val="left"/>
             </w:pPr>
             <w:r>
               <w:rPr>
@@ -21940,7 +22778,7 @@
           <w:p>
             <w:pPr>
               <w:spacing w:line="240" w:lineRule="auto" w:after="20"/>
-              <w:jc w:val="both"/>
+              <w:jc w:val="left"/>
             </w:pPr>
             <w:r>
               <w:rPr>
@@ -21993,7 +22831,7 @@
           <w:p>
             <w:pPr>
               <w:spacing w:line="240" w:lineRule="auto" w:after="20"/>
-              <w:jc w:val="both"/>
+              <w:jc w:val="left"/>
             </w:pPr>
             <w:r>
               <w:rPr>
@@ -22046,7 +22884,7 @@
           <w:p>
             <w:pPr>
               <w:spacing w:line="240" w:lineRule="auto" w:after="20"/>
-              <w:jc w:val="both"/>
+              <w:jc w:val="left"/>
             </w:pPr>
             <w:r>
               <w:rPr>
@@ -22099,7 +22937,7 @@
           <w:p>
             <w:pPr>
               <w:spacing w:line="240" w:lineRule="auto" w:after="20"/>
-              <w:jc w:val="both"/>
+              <w:jc w:val="left"/>
             </w:pPr>
             <w:r>
               <w:rPr>
@@ -22152,7 +22990,7 @@
           <w:p>
             <w:pPr>
               <w:spacing w:line="240" w:lineRule="auto" w:after="20"/>
-              <w:jc w:val="both"/>
+              <w:jc w:val="left"/>
             </w:pPr>
             <w:r>
               <w:rPr>
@@ -22205,7 +23043,7 @@
           <w:p>
             <w:pPr>
               <w:spacing w:line="240" w:lineRule="auto" w:after="20"/>
-              <w:jc w:val="both"/>
+              <w:jc w:val="left"/>
             </w:pPr>
             <w:r>
               <w:rPr>
@@ -22258,7 +23096,7 @@
           <w:p>
             <w:pPr>
               <w:spacing w:line="240" w:lineRule="auto" w:after="20"/>
-              <w:jc w:val="both"/>
+              <w:jc w:val="left"/>
             </w:pPr>
             <w:r>
               <w:rPr>
@@ -22311,7 +23149,7 @@
           <w:p>
             <w:pPr>
               <w:spacing w:line="240" w:lineRule="auto" w:after="20"/>
-              <w:jc w:val="both"/>
+              <w:jc w:val="left"/>
             </w:pPr>
             <w:r>
               <w:rPr>
@@ -22364,7 +23202,7 @@
           <w:p>
             <w:pPr>
               <w:spacing w:line="240" w:lineRule="auto" w:after="20"/>
-              <w:jc w:val="both"/>
+              <w:jc w:val="left"/>
             </w:pPr>
             <w:r>
               <w:rPr>
@@ -22417,7 +23255,7 @@
           <w:p>
             <w:pPr>
               <w:spacing w:line="240" w:lineRule="auto" w:after="20"/>
-              <w:jc w:val="both"/>
+              <w:jc w:val="left"/>
             </w:pPr>
             <w:r>
               <w:rPr>
@@ -22470,7 +23308,7 @@
           <w:p>
             <w:pPr>
               <w:spacing w:line="240" w:lineRule="auto" w:after="20"/>
-              <w:jc w:val="both"/>
+              <w:jc w:val="left"/>
             </w:pPr>
             <w:r>
               <w:rPr>
@@ -22954,7 +23792,7 @@
           <w:p>
             <w:pPr>
               <w:spacing w:line="240" w:lineRule="auto" w:after="20"/>
-              <w:jc w:val="both"/>
+              <w:jc w:val="left"/>
             </w:pPr>
             <w:r>
               <w:rPr>
@@ -23024,7 +23862,7 @@
           <w:p>
             <w:pPr>
               <w:spacing w:line="240" w:lineRule="auto" w:after="20"/>
-              <w:jc w:val="both"/>
+              <w:jc w:val="left"/>
             </w:pPr>
             <w:r>
               <w:rPr>
@@ -23094,7 +23932,7 @@
           <w:p>
             <w:pPr>
               <w:spacing w:line="240" w:lineRule="auto" w:after="20"/>
-              <w:jc w:val="both"/>
+              <w:jc w:val="left"/>
             </w:pPr>
             <w:r>
               <w:rPr>
@@ -23164,7 +24002,7 @@
           <w:p>
             <w:pPr>
               <w:spacing w:line="240" w:lineRule="auto" w:after="20"/>
-              <w:jc w:val="both"/>
+              <w:jc w:val="left"/>
             </w:pPr>
             <w:r>
               <w:rPr>
@@ -23234,7 +24072,7 @@
           <w:p>
             <w:pPr>
               <w:spacing w:line="240" w:lineRule="auto" w:after="20"/>
-              <w:jc w:val="both"/>
+              <w:jc w:val="left"/>
             </w:pPr>
             <w:r>
               <w:rPr>
@@ -25098,7 +25936,7 @@
           <w:p>
             <w:pPr>
               <w:spacing w:line="240" w:lineRule="auto" w:after="20"/>
-              <w:jc w:val="both"/>
+              <w:jc w:val="left"/>
             </w:pPr>
             <w:r>
               <w:rPr>
@@ -25134,7 +25972,7 @@
           <w:p>
             <w:pPr>
               <w:spacing w:line="240" w:lineRule="auto" w:after="20"/>
-              <w:jc w:val="both"/>
+              <w:jc w:val="left"/>
             </w:pPr>
             <w:r>
               <w:rPr>
@@ -25170,7 +26008,7 @@
           <w:p>
             <w:pPr>
               <w:spacing w:line="240" w:lineRule="auto" w:after="20"/>
-              <w:jc w:val="both"/>
+              <w:jc w:val="left"/>
             </w:pPr>
             <w:r>
               <w:rPr>
@@ -25206,7 +26044,7 @@
           <w:p>
             <w:pPr>
               <w:spacing w:line="240" w:lineRule="auto" w:after="20"/>
-              <w:jc w:val="both"/>
+              <w:jc w:val="left"/>
             </w:pPr>
             <w:r>
               <w:rPr>
@@ -25242,7 +26080,7 @@
           <w:p>
             <w:pPr>
               <w:spacing w:line="240" w:lineRule="auto" w:after="20"/>
-              <w:jc w:val="both"/>
+              <w:jc w:val="left"/>
             </w:pPr>
             <w:r>
               <w:rPr>
@@ -25278,626 +26116,30 @@
           <w:p>
             <w:pPr>
               <w:spacing w:line="240" w:lineRule="auto" w:after="20"/>
+              <w:jc w:val="left"/>
+            </w:pPr>
+            <w:r>
+              <w:rPr>
+                <w:sz w:val="20"/>
+              </w:rPr>
+              <w:t>Camera command protocol</w:t>
+            </w:r>
+          </w:p>
+        </w:tc>
+        <w:tc>
+          <w:tcPr>
+            <w:tcW w:type="dxa" w:w="6292"/>
+          </w:tcPr>
+          <w:p>
+            <w:pPr>
+              <w:spacing w:line="240" w:lineRule="auto" w:after="20"/>
               <w:jc w:val="both"/>
             </w:pPr>
             <w:r>
               <w:rPr>
                 <w:sz w:val="20"/>
               </w:rPr>
-              <w:t>Camera command protocol</w:t>
-            </w:r>
-          </w:p>
-        </w:tc>
-        <w:tc>
-          <w:tcPr>
-            <w:tcW w:type="dxa" w:w="6292"/>
-          </w:tcPr>
-          <w:p>
-            <w:pPr>
-              <w:spacing w:line="240" w:lineRule="auto" w:after="20"/>
-              <w:jc w:val="both"/>
-            </w:pPr>
-            <w:r>
-              <w:rPr>
-                <w:sz w:val="20"/>
-              </w:rPr>
               <w:t>Single characters at 9600 baud: F, B, L, R, S; P/T + number</w:t>
-            </w:r>
-          </w:p>
-        </w:tc>
-      </w:tr>
-    </w:tbl>
-    <w:p>
-      <w:pPr>
-        <w:spacing w:after="80"/>
-      </w:pPr>
-    </w:p>
-    <w:p>
-      <w:pPr>
-        <w:pStyle w:val="Heading1"/>
-        <w:pageBreakBefore/>
-        <w:spacing w:after="360"/>
-        <w:jc w:val="center"/>
-      </w:pPr>
-      <w:r>
-        <w:t>APPENDIX B: EVIDENCE TO BE ATTACHED</w:t>
-      </w:r>
-    </w:p>
-    <w:p>
-      <w:pPr>
-        <w:spacing w:after="120"/>
-        <w:jc w:val="both"/>
-      </w:pPr>
-      <w:r>
-        <w:t>The following photographs and screenshots should be inserted at the marked places in the report before submission. They are listed here so that none is missed.</w:t>
-      </w:r>
-    </w:p>
-    <w:p>
-      <w:pPr>
-        <w:keepNext/>
-        <w:spacing w:after="80"/>
-        <w:jc w:val="center"/>
-      </w:pPr>
-      <w:r>
-        <w:rPr>
-          <w:b/>
-          <w:sz w:val="21"/>
-        </w:rPr>
-        <w:t xml:space="preserve">Table A.4: </w:t>
-      </w:r>
-      <w:r>
-        <w:rPr>
-          <w:sz w:val="21"/>
-        </w:rPr>
-        <w:t>Checklist of figures to be supplied by the team</w:t>
-      </w:r>
-    </w:p>
-    <w:tbl>
-      <w:tblPr>
-        <w:tblStyle w:val="TableGrid"/>
-        <w:jc w:val="center"/>
-        <w:tblLayout w:type="fixed"/>
-        <w:tblLook w:firstColumn="1" w:firstRow="1" w:lastColumn="0" w:lastRow="0" w:noHBand="0" w:noVBand="1" w:val="04A0"/>
-        <w:tblW w:w="9287" w:type="dxa"/>
-        <w:tblLayout w:type="fixed"/>
-      </w:tblPr>
-      <w:tblGrid>
-        <w:gridCol w:w="4334"/>
-        <w:gridCol w:w="2322"/>
-        <w:gridCol w:w="2631"/>
-      </w:tblGrid>
-      <w:tr>
-        <w:trPr>
-          <w:tblHeader w:val="true"/>
-        </w:trPr>
-        <w:tc>
-          <w:tcPr>
-            <w:tcW w:type="dxa" w:w="4334"/>
-            <w:shd w:val="clear" w:color="auto" w:fill="D9E2EC"/>
-          </w:tcPr>
-          <w:p>
-            <w:pPr>
-              <w:spacing w:line="240" w:lineRule="auto"/>
-            </w:pPr>
-            <w:r>
-              <w:rPr>
-                <w:b/>
-                <w:sz w:val="20"/>
-              </w:rPr>
-              <w:t>Item</w:t>
-            </w:r>
-          </w:p>
-        </w:tc>
-        <w:tc>
-          <w:tcPr>
-            <w:tcW w:type="dxa" w:w="2322"/>
-            <w:shd w:val="clear" w:color="auto" w:fill="D9E2EC"/>
-          </w:tcPr>
-          <w:p>
-            <w:pPr>
-              <w:spacing w:line="240" w:lineRule="auto"/>
-            </w:pPr>
-            <w:r>
-              <w:rPr>
-                <w:b/>
-                <w:sz w:val="20"/>
-              </w:rPr>
-              <w:t>Where</w:t>
-            </w:r>
-          </w:p>
-        </w:tc>
-        <w:tc>
-          <w:tcPr>
-            <w:tcW w:type="dxa" w:w="2632"/>
-            <w:shd w:val="clear" w:color="auto" w:fill="D9E2EC"/>
-          </w:tcPr>
-          <w:p>
-            <w:pPr>
-              <w:spacing w:line="240" w:lineRule="auto"/>
-            </w:pPr>
-            <w:r>
-              <w:rPr>
-                <w:b/>
-                <w:sz w:val="20"/>
-              </w:rPr>
-              <w:t>Status</w:t>
-            </w:r>
-          </w:p>
-        </w:tc>
-      </w:tr>
-      <w:tr>
-        <w:tc>
-          <w:tcPr>
-            <w:tcW w:type="dxa" w:w="4334"/>
-          </w:tcPr>
-          <w:p>
-            <w:pPr>
-              <w:spacing w:line="240" w:lineRule="auto" w:after="20"/>
-              <w:jc w:val="both"/>
-            </w:pPr>
-            <w:r>
-              <w:rPr>
-                <w:sz w:val="20"/>
-              </w:rPr>
-              <w:t>KiCad schematic screenshots</w:t>
-            </w:r>
-          </w:p>
-        </w:tc>
-        <w:tc>
-          <w:tcPr>
-            <w:tcW w:type="dxa" w:w="2322"/>
-          </w:tcPr>
-          <w:p>
-            <w:pPr>
-              <w:spacing w:line="240" w:lineRule="auto" w:after="20"/>
-              <w:jc w:val="left"/>
-            </w:pPr>
-            <w:r>
-              <w:rPr>
-                <w:sz w:val="20"/>
-              </w:rPr>
-              <w:t>Section 6.3</w:t>
-            </w:r>
-          </w:p>
-        </w:tc>
-        <w:tc>
-          <w:tcPr>
-            <w:tcW w:type="dxa" w:w="2632"/>
-          </w:tcPr>
-          <w:p>
-            <w:pPr>
-              <w:spacing w:line="240" w:lineRule="auto" w:after="20"/>
-              <w:jc w:val="left"/>
-            </w:pPr>
-            <w:r>
-              <w:rPr>
-                <w:sz w:val="20"/>
-              </w:rPr>
-              <w:t>Included (Figs. 6.1, 6.2)</w:t>
-            </w:r>
-          </w:p>
-        </w:tc>
-      </w:tr>
-      <w:tr>
-        <w:tc>
-          <w:tcPr>
-            <w:tcW w:type="dxa" w:w="4334"/>
-          </w:tcPr>
-          <w:p>
-            <w:pPr>
-              <w:spacing w:line="240" w:lineRule="auto" w:after="20"/>
-              <w:jc w:val="both"/>
-            </w:pPr>
-            <w:r>
-              <w:rPr>
-                <w:sz w:val="20"/>
-              </w:rPr>
-              <w:t>PCB 2D layout screenshot</w:t>
-            </w:r>
-          </w:p>
-        </w:tc>
-        <w:tc>
-          <w:tcPr>
-            <w:tcW w:type="dxa" w:w="2322"/>
-          </w:tcPr>
-          <w:p>
-            <w:pPr>
-              <w:spacing w:line="240" w:lineRule="auto" w:after="20"/>
-              <w:jc w:val="left"/>
-            </w:pPr>
-            <w:r>
-              <w:rPr>
-                <w:sz w:val="20"/>
-              </w:rPr>
-              <w:t>Section 6.5</w:t>
-            </w:r>
-          </w:p>
-        </w:tc>
-        <w:tc>
-          <w:tcPr>
-            <w:tcW w:type="dxa" w:w="2632"/>
-          </w:tcPr>
-          <w:p>
-            <w:pPr>
-              <w:spacing w:line="240" w:lineRule="auto" w:after="20"/>
-              <w:jc w:val="left"/>
-            </w:pPr>
-            <w:r>
-              <w:rPr>
-                <w:sz w:val="20"/>
-              </w:rPr>
-              <w:t>Included (Fig. 6.4)</w:t>
-            </w:r>
-          </w:p>
-        </w:tc>
-      </w:tr>
-      <w:tr>
-        <w:tc>
-          <w:tcPr>
-            <w:tcW w:type="dxa" w:w="4334"/>
-          </w:tcPr>
-          <w:p>
-            <w:pPr>
-              <w:spacing w:line="240" w:lineRule="auto" w:after="20"/>
-              <w:jc w:val="both"/>
-            </w:pPr>
-            <w:r>
-              <w:rPr>
-                <w:sz w:val="20"/>
-              </w:rPr>
-              <w:t>PCB 3D view screenshot</w:t>
-            </w:r>
-          </w:p>
-        </w:tc>
-        <w:tc>
-          <w:tcPr>
-            <w:tcW w:type="dxa" w:w="2322"/>
-          </w:tcPr>
-          <w:p>
-            <w:pPr>
-              <w:spacing w:line="240" w:lineRule="auto" w:after="20"/>
-              <w:jc w:val="left"/>
-            </w:pPr>
-            <w:r>
-              <w:rPr>
-                <w:sz w:val="20"/>
-              </w:rPr>
-              <w:t>Section 6.5</w:t>
-            </w:r>
-          </w:p>
-        </w:tc>
-        <w:tc>
-          <w:tcPr>
-            <w:tcW w:type="dxa" w:w="2632"/>
-          </w:tcPr>
-          <w:p>
-            <w:pPr>
-              <w:spacing w:line="240" w:lineRule="auto" w:after="20"/>
-              <w:jc w:val="left"/>
-            </w:pPr>
-            <w:r>
-              <w:rPr>
-                <w:sz w:val="20"/>
-              </w:rPr>
-              <w:t>To be added</w:t>
-            </w:r>
-          </w:p>
-        </w:tc>
-      </w:tr>
-      <w:tr>
-        <w:tc>
-          <w:tcPr>
-            <w:tcW w:type="dxa" w:w="4334"/>
-          </w:tcPr>
-          <w:p>
-            <w:pPr>
-              <w:spacing w:line="240" w:lineRule="auto" w:after="20"/>
-              <w:jc w:val="both"/>
-            </w:pPr>
-            <w:r>
-              <w:rPr>
-                <w:sz w:val="20"/>
-              </w:rPr>
-              <w:t>ERC and DRC result screenshots</w:t>
-            </w:r>
-          </w:p>
-        </w:tc>
-        <w:tc>
-          <w:tcPr>
-            <w:tcW w:type="dxa" w:w="2322"/>
-          </w:tcPr>
-          <w:p>
-            <w:pPr>
-              <w:spacing w:line="240" w:lineRule="auto" w:after="20"/>
-              <w:jc w:val="left"/>
-            </w:pPr>
-            <w:r>
-              <w:rPr>
-                <w:sz w:val="20"/>
-              </w:rPr>
-              <w:t>Section 6.6</w:t>
-            </w:r>
-          </w:p>
-        </w:tc>
-        <w:tc>
-          <w:tcPr>
-            <w:tcW w:type="dxa" w:w="2632"/>
-          </w:tcPr>
-          <w:p>
-            <w:pPr>
-              <w:spacing w:line="240" w:lineRule="auto" w:after="20"/>
-              <w:jc w:val="left"/>
-            </w:pPr>
-            <w:r>
-              <w:rPr>
-                <w:sz w:val="20"/>
-              </w:rPr>
-              <w:t>Included (Figs. 6.6, 6.7)</w:t>
-            </w:r>
-          </w:p>
-        </w:tc>
-      </w:tr>
-      <w:tr>
-        <w:tc>
-          <w:tcPr>
-            <w:tcW w:type="dxa" w:w="4334"/>
-          </w:tcPr>
-          <w:p>
-            <w:pPr>
-              <w:spacing w:line="240" w:lineRule="auto" w:after="20"/>
-              <w:jc w:val="both"/>
-            </w:pPr>
-            <w:r>
-              <w:rPr>
-                <w:sz w:val="20"/>
-              </w:rPr>
-              <w:t>Gerber export screenshot</w:t>
-            </w:r>
-          </w:p>
-        </w:tc>
-        <w:tc>
-          <w:tcPr>
-            <w:tcW w:type="dxa" w:w="2322"/>
-          </w:tcPr>
-          <w:p>
-            <w:pPr>
-              <w:spacing w:line="240" w:lineRule="auto" w:after="20"/>
-              <w:jc w:val="left"/>
-            </w:pPr>
-            <w:r>
-              <w:rPr>
-                <w:sz w:val="20"/>
-              </w:rPr>
-              <w:t>Section 6.7</w:t>
-            </w:r>
-          </w:p>
-        </w:tc>
-        <w:tc>
-          <w:tcPr>
-            <w:tcW w:type="dxa" w:w="2632"/>
-          </w:tcPr>
-          <w:p>
-            <w:pPr>
-              <w:spacing w:line="240" w:lineRule="auto" w:after="20"/>
-              <w:jc w:val="left"/>
-            </w:pPr>
-            <w:r>
-              <w:rPr>
-                <w:sz w:val="20"/>
-              </w:rPr>
-              <w:t>To be added</w:t>
-            </w:r>
-          </w:p>
-        </w:tc>
-      </w:tr>
-      <w:tr>
-        <w:tc>
-          <w:tcPr>
-            <w:tcW w:type="dxa" w:w="4334"/>
-          </w:tcPr>
-          <w:p>
-            <w:pPr>
-              <w:spacing w:line="240" w:lineRule="auto" w:after="20"/>
-              <w:jc w:val="both"/>
-            </w:pPr>
-            <w:r>
-              <w:rPr>
-                <w:sz w:val="20"/>
-              </w:rPr>
-              <w:t>Photograph of purchased components</w:t>
-            </w:r>
-          </w:p>
-        </w:tc>
-        <w:tc>
-          <w:tcPr>
-            <w:tcW w:type="dxa" w:w="2322"/>
-          </w:tcPr>
-          <w:p>
-            <w:pPr>
-              <w:spacing w:line="240" w:lineRule="auto" w:after="20"/>
-              <w:jc w:val="left"/>
-            </w:pPr>
-            <w:r>
-              <w:rPr>
-                <w:sz w:val="20"/>
-              </w:rPr>
-              <w:t>Section 7.2</w:t>
-            </w:r>
-          </w:p>
-        </w:tc>
-        <w:tc>
-          <w:tcPr>
-            <w:tcW w:type="dxa" w:w="2632"/>
-          </w:tcPr>
-          <w:p>
-            <w:pPr>
-              <w:spacing w:line="240" w:lineRule="auto" w:after="20"/>
-              <w:jc w:val="left"/>
-            </w:pPr>
-            <w:r>
-              <w:rPr>
-                <w:sz w:val="20"/>
-              </w:rPr>
-              <w:t>Included (Fig. 7.1)</w:t>
-            </w:r>
-          </w:p>
-        </w:tc>
-      </w:tr>
-      <w:tr>
-        <w:tc>
-          <w:tcPr>
-            <w:tcW w:type="dxa" w:w="4334"/>
-          </w:tcPr>
-          <w:p>
-            <w:pPr>
-              <w:spacing w:line="240" w:lineRule="auto" w:after="20"/>
-              <w:jc w:val="both"/>
-            </w:pPr>
-            <w:r>
-              <w:rPr>
-                <w:sz w:val="20"/>
-              </w:rPr>
-              <w:t>Close-up photographs of key modules</w:t>
-            </w:r>
-          </w:p>
-        </w:tc>
-        <w:tc>
-          <w:tcPr>
-            <w:tcW w:type="dxa" w:w="2322"/>
-          </w:tcPr>
-          <w:p>
-            <w:pPr>
-              <w:spacing w:line="240" w:lineRule="auto" w:after="20"/>
-              <w:jc w:val="left"/>
-            </w:pPr>
-            <w:r>
-              <w:rPr>
-                <w:sz w:val="20"/>
-              </w:rPr>
-              <w:t>Section 7.2</w:t>
-            </w:r>
-          </w:p>
-        </w:tc>
-        <w:tc>
-          <w:tcPr>
-            <w:tcW w:type="dxa" w:w="2632"/>
-          </w:tcPr>
-          <w:p>
-            <w:pPr>
-              <w:spacing w:line="240" w:lineRule="auto" w:after="20"/>
-              <w:jc w:val="left"/>
-            </w:pPr>
-            <w:r>
-              <w:rPr>
-                <w:sz w:val="20"/>
-              </w:rPr>
-              <w:t>Included (Figs. 7.2, 7.3)</w:t>
-            </w:r>
-          </w:p>
-        </w:tc>
-      </w:tr>
-      <w:tr>
-        <w:tc>
-          <w:tcPr>
-            <w:tcW w:type="dxa" w:w="4334"/>
-          </w:tcPr>
-          <w:p>
-            <w:pPr>
-              <w:spacing w:line="240" w:lineRule="auto" w:after="20"/>
-              <w:jc w:val="both"/>
-            </w:pPr>
-            <w:r>
-              <w:rPr>
-                <w:sz w:val="20"/>
-              </w:rPr>
-              <w:t>3D model of the hexapod</w:t>
-            </w:r>
-          </w:p>
-        </w:tc>
-        <w:tc>
-          <w:tcPr>
-            <w:tcW w:type="dxa" w:w="2322"/>
-          </w:tcPr>
-          <w:p>
-            <w:pPr>
-              <w:spacing w:line="240" w:lineRule="auto" w:after="20"/>
-              <w:jc w:val="left"/>
-            </w:pPr>
-            <w:r>
-              <w:rPr>
-                <w:sz w:val="20"/>
-              </w:rPr>
-              <w:t>Section 8.2</w:t>
-            </w:r>
-          </w:p>
-        </w:tc>
-        <w:tc>
-          <w:tcPr>
-            <w:tcW w:type="dxa" w:w="2632"/>
-          </w:tcPr>
-          <w:p>
-            <w:pPr>
-              <w:spacing w:line="240" w:lineRule="auto" w:after="20"/>
-              <w:jc w:val="left"/>
-            </w:pPr>
-            <w:r>
-              <w:rPr>
-                <w:sz w:val="20"/>
-              </w:rPr>
-              <w:t>Not available — 3D printing not started</w:t>
-            </w:r>
-          </w:p>
-        </w:tc>
-      </w:tr>
-      <w:tr>
-        <w:tc>
-          <w:tcPr>
-            <w:tcW w:type="dxa" w:w="4334"/>
-          </w:tcPr>
-          <w:p>
-            <w:pPr>
-              <w:spacing w:line="240" w:lineRule="auto" w:after="20"/>
-              <w:jc w:val="both"/>
-            </w:pPr>
-            <w:r>
-              <w:rPr>
-                <w:sz w:val="20"/>
-              </w:rPr>
-              <w:t>3D-printed test parts</w:t>
-            </w:r>
-          </w:p>
-        </w:tc>
-        <w:tc>
-          <w:tcPr>
-            <w:tcW w:type="dxa" w:w="2322"/>
-          </w:tcPr>
-          <w:p>
-            <w:pPr>
-              <w:spacing w:line="240" w:lineRule="auto" w:after="20"/>
-              <w:jc w:val="left"/>
-            </w:pPr>
-            <w:r>
-              <w:rPr>
-                <w:sz w:val="20"/>
-              </w:rPr>
-              <w:t>Section 8.5</w:t>
-            </w:r>
-          </w:p>
-        </w:tc>
-        <w:tc>
-          <w:tcPr>
-            <w:tcW w:type="dxa" w:w="2632"/>
-          </w:tcPr>
-          <w:p>
-            <w:pPr>
-              <w:spacing w:line="240" w:lineRule="auto" w:after="20"/>
-              <w:jc w:val="left"/>
-            </w:pPr>
-            <w:r>
-              <w:rPr>
-                <w:sz w:val="20"/>
-              </w:rPr>
-              <w:t>Not available — 3D printing not started</w:t>
             </w:r>
           </w:p>
         </w:tc>

</xml_diff>